<commit_message>
docs: rebuild M3 viva guide with audit fixes; handoff session 7
</commit_message>
<xml_diff>
--- a/DS4SG_M3_Reference.docx
+++ b/DS4SG_M3_Reference.docx
@@ -918,7 +918,7 @@
           <w:sz w:val="20"/>
           <w:szCs w:val="20"/>
         </w:rPr>
-        <w:t xml:space="preserve">In the 2021–24 validation years all three models beat both benchmarks (pooled AUC 0.64–0.65 vs 0.58 for persistence) and cut error costs by a third compared with never alerting.</w:t>
+        <w:t xml:space="preserve">In the 2021–24 validation years all three models beat both benchmarks on pooled AUC (0.64–0.65 vs 0.58 for persistence) and cut error costs by a third compared with never alerting. Much of the pooled score is regime tracking, though: within years, KNN (0.67) and LR (0.65) beat persistence (0.57) and the tree (0.58) barely does.</w:t>
       </w:r>
     </w:p>
     <w:p>
@@ -937,7 +937,7 @@
           <w:sz w:val="20"/>
           <w:szCs w:val="20"/>
         </w:rPr>
-        <w:t xml:space="preserve">In the calm 2025–26 test period, KNN ranked shocks best (AUC 0.68), but no model beat 'never alert' on cost: the shock rate halved (17% → 8%), so thresholds learned in crisis years over-alert.</w:t>
+        <w:t xml:space="preserve">In the calm 2025–26 test period, KNN ranked shocks best (AUC 0.68), but at 5:1 no model beat 'never alert' on cost: the shock rate halved (17% → 8%), so thresholds learned in crisis years over-alert.</w:t>
       </w:r>
     </w:p>
     <w:p>
@@ -956,7 +956,7 @@
           <w:sz w:val="20"/>
           <w:szCs w:val="20"/>
         </w:rPr>
-        <w:t xml:space="preserve">Drivers: rupee depreciation and recent price momentum; the fiscal-year start multiplies shock odds about five-fold.</w:t>
+        <w:t xml:space="preserve">Drivers: rupee depreciation and recent price momentum; the fiscal-year start multiplies shock odds about five-fold (from only five fiscal years).</w:t>
       </w:r>
     </w:p>
     <w:p>
@@ -994,7 +994,7 @@
           <w:sz w:val="20"/>
           <w:szCs w:val="20"/>
         </w:rPr>
-        <w:t xml:space="preserve">H1 is supported in sample but not in the test period; H2 is not supported (pass-through is equal); H3 holds for food. Utility tariffs hit the poor while motor fuel hits the rich.</w:t>
+        <w:t xml:space="preserve">H1 is supported in sample but not in the test period; H2 is not supported (pass-through is equal); H3 holds for food. Motor fuel hits the rich harder; utility tariffs lean towards the poor but are not significant.</w:t>
       </w:r>
     </w:p>
     <w:p>
@@ -5401,7 +5401,7 @@
                 <w:sz w:val="19"/>
                 <w:szCs w:val="19"/>
               </w:rPr>
-              <w:t xml:space="preserve"> (about 20 seconds; use the project </w:t>
+              <w:t xml:space="preserve"> (about 30 seconds; use the project </w:t>
             </w:r>
             <w:r>
               <w:rPr>
@@ -6096,7 +6096,7 @@
                 <w:sz w:val="19"/>
                 <w:szCs w:val="19"/>
               </w:rPr>
-              <w:t xml:space="preserve">Open in Jupyter/VS Code with the DS4SG kernel and Run All (about 1.5 minutes), or </w:t>
+              <w:t xml:space="preserve">Open in Jupyter/VS Code with the DS4SG kernel and Run All (2–4 minutes, depending on the machine), or </w:t>
             </w:r>
             <w:r>
               <w:rPr>
@@ -15064,7 +15064,7 @@
                 <w:sz w:val="17"/>
                 <w:szCs w:val="17"/>
               </w:rPr>
-              <w:t xml:space="preserve">Food, perishables and utility tariffs hit the poor; motor fuel and LPG hit the rich.</w:t>
+              <w:t xml:space="preserve">Food (above all perishables) hits the poor harder; motor fuel and LPG hit the rich harder. Utility tariffs lean towards the poor but their interval crosses zero.</w:t>
             </w:r>
           </w:p>
         </w:tc>
@@ -22346,7 +22346,7 @@
                 <w:sz w:val="17"/>
                 <w:szCs w:val="17"/>
               </w:rPr>
-              <w:t xml:space="preserve">exp(coefficient) from the unpenalised logit: rupee +1% → odds × 1.11; fiscal-year start → odds × 5.3.</w:t>
+              <w:t xml:space="preserve">exp(coefficient) from the unpenalised logit: rupee +1% → odds × 1.11; fiscal-year start → odds × 5.3 (from only five fiscal years, so the 95% interval is 1.4–19.5).</w:t>
             </w:r>
           </w:p>
         </w:tc>
@@ -26176,7 +26176,7 @@
                 <w:sz w:val="19"/>
                 <w:szCs w:val="19"/>
               </w:rPr>
-              <w:t xml:space="preserve">ROC-AUC is threshold-free and unaffected by the shock rate, and it is the metric of hypothesis H1. Pooling matters: an unweighted LR scored 0.65 averaged over folds but only 0.53 pooled, because its probability level followed each fold's base rate. The majority class shows the same effect (0.5 per fold, 0.467 pooled). Mean ± SD of per-fold AUCs is still reported for the rubric's 'variance across folds'.</w:t>
+              <w:t xml:space="preserve">ROC-AUC is threshold-free and unaffected by the shock rate, and it is the metric of hypothesis H1. Pooling matters: an unweighted LR scored 0.65 averaged over folds but only 0.53 pooled, because its probability level followed each fold's base rate. The majority class shows the same effect (0.5 per fold, 0.467 pooled). Mean ± SD of per-fold AUCs is still reported for the rubric's 'variance across folds'. Caveat found in the audit: pooled AUC also rewards telling crisis years from calm ones. An oracle that knows only each validation year's realised shock rate (constant within the year) scores 0.640 pooled. Within years (mean fold AUC) the order is KNN 0.672 &gt; LR 0.651 &gt; tree 0.578 ≈ persistence 0.569, and that is the order the test reproduced. We kept the planned rule, because switching after seeing the test would leak test information into model choice; M4 reports both.</w:t>
             </w:r>
           </w:p>
         </w:tc>
@@ -26245,7 +26245,7 @@
                 <w:sz w:val="19"/>
                 <w:szCs w:val="19"/>
               </w:rPr>
-              <w:t xml:space="preserve">Mean per-fold AUC (standard GridSearchCV): would pick models whose probabilities drift between years. Accuracy: rewards never alerting.</w:t>
+              <w:t xml:space="preserve">Mean per-fold AUC (standard GridSearchCV): ignores whether probability levels are comparable across years, but measures within-year ranking cleanly (M4 will report it alongside). Accuracy: rewards never alerting.</w:t>
             </w:r>
           </w:p>
         </w:tc>
@@ -26841,7 +26841,7 @@
                 <w:sz w:val="19"/>
                 <w:szCs w:val="19"/>
               </w:rPr>
-              <w:t xml:space="preserve">Evidence: Q1 prices stay 4.2% higher 8 weeks after a shock (only 16% revert), a typical shock is up to Rs 355/month at the Q1 ceiling (≈ 8% of the Rs 4,500/month Kafaalat value), coping is irreversible, and FAO found ≈ US$7 return per US$1 of early action. A false alarm is a transfer to poor households, not a pure loss, so 5:1 sits between parity and 7:1. Thresholds are chosen on 2021–24 out-of-fold predictions (not the test): LR 0.50, KNN 0.12, tree 0.16. The Bayes rule 1/6 is quoted for comparison but needs calibrated probabilities.</w:t>
+              <w:t xml:space="preserve">Evidence: a Q1 shock is not given back (8 weeks later Q1 prices are 4.2% above the pre-shock week, against 1.9% around an ordinary week, and after the shock they keep rising at the usual pace, 2.1% vs 2.0%), a typical shock is up to Rs 355/month at the Q1 ceiling (≈ 8% of the Rs 4,500/month Kafaalat value), coping is irreversible, and FAO found ≈ US$7 return per US$1 of early action. A false alarm is a transfer to poor households, not a pure loss, so 5:1 sits between parity and 7:1. Thresholds are chosen on 2021–24 out-of-fold predictions (not the test): LR 0.50, KNN 0.12, tree 0.16. The Bayes rule 1/6 is quoted for comparison but needs calibrated probabilities.</w:t>
             </w:r>
           </w:p>
         </w:tc>
@@ -29510,7 +29510,7 @@
                 <w:sz w:val="19"/>
                 <w:szCs w:val="19"/>
               </w:rPr>
-              <w:t xml:space="preserve">β_food = 0.12 (p = 0.003) supports the food part; β_energy = +0.04 (p = 0.92 for &lt; 0) does not support the energy part. Splitting energy shows motor fuel (−0.07) and LPG (−0.03) narrow the gap but utility tariffs (+0.03) widen it (the 'for Q1' tariff slabs weigh heavily in Q1's basket). Because the split was chosen after seeing the result, it is a hypothesis for M4 (avoids p-hacking).</w:t>
+              <w:t xml:space="preserve">β_food = 0.12 (p = 0.003) supports the food part; β_energy = +0.04 (p = 0.92 for &lt; 0) does not support the energy part. Splitting energy shows motor fuel (−0.07) and LPG (−0.03) narrow the gap, while utility tariffs point the other way (+0.03, p = 0.10, not significant; the 'for Q1' tariff slabs weigh heavily in Q1's basket). Because the split was chosen after seeing the result, it is a hypothesis for M4 (avoids p-hacking).</w:t>
             </w:r>
           </w:p>
         </w:tc>
@@ -32144,7 +32144,7 @@
                 <w:sz w:val="18"/>
                 <w:szCs w:val="18"/>
               </w:rPr>
-              <w:t xml:space="preserve">median 1.6%, mean 2.0%; 4.2% higher 8 weeks later; Rs 355/month ≈ 8% of Kafaalat</w:t>
+              <w:t xml:space="preserve">median 1.6%, mean 2.0%; not reversed: 4.2% above the pre-shock week 8 weeks later (ordinary week: 1.9%); Rs 355/month ≈ 8% of Kafaalat</w:t>
             </w:r>
           </w:p>
         </w:tc>
@@ -32180,7 +32180,7 @@
                 <w:sz w:val="18"/>
                 <w:szCs w:val="18"/>
               </w:rPr>
-              <w:t xml:space="preserve">Top drivers</w:t>
+              <w:t xml:space="preserve">Regime tracking (CV)</w:t>
             </w:r>
           </w:p>
         </w:tc>
@@ -32214,7 +32214,147 @@
                 <w:sz w:val="18"/>
                 <w:szCs w:val="18"/>
               </w:rPr>
-              <w:t xml:space="preserve">rupee 8-week change (LR weight 1.00, Gini 0.45, OR 1.11 per 1%); fiscal-year start OR 5.3</w:t>
+              <w:t xml:space="preserve">year-level oracle pooled AUC 0.640; within-year (mean fold) AUC: KNN 0.672, LR 0.651, tree 0.578, persistence 0.569</w:t>
+            </w:r>
+          </w:p>
+        </w:tc>
+      </w:tr>
+      <w:tr>
+        <w:tc>
+          <w:tcPr>
+            <w:tcW w:type="dxa" w:w="2800"/>
+            <w:tcBorders>
+              <w:top w:val="single" w:color="BFBFBF" w:sz="4"/>
+              <w:left w:val="single" w:color="BFBFBF" w:sz="4"/>
+              <w:bottom w:val="single" w:color="BFBFBF" w:sz="4"/>
+              <w:right w:val="single" w:color="BFBFBF" w:sz="4"/>
+            </w:tcBorders>
+            <w:tcMar>
+              <w:top w:type="dxa" w:w="60"/>
+              <w:left w:type="dxa" w:w="100"/>
+              <w:bottom w:type="dxa" w:w="60"/>
+              <w:right w:type="dxa" w:w="100"/>
+            </w:tcMar>
+            <w:vAlign w:val="top"/>
+          </w:tcPr>
+          <w:p>
+            <w:pPr>
+              <w:spacing w:after="40"/>
+            </w:pPr>
+            <w:r>
+              <w:rPr>
+                <w:rFonts w:ascii="Calibri" w:cs="Calibri" w:eastAsia="Calibri" w:hAnsi="Calibri"/>
+                <w:b/>
+                <w:bCs/>
+                <w:color w:val="1F1F1F"/>
+                <w:sz w:val="18"/>
+                <w:szCs w:val="18"/>
+              </w:rPr>
+              <w:t xml:space="preserve">Top drivers</w:t>
+            </w:r>
+          </w:p>
+        </w:tc>
+        <w:tc>
+          <w:tcPr>
+            <w:tcW w:type="dxa" w:w="6226"/>
+            <w:tcBorders>
+              <w:top w:val="single" w:color="BFBFBF" w:sz="4"/>
+              <w:left w:val="single" w:color="BFBFBF" w:sz="4"/>
+              <w:bottom w:val="single" w:color="BFBFBF" w:sz="4"/>
+              <w:right w:val="single" w:color="BFBFBF" w:sz="4"/>
+            </w:tcBorders>
+            <w:tcMar>
+              <w:top w:type="dxa" w:w="60"/>
+              <w:left w:type="dxa" w:w="100"/>
+              <w:bottom w:type="dxa" w:w="60"/>
+              <w:right w:type="dxa" w:w="100"/>
+            </w:tcMar>
+            <w:vAlign w:val="top"/>
+          </w:tcPr>
+          <w:p>
+            <w:pPr>
+              <w:spacing w:after="40"/>
+            </w:pPr>
+            <w:r>
+              <w:rPr>
+                <w:rFonts w:ascii="Calibri" w:cs="Calibri" w:eastAsia="Calibri" w:hAnsi="Calibri"/>
+                <w:b w:val="false"/>
+                <w:bCs w:val="false"/>
+                <w:color w:val="1F1F1F"/>
+                <w:sz w:val="18"/>
+                <w:szCs w:val="18"/>
+              </w:rPr>
+              <w:t xml:space="preserve">rupee 8-week change (LR weight 1.00, Gini 0.45, OR 1.11 per 1%); fiscal-year start OR 5.3 (5 fiscal years, 14 of 25 rows shocked; CI 1.4–19.5)</w:t>
+            </w:r>
+          </w:p>
+        </w:tc>
+      </w:tr>
+      <w:tr>
+        <w:tc>
+          <w:tcPr>
+            <w:tcW w:type="dxa" w:w="2800"/>
+            <w:tcBorders>
+              <w:top w:val="single" w:color="BFBFBF" w:sz="4"/>
+              <w:left w:val="single" w:color="BFBFBF" w:sz="4"/>
+              <w:bottom w:val="single" w:color="BFBFBF" w:sz="4"/>
+              <w:right w:val="single" w:color="BFBFBF" w:sz="4"/>
+            </w:tcBorders>
+            <w:tcMar>
+              <w:top w:type="dxa" w:w="60"/>
+              <w:left w:type="dxa" w:w="100"/>
+              <w:bottom w:type="dxa" w:w="60"/>
+              <w:right w:type="dxa" w:w="100"/>
+            </w:tcMar>
+            <w:vAlign w:val="top"/>
+          </w:tcPr>
+          <w:p>
+            <w:pPr>
+              <w:spacing w:after="40"/>
+            </w:pPr>
+            <w:r>
+              <w:rPr>
+                <w:rFonts w:ascii="Calibri" w:cs="Calibri" w:eastAsia="Calibri" w:hAnsi="Calibri"/>
+                <w:b/>
+                <w:bCs/>
+                <w:color w:val="1F1F1F"/>
+                <w:sz w:val="18"/>
+                <w:szCs w:val="18"/>
+              </w:rPr>
+              <w:t xml:space="preserve">July in the test</w:t>
+            </w:r>
+          </w:p>
+        </w:tc>
+        <w:tc>
+          <w:tcPr>
+            <w:tcW w:type="dxa" w:w="6226"/>
+            <w:tcBorders>
+              <w:top w:val="single" w:color="BFBFBF" w:sz="4"/>
+              <w:left w:val="single" w:color="BFBFBF" w:sz="4"/>
+              <w:bottom w:val="single" w:color="BFBFBF" w:sz="4"/>
+              <w:right w:val="single" w:color="BFBFBF" w:sz="4"/>
+            </w:tcBorders>
+            <w:tcMar>
+              <w:top w:type="dxa" w:w="60"/>
+              <w:left w:type="dxa" w:w="100"/>
+              <w:bottom w:type="dxa" w:w="60"/>
+              <w:right w:type="dxa" w:w="100"/>
+            </w:tcMar>
+            <w:vAlign w:val="top"/>
+          </w:tcPr>
+          <w:p>
+            <w:pPr>
+              <w:spacing w:after="40"/>
+            </w:pPr>
+            <w:r>
+              <w:rPr>
+                <w:rFonts w:ascii="Calibri" w:cs="Calibri" w:eastAsia="Calibri" w:hAnsi="Calibri"/>
+                <w:b w:val="false"/>
+                <w:bCs w:val="false"/>
+                <w:color w:val="1F1F1F"/>
+                <w:sz w:val="18"/>
+                <w:szCs w:val="18"/>
+              </w:rPr>
+              <w:t xml:space="preserve">4 of 13 shock weeks (14 of 35 shock rows); only 1 in the week containing 1 July</w:t>
             </w:r>
           </w:p>
         </w:tc>
@@ -32972,7 +33112,7 @@
                 <w:sz w:val="18"/>
                 <w:szCs w:val="18"/>
               </w:rPr>
-              <w:t xml:space="preserve">One AUC over the out-of-fold predictions of all four years together. Because the system uses one threshold for all years, probabilities must mean the same in every year; pooled AUC checks that, the per-fold average does not.</w:t>
+              <w:t xml:space="preserve">One AUC over the out-of-fold predictions of all four years together. Because the system uses one threshold for all years, probabilities must mean the same in every year; pooled AUC checks that, the per-fold average does not. Its weakness: it also rewards telling crisis years from calm ones (a year-level oracle scores 0.640).</w:t>
             </w:r>
           </w:p>
         </w:tc>
@@ -33011,7 +33151,7 @@
                 <w:sz w:val="18"/>
                 <w:szCs w:val="18"/>
               </w:rPr>
-              <w:t xml:space="preserve">Explain the C you chose.</w:t>
+              <w:t xml:space="preserve">Your tree had the best CV score but the worst test score. Why?</w:t>
             </w:r>
           </w:p>
         </w:tc>
@@ -33045,7 +33185,7 @@
                 <w:sz w:val="18"/>
                 <w:szCs w:val="18"/>
               </w:rPr>
-              <w:t xml:space="preserve">C is the inverse of the penalty strength. C = 0.0001 means a very strong L2 penalty: coefficients are shrunk heavily. Weaker penalties fit training weeks better (AUC 0.86) but validate worse (0.56): overfitting. The curve is flat for C ≤ 0.01.</w:t>
+              <w:t xml:space="preserve">Pooled AUC rewards regime tracking, and the tree's first split (rupee down &gt; 8% in 8 weeks) recognises the 2022–23 crisis. Within years its AUC is only 0.578, about persistence (0.569). The test period is one calm regime, so only within-year ranking counts there, and the within-year order (KNN &gt; LR &gt; tree) is exactly the test order. We did not re-select after seeing this, because that would leak the test into model choice; M4 will report both views.</w:t>
             </w:r>
           </w:p>
         </w:tc>
@@ -33084,7 +33224,7 @@
                 <w:sz w:val="18"/>
                 <w:szCs w:val="18"/>
               </w:rPr>
-              <w:t xml:space="preserve">Why k = 100 for KNN?</w:t>
+              <w:t xml:space="preserve">Explain the C you chose.</w:t>
             </w:r>
           </w:p>
         </w:tc>
@@ -33118,7 +33258,7 @@
                 <w:sz w:val="18"/>
                 <w:szCs w:val="18"/>
               </w:rPr>
-              <w:t xml:space="preserve">Small k overfits (k = 5: training AUC 0.98, validation 0.56). Around 100 neighbours the validation AUC peaks (0.64) and then declines as the forecast becomes too smooth.</w:t>
+              <w:t xml:space="preserve">C is the inverse of the penalty strength. C = 0.0001 means a very strong L2 penalty: coefficients are shrunk heavily. Weaker penalties fit training weeks better (AUC 0.86) but validate worse (0.56): overfitting. The curve is flat for C ≤ 0.01.</w:t>
             </w:r>
           </w:p>
         </w:tc>
@@ -33157,7 +33297,7 @@
                 <w:sz w:val="18"/>
                 <w:szCs w:val="18"/>
               </w:rPr>
-              <w:t xml:space="preserve">Why does KNN need scaling and the tree not?</w:t>
+              <w:t xml:space="preserve">Why k = 100 for KNN?</w:t>
             </w:r>
           </w:p>
         </w:tc>
@@ -33191,7 +33331,7 @@
                 <w:sz w:val="18"/>
                 <w:szCs w:val="18"/>
               </w:rPr>
-              <w:t xml:space="preserve">KNN uses distances, so a feature measured in large units would dominate. A tree only asks 'is x above a cut-off?', which no rescaling changes.</w:t>
+              <w:t xml:space="preserve">Small k overfits (k = 5: training AUC 0.98, validation 0.56). Around 100 neighbours the validation AUC peaks (0.64) and then declines as the forecast becomes too smooth.</w:t>
             </w:r>
           </w:p>
         </w:tc>
@@ -33230,7 +33370,7 @@
                 <w:sz w:val="18"/>
                 <w:szCs w:val="18"/>
               </w:rPr>
-              <w:t xml:space="preserve">What does a confusion matrix show for KNN?</w:t>
+              <w:t xml:space="preserve">Why does KNN need scaling and the tree not?</w:t>
             </w:r>
           </w:p>
         </w:tc>
@@ -33264,7 +33404,7 @@
                 <w:sz w:val="18"/>
                 <w:szCs w:val="18"/>
               </w:rPr>
-              <w:t xml:space="preserve">Test: 20 shocks caught (TP), 15 missed (FN), 133 false alarms (FP), 287 calm weeks correctly left alone (TN).</w:t>
+              <w:t xml:space="preserve">KNN uses distances, so a feature measured in large units would dominate. A tree only asks 'is x above a cut-off?', which no rescaling changes.</w:t>
             </w:r>
           </w:p>
         </w:tc>
@@ -33303,7 +33443,7 @@
                 <w:sz w:val="18"/>
                 <w:szCs w:val="18"/>
               </w:rPr>
-              <w:t xml:space="preserve">Precision is only 0.13. Is the model useless?</w:t>
+              <w:t xml:space="preserve">What does a confusion matrix show for KNN?</w:t>
             </w:r>
           </w:p>
         </w:tc>
@@ -33337,7 +33477,7 @@
                 <w:sz w:val="18"/>
                 <w:szCs w:val="18"/>
               </w:rPr>
-              <w:t xml:space="preserve">Precision depends on how common shocks are. In 2025–26 only 7.7% of rows were shocks, so most alarms are false even with decent ranking (AUC 0.68). In 2021–24 precision was 0.26–0.38.</w:t>
+              <w:t xml:space="preserve">Test: 20 shocks caught (TP), 15 missed (FN), 133 false alarms (FP), 287 calm weeks correctly left alone (TN).</w:t>
             </w:r>
           </w:p>
         </w:tc>
@@ -33376,7 +33516,7 @@
                 <w:sz w:val="18"/>
                 <w:szCs w:val="18"/>
               </w:rPr>
-              <w:t xml:space="preserve">Why is a false negative worse than a false positive here?</w:t>
+              <w:t xml:space="preserve">Precision is only 0.13. Is the model useless?</w:t>
             </w:r>
           </w:p>
         </w:tc>
@@ -33410,7 +33550,7 @@
                 <w:sz w:val="18"/>
                 <w:szCs w:val="18"/>
               </w:rPr>
-              <w:t xml:space="preserve">A miss leaves poor households to absorb a lasting price jump (4.2% higher 8 weeks later) with irreversible coping; a false alarm is a top-up that still reaches poor families. We weight a miss as 5 false alarms and test 1–20.</w:t>
+              <w:t xml:space="preserve">Precision depends on how common shocks are. In 2025–26 only 7.7% of rows were shocks, so most alarms are false even with decent ranking (AUC 0.68). In 2021–24 precision was 0.26–0.38.</w:t>
             </w:r>
           </w:p>
         </w:tc>
@@ -33449,7 +33589,7 @@
                 <w:sz w:val="18"/>
                 <w:szCs w:val="18"/>
               </w:rPr>
-              <w:t xml:space="preserve">How did you choose the threshold?</w:t>
+              <w:t xml:space="preserve">Why is a false negative worse than a false positive here?</w:t>
             </w:r>
           </w:p>
         </w:tc>
@@ -33483,7 +33623,7 @@
                 <w:sz w:val="18"/>
                 <w:szCs w:val="18"/>
               </w:rPr>
-              <w:t xml:space="preserve">The value that minimises 1 × FP + 5 × FN on the 2021–24 out-of-fold predictions; then applied unchanged to the test.</w:t>
+              <w:t xml:space="preserve">A miss leaves poor households to absorb a price step that is not given back (8 weeks later Q1 prices are 4.2% above the pre-shock week, against 1.9% around an ordinary week), with irreversible coping; a false alarm is a top-up that still reaches poor families. We weight a miss as 5 false alarms and test 1–20.</w:t>
             </w:r>
           </w:p>
         </w:tc>
@@ -33522,7 +33662,7 @@
                 <w:sz w:val="18"/>
                 <w:szCs w:val="18"/>
               </w:rPr>
-              <w:t xml:space="preserve">Why did no model beat 'never alert' in the test?</w:t>
+              <w:t xml:space="preserve">How did you choose the threshold?</w:t>
             </w:r>
           </w:p>
         </w:tc>
@@ -33556,7 +33696,7 @@
                 <w:sz w:val="18"/>
                 <w:szCs w:val="18"/>
               </w:rPr>
-              <w:t xml:space="preserve">Prior shift: the shock rate halved. Thresholds learned when shocks were common over-alert when they are rare. The ranking still works (KNN AUC 0.68), so recalibration/retraining (M4–M5) is the fix.</w:t>
+              <w:t xml:space="preserve">The value that minimises 1 × FP + 5 × FN on the 2021–24 out-of-fold predictions; then applied unchanged to the test.</w:t>
             </w:r>
           </w:p>
         </w:tc>
@@ -33595,7 +33735,7 @@
                 <w:sz w:val="18"/>
                 <w:szCs w:val="18"/>
               </w:rPr>
-              <w:t xml:space="preserve">Which features matter most?</w:t>
+              <w:t xml:space="preserve">Why did no model beat 'never alert' in the test?</w:t>
             </w:r>
           </w:p>
         </w:tc>
@@ -33629,7 +33769,7 @@
                 <w:sz w:val="18"/>
                 <w:szCs w:val="18"/>
               </w:rPr>
-              <w:t xml:space="preserve">The 8-week rupee depreciation (largest LR weight, the tree's first split, odds ratio 1.11 per 1%), recent shocks and food-price momentum. The fiscal-year start multiplies the odds by about 5 but is rare.</w:t>
+              <w:t xml:space="preserve">Prior shift: the shock rate halved. Thresholds learned when shocks were common over-alert when they are rare. The ranking still works (KNN AUC 0.68), so recalibration/retraining (M4–M5) is the fix. (At 5:1. At 20:1 the models do beat never-alert, but only by alerting almost every week, i.e. by matching the always-alert policy.)</w:t>
             </w:r>
           </w:p>
         </w:tc>
@@ -33668,7 +33808,7 @@
                 <w:sz w:val="18"/>
                 <w:szCs w:val="18"/>
               </w:rPr>
-              <w:t xml:space="preserve">What is permutation importance?</w:t>
+              <w:t xml:space="preserve">Which features matter most?</w:t>
             </w:r>
           </w:p>
         </w:tc>
@@ -33702,7 +33842,7 @@
                 <w:sz w:val="18"/>
                 <w:szCs w:val="18"/>
               </w:rPr>
-              <w:t xml:space="preserve">Shuffle one feature in the validation data and measure how much the AUC falls. Works for any model, including KNN.</w:t>
+              <w:t xml:space="preserve">The 8-week rupee depreciation (largest LR weight, the tree's first split, odds ratio 1.11 per 1%), recent shocks and food-price momentum. The fiscal-year start multiplies the odds by about 5 but is rare, and that estimate rests on only five fiscal years (CI 1.4–19.5).</w:t>
             </w:r>
           </w:p>
         </w:tc>
@@ -33741,7 +33881,7 @@
                 <w:sz w:val="18"/>
                 <w:szCs w:val="18"/>
               </w:rPr>
-              <w:t xml:space="preserve">What is an odds ratio?</w:t>
+              <w:t xml:space="preserve">Is 'front-load support before 1 July' still justified?</w:t>
             </w:r>
           </w:p>
         </w:tc>
@@ -33775,7 +33915,7 @@
                 <w:sz w:val="18"/>
                 <w:szCs w:val="18"/>
               </w:rPr>
-              <w:t xml:space="preserve">exp(coefficient): how many times the odds of a shock multiply for a one-unit rise. 1.11 for the rupee means +11% odds per 1% depreciation.</w:t>
+              <w:t xml:space="preserve">Yes for the timing, not for the one-week flag. In 2019–24, 14 of the 25 rows flagged as fiscal-year starts were followed by a shock (56% vs 17%). In 2025–26, 4 of the 13 shock weeks fell in July, but three came after its first week. M4 will try a first-month-of-the-fiscal-year window.</w:t>
             </w:r>
           </w:p>
         </w:tc>
@@ -33814,7 +33954,7 @@
                 <w:sz w:val="18"/>
                 <w:szCs w:val="18"/>
               </w:rPr>
-              <w:t xml:space="preserve">Was H1 supported?</w:t>
+              <w:t xml:space="preserve">What is permutation importance?</w:t>
             </w:r>
           </w:p>
         </w:tc>
@@ -33848,7 +33988,7 @@
                 <w:sz w:val="18"/>
                 <w:szCs w:val="18"/>
               </w:rPr>
-              <w:t xml:space="preserve">In sample yes (clustered Wald p = 0.001). Out of sample in 2025–26 no (DeLong p = 0.42). The early warning works in turbulent periods but not in a calm one.</w:t>
+              <w:t xml:space="preserve">Shuffle one feature in the validation data and measure how much the AUC falls. Works for any model, including KNN.</w:t>
             </w:r>
           </w:p>
         </w:tc>
@@ -33887,7 +34027,7 @@
                 <w:sz w:val="18"/>
                 <w:szCs w:val="18"/>
               </w:rPr>
-              <w:t xml:space="preserve">Why cluster standard errors by week?</w:t>
+              <w:t xml:space="preserve">What is an odds ratio?</w:t>
             </w:r>
           </w:p>
         </w:tc>
@@ -33921,7 +34061,7 @@
                 <w:sz w:val="18"/>
                 <w:szCs w:val="18"/>
               </w:rPr>
-              <w:t xml:space="preserve">The five quintile rows of a week share the same signals, so they are not independent; the plain LR test (χ² = 94) overstates the evidence about four-fold.</w:t>
+              <w:t xml:space="preserve">exp(coefficient): how many times the odds of a shock multiply for a one-unit rise. 1.11 for the rupee means +11% odds per 1% depreciation.</w:t>
             </w:r>
           </w:p>
         </w:tc>
@@ -33960,7 +34100,7 @@
                 <w:sz w:val="18"/>
                 <w:szCs w:val="18"/>
               </w:rPr>
-              <w:t xml:space="preserve">What did H2 and H3 find?</w:t>
+              <w:t xml:space="preserve">Was H1 supported?</w:t>
             </w:r>
           </w:p>
         </w:tc>
@@ -33994,7 +34134,153 @@
                 <w:sz w:val="18"/>
                 <w:szCs w:val="18"/>
               </w:rPr>
-              <w:t xml:space="preserve">H2: pass-through is about the same for Q1 and Q5 (p = 0.27). H3: food widens the gap against the poor (p = 0.003); energy as a whole does not narrow it, because utility tariffs hit the poor while motor fuel hits the rich (exploratory).</w:t>
+              <w:t xml:space="preserve">In sample yes (clustered Wald p = 0.001). Out of sample in 2025–26 no (DeLong p = 0.42). The early warning works in turbulent periods but not in a calm one.</w:t>
+            </w:r>
+          </w:p>
+        </w:tc>
+      </w:tr>
+      <w:tr>
+        <w:trPr>
+          <w:cantSplit/>
+        </w:trPr>
+        <w:tc>
+          <w:tcPr>
+            <w:tcW w:type="dxa" w:w="3000"/>
+            <w:tcBorders>
+              <w:top w:val="single" w:color="BFBFBF" w:sz="4"/>
+              <w:left w:val="single" w:color="BFBFBF" w:sz="4"/>
+              <w:bottom w:val="single" w:color="BFBFBF" w:sz="4"/>
+              <w:right w:val="single" w:color="BFBFBF" w:sz="4"/>
+            </w:tcBorders>
+            <w:tcMar>
+              <w:top w:type="dxa" w:w="60"/>
+              <w:left w:type="dxa" w:w="100"/>
+              <w:bottom w:type="dxa" w:w="60"/>
+              <w:right w:type="dxa" w:w="100"/>
+            </w:tcMar>
+            <w:vAlign w:val="top"/>
+          </w:tcPr>
+          <w:p>
+            <w:pPr>
+              <w:spacing w:after="40"/>
+            </w:pPr>
+            <w:r>
+              <w:rPr>
+                <w:rFonts w:ascii="Calibri" w:cs="Calibri" w:eastAsia="Calibri" w:hAnsi="Calibri"/>
+                <w:b/>
+                <w:bCs/>
+                <w:color w:val="1F1F1F"/>
+                <w:sz w:val="18"/>
+                <w:szCs w:val="18"/>
+              </w:rPr>
+              <w:t xml:space="preserve">Why cluster standard errors by week?</w:t>
+            </w:r>
+          </w:p>
+        </w:tc>
+        <w:tc>
+          <w:tcPr>
+            <w:tcW w:type="dxa" w:w="6026"/>
+            <w:tcBorders>
+              <w:top w:val="single" w:color="BFBFBF" w:sz="4"/>
+              <w:left w:val="single" w:color="BFBFBF" w:sz="4"/>
+              <w:bottom w:val="single" w:color="BFBFBF" w:sz="4"/>
+              <w:right w:val="single" w:color="BFBFBF" w:sz="4"/>
+            </w:tcBorders>
+            <w:tcMar>
+              <w:top w:type="dxa" w:w="60"/>
+              <w:left w:type="dxa" w:w="100"/>
+              <w:bottom w:type="dxa" w:w="60"/>
+              <w:right w:type="dxa" w:w="100"/>
+            </w:tcMar>
+            <w:vAlign w:val="top"/>
+          </w:tcPr>
+          <w:p>
+            <w:pPr>
+              <w:spacing w:after="40"/>
+            </w:pPr>
+            <w:r>
+              <w:rPr>
+                <w:rFonts w:ascii="Calibri" w:cs="Calibri" w:eastAsia="Calibri" w:hAnsi="Calibri"/>
+                <w:b w:val="false"/>
+                <w:bCs w:val="false"/>
+                <w:color w:val="1F1F1F"/>
+                <w:sz w:val="18"/>
+                <w:szCs w:val="18"/>
+              </w:rPr>
+              <w:t xml:space="preserve">The five quintile rows of a week share the same signals, so they are not independent; the plain LR test (χ² = 94) overstates the evidence about four-fold.</w:t>
+            </w:r>
+          </w:p>
+        </w:tc>
+      </w:tr>
+      <w:tr>
+        <w:trPr>
+          <w:cantSplit/>
+        </w:trPr>
+        <w:tc>
+          <w:tcPr>
+            <w:tcW w:type="dxa" w:w="3000"/>
+            <w:tcBorders>
+              <w:top w:val="single" w:color="BFBFBF" w:sz="4"/>
+              <w:left w:val="single" w:color="BFBFBF" w:sz="4"/>
+              <w:bottom w:val="single" w:color="BFBFBF" w:sz="4"/>
+              <w:right w:val="single" w:color="BFBFBF" w:sz="4"/>
+            </w:tcBorders>
+            <w:tcMar>
+              <w:top w:type="dxa" w:w="60"/>
+              <w:left w:type="dxa" w:w="100"/>
+              <w:bottom w:type="dxa" w:w="60"/>
+              <w:right w:type="dxa" w:w="100"/>
+            </w:tcMar>
+            <w:vAlign w:val="top"/>
+          </w:tcPr>
+          <w:p>
+            <w:pPr>
+              <w:spacing w:after="40"/>
+            </w:pPr>
+            <w:r>
+              <w:rPr>
+                <w:rFonts w:ascii="Calibri" w:cs="Calibri" w:eastAsia="Calibri" w:hAnsi="Calibri"/>
+                <w:b/>
+                <w:bCs/>
+                <w:color w:val="1F1F1F"/>
+                <w:sz w:val="18"/>
+                <w:szCs w:val="18"/>
+              </w:rPr>
+              <w:t xml:space="preserve">What did H2 and H3 find?</w:t>
+            </w:r>
+          </w:p>
+        </w:tc>
+        <w:tc>
+          <w:tcPr>
+            <w:tcW w:type="dxa" w:w="6026"/>
+            <w:tcBorders>
+              <w:top w:val="single" w:color="BFBFBF" w:sz="4"/>
+              <w:left w:val="single" w:color="BFBFBF" w:sz="4"/>
+              <w:bottom w:val="single" w:color="BFBFBF" w:sz="4"/>
+              <w:right w:val="single" w:color="BFBFBF" w:sz="4"/>
+            </w:tcBorders>
+            <w:tcMar>
+              <w:top w:type="dxa" w:w="60"/>
+              <w:left w:type="dxa" w:w="100"/>
+              <w:bottom w:type="dxa" w:w="60"/>
+              <w:right w:type="dxa" w:w="100"/>
+            </w:tcMar>
+            <w:vAlign w:val="top"/>
+          </w:tcPr>
+          <w:p>
+            <w:pPr>
+              <w:spacing w:after="40"/>
+            </w:pPr>
+            <w:r>
+              <w:rPr>
+                <w:rFonts w:ascii="Calibri" w:cs="Calibri" w:eastAsia="Calibri" w:hAnsi="Calibri"/>
+                <w:b w:val="false"/>
+                <w:bCs w:val="false"/>
+                <w:color w:val="1F1F1F"/>
+                <w:sz w:val="18"/>
+                <w:szCs w:val="18"/>
+              </w:rPr>
+              <w:t xml:space="preserve">H2: pass-through is about the same for Q1 and Q5 (p = 0.27). H3: food widens the gap against the poor (p = 0.003); energy as a whole does not narrow it. The exploratory split shows why: motor fuel and LPG hit the rich harder, while utility tariffs lean towards the poor (not significant, p = 0.10).</w:t>
             </w:r>
           </w:p>
         </w:tc>
@@ -34524,6 +34810,36 @@
           <w:szCs w:val="20"/>
         </w:rPr>
         <w:t xml:space="preserve"> class weights and shrinkage distort probabilities; thresholds do not transfer from crisis to calm years.</w:t>
+      </w:r>
+    </w:p>
+    <w:p>
+      <w:pPr>
+        <w:pStyle w:val="ListParagraph"/>
+        <w:numPr>
+          <w:ilvl w:val="0"/>
+          <w:numId w:val="3"/>
+        </w:numPr>
+        <w:spacing w:after="60"/>
+      </w:pPr>
+      <w:r>
+        <w:rPr>
+          <w:rFonts w:ascii="Calibri" w:cs="Calibri" w:eastAsia="Calibri" w:hAnsi="Calibri"/>
+          <w:b/>
+          <w:bCs/>
+          <w:color w:val="1F1F1F"/>
+          <w:sz w:val="20"/>
+          <w:szCs w:val="20"/>
+        </w:rPr>
+        <w:t xml:space="preserve">Selection criterion:</w:t>
+      </w:r>
+      <w:r>
+        <w:rPr>
+          <w:rFonts w:ascii="Calibri" w:cs="Calibri" w:eastAsia="Calibri" w:hAnsi="Calibri"/>
+          <w:color w:val="1F1F1F"/>
+          <w:sz w:val="20"/>
+          <w:szCs w:val="20"/>
+        </w:rPr>
+        <w:t xml:space="preserve"> pooled AUC partly rewards telling crisis years from calm ones (year-level oracle 0.640), which flattered the tree; M4 reports within-year AUC alongside it.</w:t>
       </w:r>
     </w:p>
     <w:p>
@@ -34651,7 +34967,7 @@
           <w:sz w:val="20"/>
           <w:szCs w:val="20"/>
         </w:rPr>
-        <w:t xml:space="preserve"> ensembles (random forest, gradient boosting) under the same protocol; quintile-specific models and the H4 interaction test; Platt/isotonic calibration; a tariff-notification calendar and a regime feature; fairness audit (H5: Brier and miss rates Q1 vs Q5, Diebold–Mariano test, equal opportunity, welfare-weighted thresholds); ethics of public warnings.</w:t>
+        <w:t xml:space="preserve"> ensembles (random forest, gradient boosting) under the same protocol; quintile-specific models and the H4 interaction test; Platt/isotonic calibration; within-year AUC reported next to pooled AUC; a tariff-notification calendar, a first-month-of-the-fiscal-year window and a regime feature; fairness audit (H5: Brier and miss rates Q1 vs Q5, Diebold–Mariano test, equal opportunity, welfare-weighted thresholds); ethics of public warnings.</w:t>
       </w:r>
     </w:p>
     <w:p>

</xml_diff>

<commit_message>
models: keep M3 methods within lecture scope
Replace the hand-coded DeLong test with the week-block bootstrap for the
H1 out-of-sample comparison (DeLong assumes independent rows). Drop the
year-level oracle, the Bayes-threshold formula and jargon (prior shift,
improper linear model, Platt/isotonic, equal opportunity, welfare
weights) in favour of plain words, and tie methods to lecture units.
Manuscript references renumbered [11]-[17]; viva guide gains a section
on the few methods used from beyond the slides. No model, threshold or
other result changed.
</commit_message>
<xml_diff>
--- a/DS4SG_M3_Reference.docx
+++ b/DS4SG_M3_Reference.docx
@@ -71,7 +71,7 @@
           <w:sz w:val="22"/>
           <w:szCs w:val="22"/>
         </w:rPr>
-        <w:t xml:space="preserve">Version: 21 October 2026 (Milestone 3 due 24 October 2026)</w:t>
+        <w:t xml:space="preserve">Version: 22 October 2026 (Milestone 3 due 24 October 2026)</w:t>
       </w:r>
     </w:p>
     <w:p>
@@ -522,7 +522,26 @@
             <w:sz w:val="20"/>
             <w:szCs w:val="20"/>
           </w:rPr>
-          <w:t xml:space="preserve">5.7 Bias and variance</w:t>
+          <w:t xml:space="preserve">5.7 Overfitting and tuning</w:t>
+        </w:r>
+      </w:hyperlink>
+    </w:p>
+    <w:p>
+      <w:pPr>
+        <w:spacing w:after="40" w:before="0"/>
+        <w:ind w:left="400"/>
+      </w:pPr>
+      <w:hyperlink w:history="1" w:anchor="h22">
+        <w:r>
+          <w:rPr>
+            <w:rFonts w:ascii="Calibri" w:cs="Calibri" w:eastAsia="Calibri" w:hAnsi="Calibri"/>
+            <w:b w:val="false"/>
+            <w:bCs w:val="false"/>
+            <w:color w:val="1F1F1F"/>
+            <w:sz w:val="20"/>
+            <w:szCs w:val="20"/>
+          </w:rPr>
+          <w:t xml:space="preserve">5.8 Methods beyond the lecture slides</w:t>
         </w:r>
       </w:hyperlink>
     </w:p>
@@ -531,7 +550,7 @@
         <w:spacing w:after="40" w:before="120"/>
         <w:ind w:left="0"/>
       </w:pPr>
-      <w:hyperlink w:history="1" w:anchor="h22">
+      <w:hyperlink w:history="1" w:anchor="h23">
         <w:r>
           <w:rPr>
             <w:rFonts w:ascii="Calibri" w:cs="Calibri" w:eastAsia="Calibri" w:hAnsi="Calibri"/>
@@ -550,7 +569,7 @@
         <w:spacing w:after="40" w:before="120"/>
         <w:ind w:left="0"/>
       </w:pPr>
-      <w:hyperlink w:history="1" w:anchor="h23">
+      <w:hyperlink w:history="1" w:anchor="h24">
         <w:r>
           <w:rPr>
             <w:rFonts w:ascii="Calibri" w:cs="Calibri" w:eastAsia="Calibri" w:hAnsi="Calibri"/>
@@ -569,7 +588,7 @@
         <w:spacing w:after="40" w:before="120"/>
         <w:ind w:left="0"/>
       </w:pPr>
-      <w:hyperlink w:history="1" w:anchor="h24">
+      <w:hyperlink w:history="1" w:anchor="h25">
         <w:r>
           <w:rPr>
             <w:rFonts w:ascii="Calibri" w:cs="Calibri" w:eastAsia="Calibri" w:hAnsi="Calibri"/>
@@ -588,7 +607,7 @@
         <w:spacing w:after="40" w:before="120"/>
         <w:ind w:left="0"/>
       </w:pPr>
-      <w:hyperlink w:history="1" w:anchor="h25">
+      <w:hyperlink w:history="1" w:anchor="h26">
         <w:r>
           <w:rPr>
             <w:rFonts w:ascii="Calibri" w:cs="Calibri" w:eastAsia="Calibri" w:hAnsi="Calibri"/>
@@ -607,7 +626,7 @@
         <w:spacing w:after="40" w:before="120"/>
         <w:ind w:left="0"/>
       </w:pPr>
-      <w:hyperlink w:history="1" w:anchor="h26">
+      <w:hyperlink w:history="1" w:anchor="h27">
         <w:r>
           <w:rPr>
             <w:rFonts w:ascii="Calibri" w:cs="Calibri" w:eastAsia="Calibri" w:hAnsi="Calibri"/>
@@ -918,7 +937,7 @@
           <w:sz w:val="20"/>
           <w:szCs w:val="20"/>
         </w:rPr>
-        <w:t xml:space="preserve">In the 2021–24 validation years all three models beat both benchmarks on pooled AUC (0.64–0.65 vs 0.58 for persistence) and cut error costs by a third compared with never alerting. Much of the pooled score is regime tracking, though: within years, KNN (0.67) and LR (0.65) beat persistence (0.57) and the tree (0.58) barely does.</w:t>
+        <w:t xml:space="preserve">In the 2021–24 validation years all three models beat both benchmarks on pooled AUC (0.64–0.65 vs 0.58 for persistence) and cut error costs by a third compared with never alerting. Much of the pooled score comes from telling crisis years from calm years, though: within years, KNN (0.67) and LR (0.65) beat persistence (0.57) and the tree (0.58) barely does.</w:t>
       </w:r>
     </w:p>
     <w:p>
@@ -4400,7 +4419,7 @@
                 <w:sz w:val="19"/>
                 <w:szCs w:val="19"/>
               </w:rPr>
-              <w:t xml:space="preserve">The single home of all Milestone 3 modelling code. It defines the feature lists, loads and splits the data, builds the cross-validation folds, defines the three model pipelines and their hyperparameter grids, runs the grid search, computes every metric, chooses the cost-based alarm threshold, and implements the DeLong test and the week-block bootstrap. Its docstring lists decisions B1–B8.</w:t>
+              <w:t xml:space="preserve">The single home of all Milestone 3 modelling code. It defines the feature lists, loads and splits the data, builds the cross-validation folds, defines the three model pipelines and their hyperparameter grids, runs the grid search, computes every metric, chooses the cost-based alarm threshold, and implements the week-block bootstrap. Its docstring lists decisions B1–B8.</w:t>
             </w:r>
           </w:p>
         </w:tc>
@@ -4853,7 +4872,7 @@
                 <w:sz w:val="19"/>
                 <w:szCs w:val="19"/>
               </w:rPr>
-              <w:t xml:space="preserve">pipelines, time-series cross-validation, grid search, out-of-fold predictions, ROC-AUC, cost-sensitive thresholds, DeLong test, block bootstrap, cluster-robust logit.</w:t>
+              <w:t xml:space="preserve">pipelines, time-series cross-validation, grid search, out-of-fold predictions, ROC-AUC, cost-sensitive thresholds, week-block bootstrap, standard errors clustered by week.</w:t>
             </w:r>
           </w:p>
         </w:tc>
@@ -7875,7 +7894,7 @@
                 <w:sz w:val="19"/>
                 <w:szCs w:val="19"/>
               </w:rPr>
-              <w:t xml:space="preserve"> (3,000 body words).</w:t>
+              <w:t xml:space="preserve"> (3,349 body words).</w:t>
             </w:r>
           </w:p>
         </w:tc>
@@ -10817,7 +10836,7 @@
                 <w:sz w:val="17"/>
                 <w:szCs w:val="17"/>
               </w:rPr>
-              <w:t xml:space="preserve">H1 test, odds ratios, cluster-robust SE</w:t>
+              <w:t xml:space="preserve">H1 test, odds ratios, standard errors clustered by week</w:t>
             </w:r>
           </w:p>
         </w:tc>
@@ -10949,7 +10968,7 @@
                 <w:sz w:val="15"/>
                 <w:szCs w:val="15"/>
               </w:rPr>
-              <w:t xml:space="preserve">delong_test(y, p_a, p_b)</w:t>
+              <w:t xml:space="preserve">week_block_bootstrap(y, scores, weeks)</w:t>
             </w:r>
           </w:p>
         </w:tc>
@@ -10981,7 +11000,7 @@
                 <w:sz w:val="17"/>
                 <w:szCs w:val="17"/>
               </w:rPr>
-              <w:t xml:space="preserve">DeLong test that two AUCs on the same rows are equal (fast midrank algorithm); returns both AUCs, z and p-values.</w:t>
+              <w:t xml:space="preserve">Bootstrap sampling of whole test weeks (2,000 times, with replacement), recomputing each AUC.</w:t>
             </w:r>
           </w:p>
         </w:tc>
@@ -11013,105 +11032,7 @@
                 <w:sz w:val="17"/>
                 <w:szCs w:val="17"/>
               </w:rPr>
-              <w:t xml:space="preserve">comparing correlated AUCs</w:t>
-            </w:r>
-          </w:p>
-        </w:tc>
-      </w:tr>
-      <w:tr>
-        <w:tc>
-          <w:tcPr>
-            <w:tcW w:type="dxa" w:w="2500"/>
-            <w:tcBorders>
-              <w:top w:val="single" w:color="BFBFBF" w:sz="4"/>
-              <w:left w:val="single" w:color="BFBFBF" w:sz="4"/>
-              <w:bottom w:val="single" w:color="BFBFBF" w:sz="4"/>
-              <w:right w:val="single" w:color="BFBFBF" w:sz="4"/>
-            </w:tcBorders>
-            <w:tcMar>
-              <w:top w:type="dxa" w:w="60"/>
-              <w:left w:type="dxa" w:w="100"/>
-              <w:bottom w:type="dxa" w:w="60"/>
-              <w:right w:type="dxa" w:w="100"/>
-            </w:tcMar>
-            <w:vAlign w:val="top"/>
-          </w:tcPr>
-          <w:p>
-            <w:pPr>
-              <w:spacing w:after="40"/>
-            </w:pPr>
-            <w:r>
-              <w:rPr>
-                <w:rFonts w:ascii="Consolas" w:cs="Consolas" w:eastAsia="Consolas" w:hAnsi="Consolas"/>
-                <w:color w:val="1F1F1F"/>
-                <w:sz w:val="15"/>
-                <w:szCs w:val="15"/>
-              </w:rPr>
-              <w:t xml:space="preserve">week_block_bootstrap(y, scores, weeks)</w:t>
-            </w:r>
-          </w:p>
-        </w:tc>
-        <w:tc>
-          <w:tcPr>
-            <w:tcW w:type="dxa" w:w="4626"/>
-            <w:tcBorders>
-              <w:top w:val="single" w:color="BFBFBF" w:sz="4"/>
-              <w:left w:val="single" w:color="BFBFBF" w:sz="4"/>
-              <w:bottom w:val="single" w:color="BFBFBF" w:sz="4"/>
-              <w:right w:val="single" w:color="BFBFBF" w:sz="4"/>
-            </w:tcBorders>
-            <w:tcMar>
-              <w:top w:type="dxa" w:w="60"/>
-              <w:left w:type="dxa" w:w="100"/>
-              <w:bottom w:type="dxa" w:w="60"/>
-              <w:right w:type="dxa" w:w="100"/>
-            </w:tcMar>
-            <w:vAlign w:val="top"/>
-          </w:tcPr>
-          <w:p>
-            <w:pPr>
-              <w:spacing w:after="40"/>
-            </w:pPr>
-            <w:r>
-              <w:rPr>
-                <w:rFonts w:ascii="Calibri" w:cs="Calibri" w:eastAsia="Calibri" w:hAnsi="Calibri"/>
-                <w:color w:val="1F1F1F"/>
-                <w:sz w:val="17"/>
-                <w:szCs w:val="17"/>
-              </w:rPr>
-              <w:t xml:space="preserve">Resamples whole test weeks 2,000 times and recomputes each AUC.</w:t>
-            </w:r>
-          </w:p>
-        </w:tc>
-        <w:tc>
-          <w:tcPr>
-            <w:tcW w:type="dxa" w:w="1900"/>
-            <w:tcBorders>
-              <w:top w:val="single" w:color="BFBFBF" w:sz="4"/>
-              <w:left w:val="single" w:color="BFBFBF" w:sz="4"/>
-              <w:bottom w:val="single" w:color="BFBFBF" w:sz="4"/>
-              <w:right w:val="single" w:color="BFBFBF" w:sz="4"/>
-            </w:tcBorders>
-            <w:tcMar>
-              <w:top w:type="dxa" w:w="60"/>
-              <w:left w:type="dxa" w:w="100"/>
-              <w:bottom w:type="dxa" w:w="60"/>
-              <w:right w:type="dxa" w:w="100"/>
-            </w:tcMar>
-            <w:vAlign w:val="top"/>
-          </w:tcPr>
-          <w:p>
-            <w:pPr>
-              <w:spacing w:after="40"/>
-            </w:pPr>
-            <w:r>
-              <w:rPr>
-                <w:rFonts w:ascii="Calibri" w:cs="Calibri" w:eastAsia="Calibri" w:hAnsi="Calibri"/>
-                <w:color w:val="1F1F1F"/>
-                <w:sz w:val="17"/>
-                <w:szCs w:val="17"/>
-              </w:rPr>
-              <w:t xml:space="preserve">block bootstrap, confidence intervals</w:t>
+              <w:t xml:space="preserve">bootstrap and cluster sampling (Unit 04), confidence intervals (Unit 06)</w:t>
             </w:r>
           </w:p>
         </w:tc>
@@ -12380,7 +12301,7 @@
                 <w:sz w:val="17"/>
                 <w:szCs w:val="17"/>
               </w:rPr>
-              <w:t xml:space="preserve">In-sample LR and week-clustered Wald tests; out-of-sample AUC comparison with DeLong and week-block bootstrap.</w:t>
+              <w:t xml:space="preserve">In-sample LR and week-clustered Wald tests; out-of-sample AUC comparison with the week-block bootstrap (replacing the DeLong test planned in M2).</w:t>
             </w:r>
           </w:p>
         </w:tc>
@@ -16737,7 +16658,7 @@
           <w:sz w:val="20"/>
           <w:szCs w:val="20"/>
         </w:rPr>
-        <w:t xml:space="preserve">Each concept is explained in plain words and then in more detail, with where it appears. Course units: KNN, hold-out and cross-validation, and bias in training data are Week 7; logistic regression is Week 9; model evaluation metrics are Week 6; scaling is Unit 04; resistant statistics are Unit 05; hypothesis tests and p-values are Unit 07. Decision trees, ensembles and fairness come later in the course and are explained here.</w:t>
+        <w:t xml:space="preserve">Each concept is explained in plain words and then in more detail, with where it appears. Lecture slides: scaling, sampling and bootstrap sampling are Unit 04; resistant statistics and correlation Unit 05; confidence intervals Unit 06; hypothesis tests and p-values Unit 07; decision trees, Gini and entropy Units 08–09; the confusion matrix, precision, recall, F-measure, ROC and AUC Unit 10 (PR-AUC is its homework); KNN, distances, weighted voting and normalisation Unit 11. The syllabus adds hold-out and cross-validation (Week 7), logistic regression (Week 9) and regression analysis (Week 10); ensembles (Week 12) and fairness (Week 15) come later. Section 5.8 lists the few methods we used from beyond the course, and why.</w:t>
       </w:r>
     </w:p>
     <w:p>
@@ -17839,7 +17760,7 @@
                 <w:sz w:val="17"/>
                 <w:szCs w:val="17"/>
               </w:rPr>
-              <w:t xml:space="preserve">Mean rewards ranking within each year; pooled also requires probability levels to be comparable across years, which a single alarm threshold needs. We select by pooled AUC and report mean ± SD.</w:t>
+              <w:t xml:space="preserve">Mean rewards ranking within each year; pooled also requires probability levels to be comparable across years, which a single alarm threshold needs. We select by pooled AUC and report mean ± SD. Pooled AUC also rewards telling crisis years from calm years: the tree's pooled AUC beats three of its four yearly AUCs.</w:t>
             </w:r>
           </w:p>
         </w:tc>
@@ -18978,7 +18899,7 @@
                 <w:sz w:val="17"/>
                 <w:szCs w:val="17"/>
               </w:rPr>
-              <w:t xml:space="preserve">Non-parametric 'analogue' forecast. Small k = flexible (overfits); large k = smooth (underfits). Needs scaled features because it uses distances. Selected k = 100, uniform weights, z-scores.</w:t>
+              <w:t xml:space="preserve">Non-parametric 'analogue' forecast (Unit 11). Small k = flexible (overfits); large k = smooth (underfits). Needs scaled features because it uses distances. Selected k = 100, uniform weights, z-scores.</w:t>
             </w:r>
           </w:p>
         </w:tc>
@@ -19392,7 +19313,7 @@
                 <w:sz w:val="17"/>
                 <w:szCs w:val="17"/>
               </w:rPr>
-              <w:t xml:space="preserve">Gini = 1 − Σ p_k². A split is good if it lowers the weighted Gini of the child groups.</w:t>
+              <w:t xml:space="preserve">Gini = 1 − Σ p_k². A split is good if it lowers the weighted Gini of the child groups (Units 08–09).</w:t>
             </w:r>
           </w:p>
         </w:tc>
@@ -19564,7 +19485,7 @@
                 <w:sz w:val="17"/>
                 <w:szCs w:val="17"/>
               </w:rPr>
-              <w:t xml:space="preserve">Unit 04; </w:t>
+              <w:t xml:space="preserve">Units 04 and 11; </w:t>
             </w:r>
             <w:r>
               <w:rPr>
@@ -20776,7 +20697,7 @@
                 <w:sz w:val="17"/>
                 <w:szCs w:val="17"/>
               </w:rPr>
-              <w:t xml:space="preserve">Focuses on the rare class; no-skill level = shock rate (0.077). More informative than ROC under imbalance.</w:t>
+              <w:t xml:space="preserve">Focuses on the rare class; no-skill level = shock rate (0.077). More informative than ROC under imbalance (the Unit 10 homework question).</w:t>
             </w:r>
           </w:p>
         </w:tc>
@@ -20914,7 +20835,7 @@
                 <w:sz w:val="17"/>
                 <w:szCs w:val="17"/>
               </w:rPr>
-              <w:t xml:space="preserve">Mean of (p − y)²; lower is better. Measures calibration (does 20% mean 20%?). LR 0.238 is poor because its probabilities sit near 0.5.</w:t>
+              <w:t xml:space="preserve">Mean of (p − y)²; lower is better. Measures calibration (does 20% mean 20%?). LR 0.238 is poor because its probabilities sit near 0.5. It is also the loss in the fairness hypothesis H5 (M2).</w:t>
             </w:r>
           </w:p>
         </w:tc>
@@ -21041,7 +20962,7 @@
                 <w:sz w:val="17"/>
                 <w:szCs w:val="17"/>
               </w:rPr>
-              <w:t xml:space="preserve">Needed if officials read the probability itself. Class weights and heavy shrinkage break it; M4 will calibrate (Platt, isotonic).</w:t>
+              <w:t xml:space="preserve">Needed if officials read the probability itself. Class weights and heavy shrinkage break it; M4 will adjust the probabilities so they match observed shock rates.</w:t>
             </w:r>
           </w:p>
         </w:tc>
@@ -21551,7 +21472,7 @@
                 <w:sz w:val="17"/>
                 <w:szCs w:val="17"/>
               </w:rPr>
-              <w:t xml:space="preserve">Bayes-optimal threshold</w:t>
+              <w:t xml:space="preserve">Trivial policies</w:t>
             </w:r>
           </w:p>
         </w:tc>
@@ -21585,7 +21506,7 @@
                 <w:sz w:val="17"/>
                 <w:szCs w:val="17"/>
               </w:rPr>
-              <w:t xml:space="preserve">With true probabilities, alert when p ≥ c_FP / (c_FP + c_FN).</w:t>
+              <w:t xml:space="preserve">Never alert, or always alert.</w:t>
             </w:r>
           </w:p>
         </w:tc>
@@ -21619,7 +21540,7 @@
                 <w:sz w:val="17"/>
                 <w:szCs w:val="17"/>
               </w:rPr>
-              <w:t xml:space="preserve">= 1/6 ≈ 0.17 at 5:1. Only valid for calibrated probabilities, hence our empirical choice.</w:t>
+              <w:t xml:space="preserve">The cheaper of the two is the benchmark any model must beat on cost. In 2021–24 at 5:1 always-alert was cheaper (shock rate 19.5% &gt; 1/6); in the test never-alert was.</w:t>
             </w:r>
           </w:p>
         </w:tc>
@@ -21646,14 +21567,12 @@
             </w:pPr>
             <w:r>
               <w:rPr>
-                <w:rFonts w:ascii="Calibri" w:cs="Calibri" w:eastAsia="Calibri" w:hAnsi="Calibri"/>
-                <w:b w:val="false"/>
-                <w:bCs w:val="false"/>
-                <w:color w:val="1F1F1F"/>
-                <w:sz w:val="17"/>
-                <w:szCs w:val="17"/>
-              </w:rPr>
-              <w:t xml:space="preserve">nb03 §6</w:t>
+                <w:rFonts w:ascii="Consolas" w:cs="Consolas" w:eastAsia="Consolas" w:hAnsi="Consolas"/>
+                <w:color w:val="1F1F1F"/>
+                <w:sz w:val="15"/>
+                <w:szCs w:val="15"/>
+              </w:rPr>
+              <w:t xml:space="preserve">trivial_policy_costs()</w:t>
             </w:r>
           </w:p>
         </w:tc>
@@ -21689,143 +21608,7 @@
                 <w:sz w:val="17"/>
                 <w:szCs w:val="17"/>
               </w:rPr>
-              <w:t xml:space="preserve">Trivial policies</w:t>
-            </w:r>
-          </w:p>
-        </w:tc>
-        <w:tc>
-          <w:tcPr>
-            <w:tcW w:type="dxa" w:w="2600"/>
-            <w:tcBorders>
-              <w:top w:val="single" w:color="BFBFBF" w:sz="4"/>
-              <w:left w:val="single" w:color="BFBFBF" w:sz="4"/>
-              <w:bottom w:val="single" w:color="BFBFBF" w:sz="4"/>
-              <w:right w:val="single" w:color="BFBFBF" w:sz="4"/>
-            </w:tcBorders>
-            <w:tcMar>
-              <w:top w:type="dxa" w:w="60"/>
-              <w:left w:type="dxa" w:w="100"/>
-              <w:bottom w:type="dxa" w:w="60"/>
-              <w:right w:type="dxa" w:w="100"/>
-            </w:tcMar>
-            <w:vAlign w:val="top"/>
-          </w:tcPr>
-          <w:p>
-            <w:pPr>
-              <w:spacing w:after="40"/>
-            </w:pPr>
-            <w:r>
-              <w:rPr>
-                <w:rFonts w:ascii="Calibri" w:cs="Calibri" w:eastAsia="Calibri" w:hAnsi="Calibri"/>
-                <w:b w:val="false"/>
-                <w:bCs w:val="false"/>
-                <w:color w:val="1F1F1F"/>
-                <w:sz w:val="17"/>
-                <w:szCs w:val="17"/>
-              </w:rPr>
-              <w:t xml:space="preserve">Never alert, or always alert.</w:t>
-            </w:r>
-          </w:p>
-        </w:tc>
-        <w:tc>
-          <w:tcPr>
-            <w:tcW w:type="dxa" w:w="3500"/>
-            <w:tcBorders>
-              <w:top w:val="single" w:color="BFBFBF" w:sz="4"/>
-              <w:left w:val="single" w:color="BFBFBF" w:sz="4"/>
-              <w:bottom w:val="single" w:color="BFBFBF" w:sz="4"/>
-              <w:right w:val="single" w:color="BFBFBF" w:sz="4"/>
-            </w:tcBorders>
-            <w:tcMar>
-              <w:top w:type="dxa" w:w="60"/>
-              <w:left w:type="dxa" w:w="100"/>
-              <w:bottom w:type="dxa" w:w="60"/>
-              <w:right w:type="dxa" w:w="100"/>
-            </w:tcMar>
-            <w:vAlign w:val="top"/>
-          </w:tcPr>
-          <w:p>
-            <w:pPr>
-              <w:spacing w:after="40"/>
-            </w:pPr>
-            <w:r>
-              <w:rPr>
-                <w:rFonts w:ascii="Calibri" w:cs="Calibri" w:eastAsia="Calibri" w:hAnsi="Calibri"/>
-                <w:b w:val="false"/>
-                <w:bCs w:val="false"/>
-                <w:color w:val="1F1F1F"/>
-                <w:sz w:val="17"/>
-                <w:szCs w:val="17"/>
-              </w:rPr>
-              <w:t xml:space="preserve">The cheaper of the two is the benchmark any model must beat on cost. In 2021–24 at 5:1 always-alert was cheaper (shock rate 19.5% &gt; 1/6); in the test never-alert was.</w:t>
-            </w:r>
-          </w:p>
-        </w:tc>
-        <w:tc>
-          <w:tcPr>
-            <w:tcW w:type="dxa" w:w="1226"/>
-            <w:tcBorders>
-              <w:top w:val="single" w:color="BFBFBF" w:sz="4"/>
-              <w:left w:val="single" w:color="BFBFBF" w:sz="4"/>
-              <w:bottom w:val="single" w:color="BFBFBF" w:sz="4"/>
-              <w:right w:val="single" w:color="BFBFBF" w:sz="4"/>
-            </w:tcBorders>
-            <w:tcMar>
-              <w:top w:type="dxa" w:w="60"/>
-              <w:left w:type="dxa" w:w="100"/>
-              <w:bottom w:type="dxa" w:w="60"/>
-              <w:right w:type="dxa" w:w="100"/>
-            </w:tcMar>
-            <w:vAlign w:val="top"/>
-          </w:tcPr>
-          <w:p>
-            <w:pPr>
-              <w:spacing w:after="40"/>
-            </w:pPr>
-            <w:r>
-              <w:rPr>
-                <w:rFonts w:ascii="Consolas" w:cs="Consolas" w:eastAsia="Consolas" w:hAnsi="Consolas"/>
-                <w:color w:val="1F1F1F"/>
-                <w:sz w:val="15"/>
-                <w:szCs w:val="15"/>
-              </w:rPr>
-              <w:t xml:space="preserve">trivial_policy_costs()</w:t>
-            </w:r>
-          </w:p>
-        </w:tc>
-      </w:tr>
-      <w:tr>
-        <w:tc>
-          <w:tcPr>
-            <w:tcW w:type="dxa" w:w="1700"/>
-            <w:tcBorders>
-              <w:top w:val="single" w:color="BFBFBF" w:sz="4"/>
-              <w:left w:val="single" w:color="BFBFBF" w:sz="4"/>
-              <w:bottom w:val="single" w:color="BFBFBF" w:sz="4"/>
-              <w:right w:val="single" w:color="BFBFBF" w:sz="4"/>
-            </w:tcBorders>
-            <w:tcMar>
-              <w:top w:type="dxa" w:w="60"/>
-              <w:left w:type="dxa" w:w="100"/>
-              <w:bottom w:type="dxa" w:w="60"/>
-              <w:right w:type="dxa" w:w="100"/>
-            </w:tcMar>
-            <w:vAlign w:val="top"/>
-          </w:tcPr>
-          <w:p>
-            <w:pPr>
-              <w:spacing w:after="40"/>
-            </w:pPr>
-            <w:r>
-              <w:rPr>
-                <w:rFonts w:ascii="Calibri" w:cs="Calibri" w:eastAsia="Calibri" w:hAnsi="Calibri"/>
-                <w:b/>
-                <w:bCs/>
-                <w:color w:val="1F1F1F"/>
-                <w:sz w:val="17"/>
-                <w:szCs w:val="17"/>
-              </w:rPr>
-              <w:t xml:space="preserve">Prior shift / base-rate effect</w:t>
+              <w:t xml:space="preserve">Base-rate change</w:t>
             </w:r>
           </w:p>
         </w:tc>
@@ -23279,7 +23062,7 @@
                 <w:sz w:val="17"/>
                 <w:szCs w:val="17"/>
               </w:rPr>
-              <w:t xml:space="preserve">DeLong test</w:t>
+              <w:t xml:space="preserve">Block bootstrap</w:t>
             </w:r>
           </w:p>
         </w:tc>
@@ -23313,7 +23096,7 @@
                 <w:sz w:val="17"/>
                 <w:szCs w:val="17"/>
               </w:rPr>
-              <w:t xml:space="preserve">Are two AUCs on the same rows different?</w:t>
+              <w:t xml:space="preserve">Resample whole weeks many times to see how much a result could vary.</w:t>
             </w:r>
           </w:p>
         </w:tc>
@@ -23347,143 +23130,7 @@
                 <w:sz w:val="17"/>
                 <w:szCs w:val="17"/>
               </w:rPr>
-              <w:t xml:space="preserve">Uses each row's contribution to the AUC to get the variance of the difference (Sun &amp; Xu fast algorithm). Assumes independent rows.</w:t>
-            </w:r>
-          </w:p>
-        </w:tc>
-        <w:tc>
-          <w:tcPr>
-            <w:tcW w:type="dxa" w:w="1226"/>
-            <w:tcBorders>
-              <w:top w:val="single" w:color="BFBFBF" w:sz="4"/>
-              <w:left w:val="single" w:color="BFBFBF" w:sz="4"/>
-              <w:bottom w:val="single" w:color="BFBFBF" w:sz="4"/>
-              <w:right w:val="single" w:color="BFBFBF" w:sz="4"/>
-            </w:tcBorders>
-            <w:tcMar>
-              <w:top w:type="dxa" w:w="60"/>
-              <w:left w:type="dxa" w:w="100"/>
-              <w:bottom w:type="dxa" w:w="60"/>
-              <w:right w:type="dxa" w:w="100"/>
-            </w:tcMar>
-            <w:vAlign w:val="top"/>
-          </w:tcPr>
-          <w:p>
-            <w:pPr>
-              <w:spacing w:after="40"/>
-            </w:pPr>
-            <w:r>
-              <w:rPr>
-                <w:rFonts w:ascii="Consolas" w:cs="Consolas" w:eastAsia="Consolas" w:hAnsi="Consolas"/>
-                <w:color w:val="1F1F1F"/>
-                <w:sz w:val="15"/>
-                <w:szCs w:val="15"/>
-              </w:rPr>
-              <w:t xml:space="preserve">delong_test()</w:t>
-            </w:r>
-          </w:p>
-        </w:tc>
-      </w:tr>
-      <w:tr>
-        <w:tc>
-          <w:tcPr>
-            <w:tcW w:type="dxa" w:w="1700"/>
-            <w:tcBorders>
-              <w:top w:val="single" w:color="BFBFBF" w:sz="4"/>
-              <w:left w:val="single" w:color="BFBFBF" w:sz="4"/>
-              <w:bottom w:val="single" w:color="BFBFBF" w:sz="4"/>
-              <w:right w:val="single" w:color="BFBFBF" w:sz="4"/>
-            </w:tcBorders>
-            <w:tcMar>
-              <w:top w:type="dxa" w:w="60"/>
-              <w:left w:type="dxa" w:w="100"/>
-              <w:bottom w:type="dxa" w:w="60"/>
-              <w:right w:type="dxa" w:w="100"/>
-            </w:tcMar>
-            <w:vAlign w:val="top"/>
-          </w:tcPr>
-          <w:p>
-            <w:pPr>
-              <w:spacing w:after="40"/>
-            </w:pPr>
-            <w:r>
-              <w:rPr>
-                <w:rFonts w:ascii="Calibri" w:cs="Calibri" w:eastAsia="Calibri" w:hAnsi="Calibri"/>
-                <w:b/>
-                <w:bCs/>
-                <w:color w:val="1F1F1F"/>
-                <w:sz w:val="17"/>
-                <w:szCs w:val="17"/>
-              </w:rPr>
-              <w:t xml:space="preserve">Block bootstrap</w:t>
-            </w:r>
-          </w:p>
-        </w:tc>
-        <w:tc>
-          <w:tcPr>
-            <w:tcW w:type="dxa" w:w="2600"/>
-            <w:tcBorders>
-              <w:top w:val="single" w:color="BFBFBF" w:sz="4"/>
-              <w:left w:val="single" w:color="BFBFBF" w:sz="4"/>
-              <w:bottom w:val="single" w:color="BFBFBF" w:sz="4"/>
-              <w:right w:val="single" w:color="BFBFBF" w:sz="4"/>
-            </w:tcBorders>
-            <w:tcMar>
-              <w:top w:type="dxa" w:w="60"/>
-              <w:left w:type="dxa" w:w="100"/>
-              <w:bottom w:type="dxa" w:w="60"/>
-              <w:right w:type="dxa" w:w="100"/>
-            </w:tcMar>
-            <w:vAlign w:val="top"/>
-          </w:tcPr>
-          <w:p>
-            <w:pPr>
-              <w:spacing w:after="40"/>
-            </w:pPr>
-            <w:r>
-              <w:rPr>
-                <w:rFonts w:ascii="Calibri" w:cs="Calibri" w:eastAsia="Calibri" w:hAnsi="Calibri"/>
-                <w:b w:val="false"/>
-                <w:bCs w:val="false"/>
-                <w:color w:val="1F1F1F"/>
-                <w:sz w:val="17"/>
-                <w:szCs w:val="17"/>
-              </w:rPr>
-              <w:t xml:space="preserve">Resample whole weeks many times to see how much a result could vary.</w:t>
-            </w:r>
-          </w:p>
-        </w:tc>
-        <w:tc>
-          <w:tcPr>
-            <w:tcW w:type="dxa" w:w="3500"/>
-            <w:tcBorders>
-              <w:top w:val="single" w:color="BFBFBF" w:sz="4"/>
-              <w:left w:val="single" w:color="BFBFBF" w:sz="4"/>
-              <w:bottom w:val="single" w:color="BFBFBF" w:sz="4"/>
-              <w:right w:val="single" w:color="BFBFBF" w:sz="4"/>
-            </w:tcBorders>
-            <w:tcMar>
-              <w:top w:type="dxa" w:w="60"/>
-              <w:left w:type="dxa" w:w="100"/>
-              <w:bottom w:type="dxa" w:w="60"/>
-              <w:right w:type="dxa" w:w="100"/>
-            </w:tcMar>
-            <w:vAlign w:val="top"/>
-          </w:tcPr>
-          <w:p>
-            <w:pPr>
-              <w:spacing w:after="40"/>
-            </w:pPr>
-            <w:r>
-              <w:rPr>
-                <w:rFonts w:ascii="Calibri" w:cs="Calibri" w:eastAsia="Calibri" w:hAnsi="Calibri"/>
-                <w:b w:val="false"/>
-                <w:bCs w:val="false"/>
-                <w:color w:val="1F1F1F"/>
-                <w:sz w:val="17"/>
-                <w:szCs w:val="17"/>
-              </w:rPr>
-              <w:t xml:space="preserve">2,000 resamples of test weeks (all five rows together) give 95% intervals for AUCs and AUC differences.</w:t>
+              <w:t xml:space="preserve">2,000 resamples of test weeks (all five rows together) give 95% intervals for AUCs and AUC differences. Built from bootstrap sampling and cluster sampling (Unit 04) and confidence intervals (Unit 06). For H1 it replaces the DeLong test planned in M2, which assumes independent rows.</w:t>
             </w:r>
           </w:p>
         </w:tc>
@@ -23805,7 +23452,7 @@
       </w:pPr>
       <w:bookmarkStart w:name="h21" w:id="21"/>
       <w:r>
-        <w:t xml:space="preserve">5.7 Bias and variance</w:t>
+        <w:t xml:space="preserve">5.7 Overfitting and tuning</w:t>
       </w:r>
       <w:bookmarkEnd w:id="21"/>
     </w:p>
@@ -24348,7 +23995,7 @@
                 <w:sz w:val="17"/>
                 <w:szCs w:val="17"/>
               </w:rPr>
-              <w:t xml:space="preserve">Shows the bias–variance trade-off and where the best setting lies.</w:t>
+              <w:t xml:space="preserve">Shows where overfitting begins and where the best setting lies.</w:t>
             </w:r>
           </w:p>
         </w:tc>
@@ -24524,6 +24171,903 @@
         </w:tc>
       </w:tr>
     </w:tbl>
+    <w:p>
+      <w:pPr>
+        <w:pStyle w:val="Heading2"/>
+        <w:keepNext/>
+        <w:spacing w:after="120" w:before="240"/>
+      </w:pPr>
+      <w:bookmarkStart w:name="h22" w:id="22"/>
+      <w:r>
+        <w:t xml:space="preserve">5.8 Methods beyond the lecture slides</w:t>
+      </w:r>
+      <w:bookmarkEnd w:id="22"/>
+    </w:p>
+    <w:p>
+      <w:pPr>
+        <w:spacing w:after="120" w:before="0"/>
+      </w:pPr>
+      <w:r>
+        <w:rPr>
+          <w:rFonts w:ascii="Calibri" w:cs="Calibri" w:eastAsia="Calibri" w:hAnsi="Calibri"/>
+          <w:color w:val="1F1F1F"/>
+          <w:sz w:val="20"/>
+          <w:szCs w:val="20"/>
+        </w:rPr>
+        <w:t xml:space="preserve">Almost everything in Milestone 3 comes from the lecture slides, the syllabus or the rubric. These are the exceptions. Each one is there because the course method alone would have given a wrong or incomplete answer, so be ready to say why in one sentence.</w:t>
+      </w:r>
+    </w:p>
+    <w:tbl>
+      <w:tblPr>
+        <w:tblW w:type="dxa" w:w="9026"/>
+        <w:tblBorders>
+          <w:top w:val="single" w:color="auto" w:sz="4"/>
+          <w:left w:val="single" w:color="auto" w:sz="4"/>
+          <w:bottom w:val="single" w:color="auto" w:sz="4"/>
+          <w:right w:val="single" w:color="auto" w:sz="4"/>
+          <w:insideH w:val="single" w:color="auto" w:sz="4"/>
+          <w:insideV w:val="single" w:color="auto" w:sz="4"/>
+        </w:tblBorders>
+        <w:tblLayout w:type="fixed"/>
+      </w:tblPr>
+      <w:tblGrid>
+        <w:gridCol w:w="2300"/>
+        <w:gridCol w:w="3600"/>
+        <w:gridCol w:w="3126"/>
+      </w:tblGrid>
+      <w:tr>
+        <w:trPr>
+          <w:tblHeader/>
+        </w:trPr>
+        <w:tc>
+          <w:tcPr>
+            <w:tcW w:type="dxa" w:w="2300"/>
+            <w:tcBorders>
+              <w:top w:val="single" w:color="BFBFBF" w:sz="4"/>
+              <w:left w:val="single" w:color="BFBFBF" w:sz="4"/>
+              <w:bottom w:val="single" w:color="BFBFBF" w:sz="4"/>
+              <w:right w:val="single" w:color="BFBFBF" w:sz="4"/>
+            </w:tcBorders>
+            <w:shd w:fill="DCE6F1" w:color="auto" w:val="clear"/>
+            <w:tcMar>
+              <w:top w:type="dxa" w:w="60"/>
+              <w:left w:type="dxa" w:w="100"/>
+              <w:bottom w:type="dxa" w:w="60"/>
+              <w:right w:type="dxa" w:w="100"/>
+            </w:tcMar>
+            <w:vAlign w:val="top"/>
+          </w:tcPr>
+          <w:p>
+            <w:pPr>
+              <w:spacing w:after="40"/>
+            </w:pPr>
+            <w:r>
+              <w:rPr>
+                <w:rFonts w:ascii="Calibri" w:cs="Calibri" w:eastAsia="Calibri" w:hAnsi="Calibri"/>
+                <w:b/>
+                <w:bCs/>
+                <w:color w:val="1F1F1F"/>
+                <w:sz w:val="19"/>
+                <w:szCs w:val="19"/>
+              </w:rPr>
+              <w:t xml:space="preserve">Method</w:t>
+            </w:r>
+          </w:p>
+        </w:tc>
+        <w:tc>
+          <w:tcPr>
+            <w:tcW w:type="dxa" w:w="3600"/>
+            <w:tcBorders>
+              <w:top w:val="single" w:color="BFBFBF" w:sz="4"/>
+              <w:left w:val="single" w:color="BFBFBF" w:sz="4"/>
+              <w:bottom w:val="single" w:color="BFBFBF" w:sz="4"/>
+              <w:right w:val="single" w:color="BFBFBF" w:sz="4"/>
+            </w:tcBorders>
+            <w:shd w:fill="DCE6F1" w:color="auto" w:val="clear"/>
+            <w:tcMar>
+              <w:top w:type="dxa" w:w="60"/>
+              <w:left w:type="dxa" w:w="100"/>
+              <w:bottom w:type="dxa" w:w="60"/>
+              <w:right w:type="dxa" w:w="100"/>
+            </w:tcMar>
+            <w:vAlign w:val="top"/>
+          </w:tcPr>
+          <w:p>
+            <w:pPr>
+              <w:spacing w:after="40"/>
+            </w:pPr>
+            <w:r>
+              <w:rPr>
+                <w:rFonts w:ascii="Calibri" w:cs="Calibri" w:eastAsia="Calibri" w:hAnsi="Calibri"/>
+                <w:b/>
+                <w:bCs/>
+                <w:color w:val="1F1F1F"/>
+                <w:sz w:val="19"/>
+                <w:szCs w:val="19"/>
+              </w:rPr>
+              <w:t xml:space="preserve">Why we needed it</w:t>
+            </w:r>
+          </w:p>
+        </w:tc>
+        <w:tc>
+          <w:tcPr>
+            <w:tcW w:type="dxa" w:w="3126"/>
+            <w:tcBorders>
+              <w:top w:val="single" w:color="BFBFBF" w:sz="4"/>
+              <w:left w:val="single" w:color="BFBFBF" w:sz="4"/>
+              <w:bottom w:val="single" w:color="BFBFBF" w:sz="4"/>
+              <w:right w:val="single" w:color="BFBFBF" w:sz="4"/>
+            </w:tcBorders>
+            <w:shd w:fill="DCE6F1" w:color="auto" w:val="clear"/>
+            <w:tcMar>
+              <w:top w:type="dxa" w:w="60"/>
+              <w:left w:type="dxa" w:w="100"/>
+              <w:bottom w:type="dxa" w:w="60"/>
+              <w:right w:type="dxa" w:w="100"/>
+            </w:tcMar>
+            <w:vAlign w:val="top"/>
+          </w:tcPr>
+          <w:p>
+            <w:pPr>
+              <w:spacing w:after="40"/>
+            </w:pPr>
+            <w:r>
+              <w:rPr>
+                <w:rFonts w:ascii="Calibri" w:cs="Calibri" w:eastAsia="Calibri" w:hAnsi="Calibri"/>
+                <w:b/>
+                <w:bCs/>
+                <w:color w:val="1F1F1F"/>
+                <w:sz w:val="19"/>
+                <w:szCs w:val="19"/>
+              </w:rPr>
+              <w:t xml:space="preserve">One-line explanation</w:t>
+            </w:r>
+          </w:p>
+        </w:tc>
+      </w:tr>
+      <w:tr>
+        <w:tc>
+          <w:tcPr>
+            <w:tcW w:type="dxa" w:w="2300"/>
+            <w:tcBorders>
+              <w:top w:val="single" w:color="BFBFBF" w:sz="4"/>
+              <w:left w:val="single" w:color="BFBFBF" w:sz="4"/>
+              <w:bottom w:val="single" w:color="BFBFBF" w:sz="4"/>
+              <w:right w:val="single" w:color="BFBFBF" w:sz="4"/>
+            </w:tcBorders>
+            <w:tcMar>
+              <w:top w:type="dxa" w:w="60"/>
+              <w:left w:type="dxa" w:w="100"/>
+              <w:bottom w:type="dxa" w:w="60"/>
+              <w:right w:type="dxa" w:w="100"/>
+            </w:tcMar>
+            <w:vAlign w:val="top"/>
+          </w:tcPr>
+          <w:p>
+            <w:pPr>
+              <w:spacing w:after="40"/>
+            </w:pPr>
+            <w:r>
+              <w:rPr>
+                <w:rFonts w:ascii="Calibri" w:cs="Calibri" w:eastAsia="Calibri" w:hAnsi="Calibri"/>
+                <w:b/>
+                <w:bCs/>
+                <w:color w:val="1F1F1F"/>
+                <w:sz w:val="17"/>
+                <w:szCs w:val="17"/>
+              </w:rPr>
+              <w:t xml:space="preserve">Expanding-window cross-validation (new in M3)</w:t>
+            </w:r>
+          </w:p>
+        </w:tc>
+        <w:tc>
+          <w:tcPr>
+            <w:tcW w:type="dxa" w:w="3600"/>
+            <w:tcBorders>
+              <w:top w:val="single" w:color="BFBFBF" w:sz="4"/>
+              <w:left w:val="single" w:color="BFBFBF" w:sz="4"/>
+              <w:bottom w:val="single" w:color="BFBFBF" w:sz="4"/>
+              <w:right w:val="single" w:color="BFBFBF" w:sz="4"/>
+            </w:tcBorders>
+            <w:tcMar>
+              <w:top w:type="dxa" w:w="60"/>
+              <w:left w:type="dxa" w:w="100"/>
+              <w:bottom w:type="dxa" w:w="60"/>
+              <w:right w:type="dxa" w:w="100"/>
+            </w:tcMar>
+            <w:vAlign w:val="top"/>
+          </w:tcPr>
+          <w:p>
+            <w:pPr>
+              <w:spacing w:after="40"/>
+            </w:pPr>
+            <w:r>
+              <w:rPr>
+                <w:rFonts w:ascii="Calibri" w:cs="Calibri" w:eastAsia="Calibri" w:hAnsi="Calibri"/>
+                <w:b w:val="false"/>
+                <w:bCs w:val="false"/>
+                <w:color w:val="1F1F1F"/>
+                <w:sz w:val="17"/>
+                <w:szCs w:val="17"/>
+              </w:rPr>
+              <w:t xml:space="preserve">Shuffled K-fold (Week 7) lets the model learn from the future and from sister rows of the same week; nb03 §5 shows it inflates AUC by 0.05–0.14.</w:t>
+            </w:r>
+          </w:p>
+        </w:tc>
+        <w:tc>
+          <w:tcPr>
+            <w:tcW w:type="dxa" w:w="3126"/>
+            <w:tcBorders>
+              <w:top w:val="single" w:color="BFBFBF" w:sz="4"/>
+              <w:left w:val="single" w:color="BFBFBF" w:sz="4"/>
+              <w:bottom w:val="single" w:color="BFBFBF" w:sz="4"/>
+              <w:right w:val="single" w:color="BFBFBF" w:sz="4"/>
+            </w:tcBorders>
+            <w:tcMar>
+              <w:top w:type="dxa" w:w="60"/>
+              <w:left w:type="dxa" w:w="100"/>
+              <w:bottom w:type="dxa" w:w="60"/>
+              <w:right w:type="dxa" w:w="100"/>
+            </w:tcMar>
+            <w:vAlign w:val="top"/>
+          </w:tcPr>
+          <w:p>
+            <w:pPr>
+              <w:spacing w:after="40"/>
+            </w:pPr>
+            <w:r>
+              <w:rPr>
+                <w:rFonts w:ascii="Calibri" w:cs="Calibri" w:eastAsia="Calibri" w:hAnsi="Calibri"/>
+                <w:b w:val="false"/>
+                <w:bCs w:val="false"/>
+                <w:color w:val="1F1F1F"/>
+                <w:sz w:val="17"/>
+                <w:szCs w:val="17"/>
+              </w:rPr>
+              <w:t xml:space="preserve">Always train on the past and validate on the next year, like a real forecaster.</w:t>
+            </w:r>
+          </w:p>
+        </w:tc>
+      </w:tr>
+      <w:tr>
+        <w:tc>
+          <w:tcPr>
+            <w:tcW w:type="dxa" w:w="2300"/>
+            <w:tcBorders>
+              <w:top w:val="single" w:color="BFBFBF" w:sz="4"/>
+              <w:left w:val="single" w:color="BFBFBF" w:sz="4"/>
+              <w:bottom w:val="single" w:color="BFBFBF" w:sz="4"/>
+              <w:right w:val="single" w:color="BFBFBF" w:sz="4"/>
+            </w:tcBorders>
+            <w:tcMar>
+              <w:top w:type="dxa" w:w="60"/>
+              <w:left w:type="dxa" w:w="100"/>
+              <w:bottom w:type="dxa" w:w="60"/>
+              <w:right w:type="dxa" w:w="100"/>
+            </w:tcMar>
+            <w:vAlign w:val="top"/>
+          </w:tcPr>
+          <w:p>
+            <w:pPr>
+              <w:spacing w:after="40"/>
+            </w:pPr>
+            <w:r>
+              <w:rPr>
+                <w:rFonts w:ascii="Calibri" w:cs="Calibri" w:eastAsia="Calibri" w:hAnsi="Calibri"/>
+                <w:b/>
+                <w:bCs/>
+                <w:color w:val="1F1F1F"/>
+                <w:sz w:val="17"/>
+                <w:szCs w:val="17"/>
+              </w:rPr>
+              <w:t xml:space="preserve">Permutation importance (new in M3)</w:t>
+            </w:r>
+          </w:p>
+        </w:tc>
+        <w:tc>
+          <w:tcPr>
+            <w:tcW w:type="dxa" w:w="3600"/>
+            <w:tcBorders>
+              <w:top w:val="single" w:color="BFBFBF" w:sz="4"/>
+              <w:left w:val="single" w:color="BFBFBF" w:sz="4"/>
+              <w:bottom w:val="single" w:color="BFBFBF" w:sz="4"/>
+              <w:right w:val="single" w:color="BFBFBF" w:sz="4"/>
+            </w:tcBorders>
+            <w:tcMar>
+              <w:top w:type="dxa" w:w="60"/>
+              <w:left w:type="dxa" w:w="100"/>
+              <w:bottom w:type="dxa" w:w="60"/>
+              <w:right w:type="dxa" w:w="100"/>
+            </w:tcMar>
+            <w:vAlign w:val="top"/>
+          </w:tcPr>
+          <w:p>
+            <w:pPr>
+              <w:spacing w:after="40"/>
+            </w:pPr>
+            <w:r>
+              <w:rPr>
+                <w:rFonts w:ascii="Calibri" w:cs="Calibri" w:eastAsia="Calibri" w:hAnsi="Calibri"/>
+                <w:b w:val="false"/>
+                <w:bCs w:val="false"/>
+                <w:color w:val="1F1F1F"/>
+                <w:sz w:val="17"/>
+                <w:szCs w:val="17"/>
+              </w:rPr>
+              <w:t xml:space="preserve">KNN has no coefficients and no Gini importance, but the rubric asks which features drive the models.</w:t>
+            </w:r>
+          </w:p>
+        </w:tc>
+        <w:tc>
+          <w:tcPr>
+            <w:tcW w:type="dxa" w:w="3126"/>
+            <w:tcBorders>
+              <w:top w:val="single" w:color="BFBFBF" w:sz="4"/>
+              <w:left w:val="single" w:color="BFBFBF" w:sz="4"/>
+              <w:bottom w:val="single" w:color="BFBFBF" w:sz="4"/>
+              <w:right w:val="single" w:color="BFBFBF" w:sz="4"/>
+            </w:tcBorders>
+            <w:tcMar>
+              <w:top w:type="dxa" w:w="60"/>
+              <w:left w:type="dxa" w:w="100"/>
+              <w:bottom w:type="dxa" w:w="60"/>
+              <w:right w:type="dxa" w:w="100"/>
+            </w:tcMar>
+            <w:vAlign w:val="top"/>
+          </w:tcPr>
+          <w:p>
+            <w:pPr>
+              <w:spacing w:after="40"/>
+            </w:pPr>
+            <w:r>
+              <w:rPr>
+                <w:rFonts w:ascii="Calibri" w:cs="Calibri" w:eastAsia="Calibri" w:hAnsi="Calibri"/>
+                <w:b w:val="false"/>
+                <w:bCs w:val="false"/>
+                <w:color w:val="1F1F1F"/>
+                <w:sz w:val="17"/>
+                <w:szCs w:val="17"/>
+              </w:rPr>
+              <w:t xml:space="preserve">Shuffle one feature in the validation year; the bigger the drop in AUC, the more the model relied on it.</w:t>
+            </w:r>
+          </w:p>
+        </w:tc>
+      </w:tr>
+      <w:tr>
+        <w:tc>
+          <w:tcPr>
+            <w:tcW w:type="dxa" w:w="2300"/>
+            <w:tcBorders>
+              <w:top w:val="single" w:color="BFBFBF" w:sz="4"/>
+              <w:left w:val="single" w:color="BFBFBF" w:sz="4"/>
+              <w:bottom w:val="single" w:color="BFBFBF" w:sz="4"/>
+              <w:right w:val="single" w:color="BFBFBF" w:sz="4"/>
+            </w:tcBorders>
+            <w:tcMar>
+              <w:top w:type="dxa" w:w="60"/>
+              <w:left w:type="dxa" w:w="100"/>
+              <w:bottom w:type="dxa" w:w="60"/>
+              <w:right w:type="dxa" w:w="100"/>
+            </w:tcMar>
+            <w:vAlign w:val="top"/>
+          </w:tcPr>
+          <w:p>
+            <w:pPr>
+              <w:spacing w:after="40"/>
+            </w:pPr>
+            <w:r>
+              <w:rPr>
+                <w:rFonts w:ascii="Calibri" w:cs="Calibri" w:eastAsia="Calibri" w:hAnsi="Calibri"/>
+                <w:b/>
+                <w:bCs/>
+                <w:color w:val="1F1F1F"/>
+                <w:sz w:val="17"/>
+                <w:szCs w:val="17"/>
+              </w:rPr>
+              <w:t xml:space="preserve">Standard errors clustered by week (new in M3)</w:t>
+            </w:r>
+          </w:p>
+        </w:tc>
+        <w:tc>
+          <w:tcPr>
+            <w:tcW w:type="dxa" w:w="3600"/>
+            <w:tcBorders>
+              <w:top w:val="single" w:color="BFBFBF" w:sz="4"/>
+              <w:left w:val="single" w:color="BFBFBF" w:sz="4"/>
+              <w:bottom w:val="single" w:color="BFBFBF" w:sz="4"/>
+              <w:right w:val="single" w:color="BFBFBF" w:sz="4"/>
+            </w:tcBorders>
+            <w:tcMar>
+              <w:top w:type="dxa" w:w="60"/>
+              <w:left w:type="dxa" w:w="100"/>
+              <w:bottom w:type="dxa" w:w="60"/>
+              <w:right w:type="dxa" w:w="100"/>
+            </w:tcMar>
+            <w:vAlign w:val="top"/>
+          </w:tcPr>
+          <w:p>
+            <w:pPr>
+              <w:spacing w:after="40"/>
+            </w:pPr>
+            <w:r>
+              <w:rPr>
+                <w:rFonts w:ascii="Calibri" w:cs="Calibri" w:eastAsia="Calibri" w:hAnsi="Calibri"/>
+                <w:b w:val="false"/>
+                <w:bCs w:val="false"/>
+                <w:color w:val="1F1F1F"/>
+                <w:sz w:val="17"/>
+                <w:szCs w:val="17"/>
+              </w:rPr>
+              <w:t xml:space="preserve">The five quintile rows of a week share the same signals; treating them as independent overstates the H1 evidence about four-fold (χ² 94 against 22.4).</w:t>
+            </w:r>
+          </w:p>
+        </w:tc>
+        <w:tc>
+          <w:tcPr>
+            <w:tcW w:type="dxa" w:w="3126"/>
+            <w:tcBorders>
+              <w:top w:val="single" w:color="BFBFBF" w:sz="4"/>
+              <w:left w:val="single" w:color="BFBFBF" w:sz="4"/>
+              <w:bottom w:val="single" w:color="BFBFBF" w:sz="4"/>
+              <w:right w:val="single" w:color="BFBFBF" w:sz="4"/>
+            </w:tcBorders>
+            <w:tcMar>
+              <w:top w:type="dxa" w:w="60"/>
+              <w:left w:type="dxa" w:w="100"/>
+              <w:bottom w:type="dxa" w:w="60"/>
+              <w:right w:type="dxa" w:w="100"/>
+            </w:tcMar>
+            <w:vAlign w:val="top"/>
+          </w:tcPr>
+          <w:p>
+            <w:pPr>
+              <w:spacing w:after="40"/>
+            </w:pPr>
+            <w:r>
+              <w:rPr>
+                <w:rFonts w:ascii="Calibri" w:cs="Calibri" w:eastAsia="Calibri" w:hAnsi="Calibri"/>
+                <w:b w:val="false"/>
+                <w:bCs w:val="false"/>
+                <w:color w:val="1F1F1F"/>
+                <w:sz w:val="17"/>
+                <w:szCs w:val="17"/>
+              </w:rPr>
+              <w:t xml:space="preserve">Count each week as one block of evidence, not five rows.</w:t>
+            </w:r>
+          </w:p>
+        </w:tc>
+      </w:tr>
+      <w:tr>
+        <w:tc>
+          <w:tcPr>
+            <w:tcW w:type="dxa" w:w="2300"/>
+            <w:tcBorders>
+              <w:top w:val="single" w:color="BFBFBF" w:sz="4"/>
+              <w:left w:val="single" w:color="BFBFBF" w:sz="4"/>
+              <w:bottom w:val="single" w:color="BFBFBF" w:sz="4"/>
+              <w:right w:val="single" w:color="BFBFBF" w:sz="4"/>
+            </w:tcBorders>
+            <w:tcMar>
+              <w:top w:type="dxa" w:w="60"/>
+              <w:left w:type="dxa" w:w="100"/>
+              <w:bottom w:type="dxa" w:w="60"/>
+              <w:right w:type="dxa" w:w="100"/>
+            </w:tcMar>
+            <w:vAlign w:val="top"/>
+          </w:tcPr>
+          <w:p>
+            <w:pPr>
+              <w:spacing w:after="40"/>
+            </w:pPr>
+            <w:r>
+              <w:rPr>
+                <w:rFonts w:ascii="Calibri" w:cs="Calibri" w:eastAsia="Calibri" w:hAnsi="Calibri"/>
+                <w:b/>
+                <w:bCs/>
+                <w:color w:val="1F1F1F"/>
+                <w:sz w:val="17"/>
+                <w:szCs w:val="17"/>
+              </w:rPr>
+              <w:t xml:space="preserve">Logit likelihood-ratio test (from the M2 plan)</w:t>
+            </w:r>
+          </w:p>
+        </w:tc>
+        <w:tc>
+          <w:tcPr>
+            <w:tcW w:type="dxa" w:w="3600"/>
+            <w:tcBorders>
+              <w:top w:val="single" w:color="BFBFBF" w:sz="4"/>
+              <w:left w:val="single" w:color="BFBFBF" w:sz="4"/>
+              <w:bottom w:val="single" w:color="BFBFBF" w:sz="4"/>
+              <w:right w:val="single" w:color="BFBFBF" w:sz="4"/>
+            </w:tcBorders>
+            <w:tcMar>
+              <w:top w:type="dxa" w:w="60"/>
+              <w:left w:type="dxa" w:w="100"/>
+              <w:bottom w:type="dxa" w:w="60"/>
+              <w:right w:type="dxa" w:w="100"/>
+            </w:tcMar>
+            <w:vAlign w:val="top"/>
+          </w:tcPr>
+          <w:p>
+            <w:pPr>
+              <w:spacing w:after="40"/>
+            </w:pPr>
+            <w:r>
+              <w:rPr>
+                <w:rFonts w:ascii="Calibri" w:cs="Calibri" w:eastAsia="Calibri" w:hAnsi="Calibri"/>
+                <w:b w:val="false"/>
+                <w:bCs w:val="false"/>
+                <w:color w:val="1F1F1F"/>
+                <w:sz w:val="17"/>
+                <w:szCs w:val="17"/>
+              </w:rPr>
+              <w:t xml:space="preserve">H1 compares a model with and without the six signals.</w:t>
+            </w:r>
+          </w:p>
+        </w:tc>
+        <w:tc>
+          <w:tcPr>
+            <w:tcW w:type="dxa" w:w="3126"/>
+            <w:tcBorders>
+              <w:top w:val="single" w:color="BFBFBF" w:sz="4"/>
+              <w:left w:val="single" w:color="BFBFBF" w:sz="4"/>
+              <w:bottom w:val="single" w:color="BFBFBF" w:sz="4"/>
+              <w:right w:val="single" w:color="BFBFBF" w:sz="4"/>
+            </w:tcBorders>
+            <w:tcMar>
+              <w:top w:type="dxa" w:w="60"/>
+              <w:left w:type="dxa" w:w="100"/>
+              <w:bottom w:type="dxa" w:w="60"/>
+              <w:right w:type="dxa" w:w="100"/>
+            </w:tcMar>
+            <w:vAlign w:val="top"/>
+          </w:tcPr>
+          <w:p>
+            <w:pPr>
+              <w:spacing w:after="40"/>
+            </w:pPr>
+            <w:r>
+              <w:rPr>
+                <w:rFonts w:ascii="Calibri" w:cs="Calibri" w:eastAsia="Calibri" w:hAnsi="Calibri"/>
+                <w:b w:val="false"/>
+                <w:bCs w:val="false"/>
+                <w:color w:val="1F1F1F"/>
+                <w:sz w:val="17"/>
+                <w:szCs w:val="17"/>
+              </w:rPr>
+              <w:t xml:space="preserve">Twice the gain in log-likelihood, compared with a chi-square distribution.</w:t>
+            </w:r>
+          </w:p>
+        </w:tc>
+      </w:tr>
+      <w:tr>
+        <w:tc>
+          <w:tcPr>
+            <w:tcW w:type="dxa" w:w="2300"/>
+            <w:tcBorders>
+              <w:top w:val="single" w:color="BFBFBF" w:sz="4"/>
+              <w:left w:val="single" w:color="BFBFBF" w:sz="4"/>
+              <w:bottom w:val="single" w:color="BFBFBF" w:sz="4"/>
+              <w:right w:val="single" w:color="BFBFBF" w:sz="4"/>
+            </w:tcBorders>
+            <w:tcMar>
+              <w:top w:type="dxa" w:w="60"/>
+              <w:left w:type="dxa" w:w="100"/>
+              <w:bottom w:type="dxa" w:w="60"/>
+              <w:right w:type="dxa" w:w="100"/>
+            </w:tcMar>
+            <w:vAlign w:val="top"/>
+          </w:tcPr>
+          <w:p>
+            <w:pPr>
+              <w:spacing w:after="40"/>
+            </w:pPr>
+            <w:r>
+              <w:rPr>
+                <w:rFonts w:ascii="Calibri" w:cs="Calibri" w:eastAsia="Calibri" w:hAnsi="Calibri"/>
+                <w:b/>
+                <w:bCs/>
+                <w:color w:val="1F1F1F"/>
+                <w:sz w:val="17"/>
+                <w:szCs w:val="17"/>
+              </w:rPr>
+              <w:t xml:space="preserve">OLS with Newey–West (HAC) errors (from the M2 plan)</w:t>
+            </w:r>
+          </w:p>
+        </w:tc>
+        <w:tc>
+          <w:tcPr>
+            <w:tcW w:type="dxa" w:w="3600"/>
+            <w:tcBorders>
+              <w:top w:val="single" w:color="BFBFBF" w:sz="4"/>
+              <w:left w:val="single" w:color="BFBFBF" w:sz="4"/>
+              <w:bottom w:val="single" w:color="BFBFBF" w:sz="4"/>
+              <w:right w:val="single" w:color="BFBFBF" w:sz="4"/>
+            </w:tcBorders>
+            <w:tcMar>
+              <w:top w:type="dxa" w:w="60"/>
+              <w:left w:type="dxa" w:w="100"/>
+              <w:bottom w:type="dxa" w:w="60"/>
+              <w:right w:type="dxa" w:w="100"/>
+            </w:tcMar>
+            <w:vAlign w:val="top"/>
+          </w:tcPr>
+          <w:p>
+            <w:pPr>
+              <w:spacing w:after="40"/>
+            </w:pPr>
+            <w:r>
+              <w:rPr>
+                <w:rFonts w:ascii="Calibri" w:cs="Calibri" w:eastAsia="Calibri" w:hAnsi="Calibri"/>
+                <w:b w:val="false"/>
+                <w:bCs w:val="false"/>
+                <w:color w:val="1F1F1F"/>
+                <w:sz w:val="17"/>
+                <w:szCs w:val="17"/>
+              </w:rPr>
+              <w:t xml:space="preserve">H2 and H3 are regressions on weekly data, and errors in nearby weeks are correlated (overlapping 8-week windows).</w:t>
+            </w:r>
+          </w:p>
+        </w:tc>
+        <w:tc>
+          <w:tcPr>
+            <w:tcW w:type="dxa" w:w="3126"/>
+            <w:tcBorders>
+              <w:top w:val="single" w:color="BFBFBF" w:sz="4"/>
+              <w:left w:val="single" w:color="BFBFBF" w:sz="4"/>
+              <w:bottom w:val="single" w:color="BFBFBF" w:sz="4"/>
+              <w:right w:val="single" w:color="BFBFBF" w:sz="4"/>
+            </w:tcBorders>
+            <w:tcMar>
+              <w:top w:type="dxa" w:w="60"/>
+              <w:left w:type="dxa" w:w="100"/>
+              <w:bottom w:type="dxa" w:w="60"/>
+              <w:right w:type="dxa" w:w="100"/>
+            </w:tcMar>
+            <w:vAlign w:val="top"/>
+          </w:tcPr>
+          <w:p>
+            <w:pPr>
+              <w:spacing w:after="40"/>
+            </w:pPr>
+            <w:r>
+              <w:rPr>
+                <w:rFonts w:ascii="Calibri" w:cs="Calibri" w:eastAsia="Calibri" w:hAnsi="Calibri"/>
+                <w:b w:val="false"/>
+                <w:bCs w:val="false"/>
+                <w:color w:val="1F1F1F"/>
+                <w:sz w:val="17"/>
+                <w:szCs w:val="17"/>
+              </w:rPr>
+              <w:t xml:space="preserve">Regression is Week 10; HAC widens the standard errors so the p-values are not too optimistic.</w:t>
+            </w:r>
+          </w:p>
+        </w:tc>
+      </w:tr>
+      <w:tr>
+        <w:tc>
+          <w:tcPr>
+            <w:tcW w:type="dxa" w:w="2300"/>
+            <w:tcBorders>
+              <w:top w:val="single" w:color="BFBFBF" w:sz="4"/>
+              <w:left w:val="single" w:color="BFBFBF" w:sz="4"/>
+              <w:bottom w:val="single" w:color="BFBFBF" w:sz="4"/>
+              <w:right w:val="single" w:color="BFBFBF" w:sz="4"/>
+            </w:tcBorders>
+            <w:tcMar>
+              <w:top w:type="dxa" w:w="60"/>
+              <w:left w:type="dxa" w:w="100"/>
+              <w:bottom w:type="dxa" w:w="60"/>
+              <w:right w:type="dxa" w:w="100"/>
+            </w:tcMar>
+            <w:vAlign w:val="top"/>
+          </w:tcPr>
+          <w:p>
+            <w:pPr>
+              <w:spacing w:after="40"/>
+            </w:pPr>
+            <w:r>
+              <w:rPr>
+                <w:rFonts w:ascii="Calibri" w:cs="Calibri" w:eastAsia="Calibri" w:hAnsi="Calibri"/>
+                <w:b/>
+                <w:bCs/>
+                <w:color w:val="1F1F1F"/>
+                <w:sz w:val="17"/>
+                <w:szCs w:val="17"/>
+              </w:rPr>
+              <w:t xml:space="preserve">Brier score (from the M2 plan)</w:t>
+            </w:r>
+          </w:p>
+        </w:tc>
+        <w:tc>
+          <w:tcPr>
+            <w:tcW w:type="dxa" w:w="3600"/>
+            <w:tcBorders>
+              <w:top w:val="single" w:color="BFBFBF" w:sz="4"/>
+              <w:left w:val="single" w:color="BFBFBF" w:sz="4"/>
+              <w:bottom w:val="single" w:color="BFBFBF" w:sz="4"/>
+              <w:right w:val="single" w:color="BFBFBF" w:sz="4"/>
+            </w:tcBorders>
+            <w:tcMar>
+              <w:top w:type="dxa" w:w="60"/>
+              <w:left w:type="dxa" w:w="100"/>
+              <w:bottom w:type="dxa" w:w="60"/>
+              <w:right w:type="dxa" w:w="100"/>
+            </w:tcMar>
+            <w:vAlign w:val="top"/>
+          </w:tcPr>
+          <w:p>
+            <w:pPr>
+              <w:spacing w:after="40"/>
+            </w:pPr>
+            <w:r>
+              <w:rPr>
+                <w:rFonts w:ascii="Calibri" w:cs="Calibri" w:eastAsia="Calibri" w:hAnsi="Calibri"/>
+                <w:b w:val="false"/>
+                <w:bCs w:val="false"/>
+                <w:color w:val="1F1F1F"/>
+                <w:sz w:val="17"/>
+                <w:szCs w:val="17"/>
+              </w:rPr>
+              <w:t xml:space="preserve">It is the loss in the fairness hypothesis H5; in M3 it shows that LR's probabilities are not calibrated.</w:t>
+            </w:r>
+          </w:p>
+        </w:tc>
+        <w:tc>
+          <w:tcPr>
+            <w:tcW w:type="dxa" w:w="3126"/>
+            <w:tcBorders>
+              <w:top w:val="single" w:color="BFBFBF" w:sz="4"/>
+              <w:left w:val="single" w:color="BFBFBF" w:sz="4"/>
+              <w:bottom w:val="single" w:color="BFBFBF" w:sz="4"/>
+              <w:right w:val="single" w:color="BFBFBF" w:sz="4"/>
+            </w:tcBorders>
+            <w:tcMar>
+              <w:top w:type="dxa" w:w="60"/>
+              <w:left w:type="dxa" w:w="100"/>
+              <w:bottom w:type="dxa" w:w="60"/>
+              <w:right w:type="dxa" w:w="100"/>
+            </w:tcMar>
+            <w:vAlign w:val="top"/>
+          </w:tcPr>
+          <w:p>
+            <w:pPr>
+              <w:spacing w:after="40"/>
+            </w:pPr>
+            <w:r>
+              <w:rPr>
+                <w:rFonts w:ascii="Calibri" w:cs="Calibri" w:eastAsia="Calibri" w:hAnsi="Calibri"/>
+                <w:b w:val="false"/>
+                <w:bCs w:val="false"/>
+                <w:color w:val="1F1F1F"/>
+                <w:sz w:val="17"/>
+                <w:szCs w:val="17"/>
+              </w:rPr>
+              <w:t xml:space="preserve">Mean squared error of the predicted probabilities.</w:t>
+            </w:r>
+          </w:p>
+        </w:tc>
+      </w:tr>
+      <w:tr>
+        <w:tc>
+          <w:tcPr>
+            <w:tcW w:type="dxa" w:w="2300"/>
+            <w:tcBorders>
+              <w:top w:val="single" w:color="BFBFBF" w:sz="4"/>
+              <w:left w:val="single" w:color="BFBFBF" w:sz="4"/>
+              <w:bottom w:val="single" w:color="BFBFBF" w:sz="4"/>
+              <w:right w:val="single" w:color="BFBFBF" w:sz="4"/>
+            </w:tcBorders>
+            <w:tcMar>
+              <w:top w:type="dxa" w:w="60"/>
+              <w:left w:type="dxa" w:w="100"/>
+              <w:bottom w:type="dxa" w:w="60"/>
+              <w:right w:type="dxa" w:w="100"/>
+            </w:tcMar>
+            <w:vAlign w:val="top"/>
+          </w:tcPr>
+          <w:p>
+            <w:pPr>
+              <w:spacing w:after="40"/>
+            </w:pPr>
+            <w:r>
+              <w:rPr>
+                <w:rFonts w:ascii="Calibri" w:cs="Calibri" w:eastAsia="Calibri" w:hAnsi="Calibri"/>
+                <w:b/>
+                <w:bCs/>
+                <w:color w:val="1F1F1F"/>
+                <w:sz w:val="17"/>
+                <w:szCs w:val="17"/>
+              </w:rPr>
+              <w:t xml:space="preserve">Diebold–Mariano test (M4 plan only, from M2)</w:t>
+            </w:r>
+          </w:p>
+        </w:tc>
+        <w:tc>
+          <w:tcPr>
+            <w:tcW w:type="dxa" w:w="3600"/>
+            <w:tcBorders>
+              <w:top w:val="single" w:color="BFBFBF" w:sz="4"/>
+              <w:left w:val="single" w:color="BFBFBF" w:sz="4"/>
+              <w:bottom w:val="single" w:color="BFBFBF" w:sz="4"/>
+              <w:right w:val="single" w:color="BFBFBF" w:sz="4"/>
+            </w:tcBorders>
+            <w:tcMar>
+              <w:top w:type="dxa" w:w="60"/>
+              <w:left w:type="dxa" w:w="100"/>
+              <w:bottom w:type="dxa" w:w="60"/>
+              <w:right w:type="dxa" w:w="100"/>
+            </w:tcMar>
+            <w:vAlign w:val="top"/>
+          </w:tcPr>
+          <w:p>
+            <w:pPr>
+              <w:spacing w:after="40"/>
+            </w:pPr>
+            <w:r>
+              <w:rPr>
+                <w:rFonts w:ascii="Calibri" w:cs="Calibri" w:eastAsia="Calibri" w:hAnsi="Calibri"/>
+                <w:b w:val="false"/>
+                <w:bCs w:val="false"/>
+                <w:color w:val="1F1F1F"/>
+                <w:sz w:val="17"/>
+                <w:szCs w:val="17"/>
+              </w:rPr>
+              <w:t xml:space="preserve">It will test H5 (are Q1's forecast errors larger than Q5's?) in Milestone 4.</w:t>
+            </w:r>
+          </w:p>
+        </w:tc>
+        <w:tc>
+          <w:tcPr>
+            <w:tcW w:type="dxa" w:w="3126"/>
+            <w:tcBorders>
+              <w:top w:val="single" w:color="BFBFBF" w:sz="4"/>
+              <w:left w:val="single" w:color="BFBFBF" w:sz="4"/>
+              <w:bottom w:val="single" w:color="BFBFBF" w:sz="4"/>
+              <w:right w:val="single" w:color="BFBFBF" w:sz="4"/>
+            </w:tcBorders>
+            <w:tcMar>
+              <w:top w:type="dxa" w:w="60"/>
+              <w:left w:type="dxa" w:w="100"/>
+              <w:bottom w:type="dxa" w:w="60"/>
+              <w:right w:type="dxa" w:w="100"/>
+            </w:tcMar>
+            <w:vAlign w:val="top"/>
+          </w:tcPr>
+          <w:p>
+            <w:pPr>
+              <w:spacing w:after="40"/>
+            </w:pPr>
+            <w:r>
+              <w:rPr>
+                <w:rFonts w:ascii="Calibri" w:cs="Calibri" w:eastAsia="Calibri" w:hAnsi="Calibri"/>
+                <w:b w:val="false"/>
+                <w:bCs w:val="false"/>
+                <w:color w:val="1F1F1F"/>
+                <w:sz w:val="17"/>
+                <w:szCs w:val="17"/>
+              </w:rPr>
+              <w:t xml:space="preserve">A t-test on the weekly difference between two groups' losses, with standard errors that allow for autocorrelation.</w:t>
+            </w:r>
+          </w:p>
+        </w:tc>
+      </w:tr>
+    </w:tbl>
+    <w:p>
+      <w:pPr>
+        <w:spacing w:after="120" w:before="80"/>
+      </w:pPr>
+      <w:r>
+        <w:rPr>
+          <w:rFonts w:ascii="Calibri" w:cs="Calibri" w:eastAsia="Calibri" w:hAnsi="Calibri"/>
+          <w:color w:val="1F1F1F"/>
+          <w:sz w:val="20"/>
+          <w:szCs w:val="20"/>
+        </w:rPr>
+        <w:t xml:space="preserve">Dropped in this version: the DeLong test planned in M2 (replaced by the week-block bootstrap, which is built from bootstrap and cluster sampling in Unit 04).</w:t>
+      </w:r>
+    </w:p>
     <w:p>
       <w:r>
         <w:br w:type="page"/>
@@ -24535,11 +25079,11 @@
         <w:keepNext w:val="false"/>
         <w:spacing w:after="160" w:before="240"/>
       </w:pPr>
-      <w:bookmarkStart w:name="h22" w:id="22"/>
+      <w:bookmarkStart w:name="h23" w:id="23"/>
       <w:r>
         <w:t xml:space="preserve">6. Decisions made in Milestone 3 (for the viva)</w:t>
       </w:r>
-      <w:bookmarkEnd w:id="22"/>
+      <w:bookmarkEnd w:id="23"/>
     </w:p>
     <w:p>
       <w:pPr>
@@ -26176,7 +26720,7 @@
                 <w:sz w:val="19"/>
                 <w:szCs w:val="19"/>
               </w:rPr>
-              <w:t xml:space="preserve">ROC-AUC is threshold-free and unaffected by the shock rate, and it is the metric of hypothesis H1. Pooling matters: an unweighted LR scored 0.65 averaged over folds but only 0.53 pooled, because its probability level followed each fold's base rate. The majority class shows the same effect (0.5 per fold, 0.467 pooled). Mean ± SD of per-fold AUCs is still reported for the rubric's 'variance across folds'. Caveat found in the audit: pooled AUC also rewards telling crisis years from calm ones. An oracle that knows only each validation year's realised shock rate (constant within the year) scores 0.640 pooled. Within years (mean fold AUC) the order is KNN 0.672 &gt; LR 0.651 &gt; tree 0.578 ≈ persistence 0.569, and that is the order the test reproduced. We kept the planned rule, because switching after seeing the test would leak test information into model choice; M4 reports both.</w:t>
+              <w:t xml:space="preserve">ROC-AUC is threshold-free and unaffected by the shock rate, and it is the metric of hypothesis H1. Pooling matters: an unweighted LR scored 0.65 averaged over folds but only 0.53 pooled, because its probability level followed each fold's base rate. The majority class shows the same effect (0.5 per fold, 0.467 pooled). Mean ± SD of per-fold AUCs is still reported for the rubric's 'variance across folds'. Caveat found in the audit: pooled AUC also rewards telling crisis years from calm ones. The tree's pooled AUC (0.652) beats three of its four yearly AUCs (0.49–0.67), which can only come from differences between years. Within years (mean fold AUC) the order is KNN 0.672 &gt; LR 0.651 &gt; tree 0.578 ≈ persistence 0.569, and that is the order the test reproduced. We kept the planned rule, because switching after seeing the test would leak test information into model choice; M4 reports both.</w:t>
             </w:r>
           </w:p>
         </w:tc>
@@ -26841,7 +27385,7 @@
                 <w:sz w:val="19"/>
                 <w:szCs w:val="19"/>
               </w:rPr>
-              <w:t xml:space="preserve">Evidence: a Q1 shock is not given back (8 weeks later Q1 prices are 4.2% above the pre-shock week, against 1.9% around an ordinary week, and after the shock they keep rising at the usual pace, 2.1% vs 2.0%), a typical shock is up to Rs 355/month at the Q1 ceiling (≈ 8% of the Rs 4,500/month Kafaalat value), coping is irreversible, and FAO found ≈ US$7 return per US$1 of early action. A false alarm is a transfer to poor households, not a pure loss, so 5:1 sits between parity and 7:1. Thresholds are chosen on 2021–24 out-of-fold predictions (not the test): LR 0.50, KNN 0.12, tree 0.16. The Bayes rule 1/6 is quoted for comparison but needs calibrated probabilities.</w:t>
+              <w:t xml:space="preserve">Evidence: a Q1 shock is not given back (8 weeks later Q1 prices are 4.2% above the pre-shock week, against 1.9% around an ordinary week, and after the shock they keep rising at the usual pace, 2.1% vs 2.0%), a typical shock is up to Rs 355/month at the Q1 ceiling (≈ 8% of the Rs 4,500/month Kafaalat value), coping is irreversible, and FAO found ≈ US$7 return per US$1 of early action. A false alarm is a transfer to poor households, not a pure loss, so 5:1 sits between parity and 7:1. Thresholds are chosen on 2021–24 out-of-fold predictions (not the test): LR 0.50, KNN 0.12, tree 0.16.</w:t>
             </w:r>
           </w:p>
         </w:tc>
@@ -28180,7 +28724,7 @@
                 <w:sz w:val="19"/>
                 <w:szCs w:val="19"/>
               </w:rPr>
-              <w:t xml:space="preserve">LR C was extended down to 10^−4; the curve is flat for C ≤ 0.01 (all within 0.013), so the edge choice is a plateau, not a missed optimum. KNN k stops at 250 because the smallest training fold has about 310 rows. Tree leaf size extended to 160. The saga solver supports L1 and L2 and, unlike liblinear, does not penalise the intercept (a penalised intercept pushed every probability towards 0.5 in an early trial).</w:t>
+              <w:t xml:space="preserve">LR C was extended down to 10^−4; the curve is flat for C ≤ 0.01 (all within 0.013), so the edge choice is a plateau, not a missed optimum. KNN k stops at 250 because the smallest training fold has about 310 rows. Tree leaf size extended to 160. The saga solver is used because it fits both the L1 and the L2 penalty of the grid.</w:t>
             </w:r>
           </w:p>
         </w:tc>
@@ -28672,7 +29216,7 @@
           <w:sz w:val="22"/>
           <w:szCs w:val="22"/>
         </w:rPr>
-        <w:t xml:space="preserve">B13 · H1: week-clustered Wald test in sample; DeLong and week-block bootstrap out of sample</w:t>
+        <w:t xml:space="preserve">B13 · H1: week-clustered Wald test in sample; week-block bootstrap out of sample (replacing the DeLong test)</w:t>
       </w:r>
     </w:p>
     <w:tbl>
@@ -28827,7 +29371,7 @@
                 <w:sz w:val="19"/>
                 <w:szCs w:val="19"/>
               </w:rPr>
-              <w:t xml:space="preserve">Plain LR test χ²(6) = 94 vs clustered Wald χ²(6) = 22.4 (p = 0.001): clustering cuts the evidence about four-fold but H0 is still rejected in sample. Out of sample, DeLong (promised in M2) gives p = 0.42; because DeLong also assumes independent rows, the week-block bootstrap is the robustness check (gain −0.08 to +0.10).</w:t>
+              <w:t xml:space="preserve">Plain LR test χ²(6) = 94 vs clustered Wald χ²(6) = 22.4 (p = 0.001): clustering cuts the evidence about four-fold but H0 is still rejected in sample. Out of sample, M2 had planned the DeLong test, but DeLong also assumes independent rows. We resample whole test weeks instead (bootstrap and cluster sampling, Unit 04): the 95% interval for the AUC gain is −0.08 to +0.10, and 45% of resamples show no gain (p = 0.45).</w:t>
             </w:r>
           </w:p>
         </w:tc>
@@ -28896,7 +29440,7 @@
                 <w:sz w:val="19"/>
                 <w:szCs w:val="19"/>
               </w:rPr>
-              <w:t xml:space="preserve">Only the plain LR test (overstates evidence).</w:t>
+              <w:t xml:space="preserve">Only the plain LR test (overstates evidence); the DeLong test (assumes independent rows and is hard to check by hand).</w:t>
             </w:r>
           </w:p>
         </w:tc>
@@ -28975,24 +29519,6 @@
                 <w:szCs w:val="17"/>
               </w:rPr>
               <w:t xml:space="preserve">fit_logit()</w:t>
-            </w:r>
-            <w:r>
-              <w:rPr>
-                <w:rFonts w:ascii="Calibri" w:cs="Calibri" w:eastAsia="Calibri" w:hAnsi="Calibri"/>
-                <w:color w:val="1F1F1F"/>
-                <w:sz w:val="19"/>
-                <w:szCs w:val="19"/>
-              </w:rPr>
-              <w:t xml:space="preserve">, </w:t>
-            </w:r>
-            <w:r>
-              <w:rPr>
-                <w:rFonts w:ascii="Consolas" w:cs="Consolas" w:eastAsia="Consolas" w:hAnsi="Consolas"/>
-                <w:color w:val="1F1F1F"/>
-                <w:sz w:val="17"/>
-                <w:szCs w:val="17"/>
-              </w:rPr>
-              <w:t xml:space="preserve">delong_test()</w:t>
             </w:r>
             <w:r>
               <w:rPr>
@@ -29829,7 +30355,7 @@
                 <w:sz w:val="19"/>
                 <w:szCs w:val="19"/>
               </w:rPr>
-              <w:t xml:space="preserve">All tuning, thresholds and the cost ratio come from 2019–24 data; the cost evidence also uses training weeks only. The calm test period (prior shift) is a real finding: thresholds learned in crisis years over-alert in calm years. Adjusting thresholds to the test would be leakage.</w:t>
+              <w:t xml:space="preserve">All tuning, thresholds and the cost ratio come from 2019–24 data; the cost evidence also uses training weeks only. The calm test period (the shock rate halved) is a real finding: thresholds learned in crisis years over-alert in calm years. Adjusting thresholds to the test would be leakage.</w:t>
             </w:r>
           </w:p>
         </w:tc>
@@ -30931,11 +31457,11 @@
         <w:keepNext w:val="false"/>
         <w:spacing w:after="160" w:before="240"/>
       </w:pPr>
-      <w:bookmarkStart w:name="h23" w:id="23"/>
+      <w:bookmarkStart w:name="h24" w:id="24"/>
       <w:r>
         <w:t xml:space="preserve">7. Key numbers cheat sheet</w:t>
       </w:r>
-      <w:bookmarkEnd w:id="23"/>
+      <w:bookmarkEnd w:id="24"/>
     </w:p>
     <w:tbl>
       <w:tblPr>
@@ -32180,7 +32706,7 @@
                 <w:sz w:val="18"/>
                 <w:szCs w:val="18"/>
               </w:rPr>
-              <w:t xml:space="preserve">Regime tracking (CV)</w:t>
+              <w:t xml:space="preserve">Within-year AUC (CV)</w:t>
             </w:r>
           </w:p>
         </w:tc>
@@ -32214,7 +32740,7 @@
                 <w:sz w:val="18"/>
                 <w:szCs w:val="18"/>
               </w:rPr>
-              <w:t xml:space="preserve">year-level oracle pooled AUC 0.640; within-year (mean fold) AUC: KNN 0.672, LR 0.651, tree 0.578, persistence 0.569</w:t>
+              <w:t xml:space="preserve">mean fold AUC: KNN 0.672, LR 0.651, tree 0.578, persistence 0.569 (pooled favours the tree: 0.652)</w:t>
             </w:r>
           </w:p>
         </w:tc>
@@ -32424,7 +32950,7 @@
                 <w:sz w:val="18"/>
                 <w:szCs w:val="18"/>
               </w:rPr>
-              <w:t xml:space="preserve">in sample Wald χ²(6) = 22.4, p = 0.001 (LR χ² = 94); test AUC 0.554 → 0.561, DeLong p = 0.42</w:t>
+              <w:t xml:space="preserve">in sample Wald χ²(6) = 22.4, p = 0.001 (LR χ² = 94); test AUC 0.554 → 0.561, week-block bootstrap 95% CI −0.08 to +0.10, p = 0.45</w:t>
             </w:r>
           </w:p>
         </w:tc>
@@ -32581,11 +33107,11 @@
         <w:keepNext w:val="false"/>
         <w:spacing w:after="160" w:before="240"/>
       </w:pPr>
-      <w:bookmarkStart w:name="h24" w:id="24"/>
+      <w:bookmarkStart w:name="h25" w:id="25"/>
       <w:r>
         <w:t xml:space="preserve">8. Likely viva questions with short answers</w:t>
       </w:r>
-      <w:bookmarkEnd w:id="24"/>
+      <w:bookmarkEnd w:id="25"/>
     </w:p>
     <w:tbl>
       <w:tblPr>
@@ -33112,7 +33638,7 @@
                 <w:sz w:val="18"/>
                 <w:szCs w:val="18"/>
               </w:rPr>
-              <w:t xml:space="preserve">One AUC over the out-of-fold predictions of all four years together. Because the system uses one threshold for all years, probabilities must mean the same in every year; pooled AUC checks that, the per-fold average does not. Its weakness: it also rewards telling crisis years from calm ones (a year-level oracle scores 0.640).</w:t>
+              <w:t xml:space="preserve">One AUC over the out-of-fold predictions of all four years together. Because the system uses one threshold for all years, probabilities must mean the same in every year; pooled AUC checks that, the per-fold average does not. Its weakness: it also rewards telling crisis years from calm ones (the tree's pooled AUC beats three of its four yearly AUCs).</w:t>
             </w:r>
           </w:p>
         </w:tc>
@@ -33769,7 +34295,7 @@
                 <w:sz w:val="18"/>
                 <w:szCs w:val="18"/>
               </w:rPr>
-              <w:t xml:space="preserve">Prior shift: the shock rate halved. Thresholds learned when shocks were common over-alert when they are rare. The ranking still works (KNN AUC 0.68), so recalibration/retraining (M4–M5) is the fix. (At 5:1. At 20:1 the models do beat never-alert, but only by alerting almost every week, i.e. by matching the always-alert policy.)</w:t>
+              <w:t xml:space="preserve">The shock rate halved. Thresholds learned when shocks were common over-alert when they are rare. The ranking still works (KNN AUC 0.68), so recalibration/retraining (M4–M5) is the fix. (At 5:1. At 20:1 the models do beat never-alert, but only by alerting almost every week, i.e. by matching the always-alert policy.)</w:t>
             </w:r>
           </w:p>
         </w:tc>
@@ -34134,7 +34660,7 @@
                 <w:sz w:val="18"/>
                 <w:szCs w:val="18"/>
               </w:rPr>
-              <w:t xml:space="preserve">In sample yes (clustered Wald p = 0.001). Out of sample in 2025–26 no (DeLong p = 0.42). The early warning works in turbulent periods but not in a calm one.</w:t>
+              <w:t xml:space="preserve">In sample yes (clustered Wald p = 0.001). Out of sample in 2025–26 no (week-block bootstrap p = 0.45). The early warning works in turbulent periods but not in a calm one.</w:t>
             </w:r>
           </w:p>
         </w:tc>
@@ -34173,7 +34699,7 @@
                 <w:sz w:val="18"/>
                 <w:szCs w:val="18"/>
               </w:rPr>
-              <w:t xml:space="preserve">Why cluster standard errors by week?</w:t>
+              <w:t xml:space="preserve">M2 promised a DeLong test for H1. Why did you use a bootstrap?</w:t>
             </w:r>
           </w:p>
         </w:tc>
@@ -34207,7 +34733,7 @@
                 <w:sz w:val="18"/>
                 <w:szCs w:val="18"/>
               </w:rPr>
-              <w:t xml:space="preserve">The five quintile rows of a week share the same signals, so they are not independent; the plain LR test (χ² = 94) overstates the evidence about four-fold.</w:t>
+              <w:t xml:space="preserve">DeLong treats the 455 test rows as independent, but the five quintile rows of a week share the same signals and move together. Resampling whole weeks with replacement (bootstrap and cluster sampling, Unit 04) keeps them together, gives a 95% interval (−0.08 to +0.10) and a p-value (0.45), and is easy to check by hand.</w:t>
             </w:r>
           </w:p>
         </w:tc>
@@ -34246,7 +34772,7 @@
                 <w:sz w:val="18"/>
                 <w:szCs w:val="18"/>
               </w:rPr>
-              <w:t xml:space="preserve">What did H2 and H3 find?</w:t>
+              <w:t xml:space="preserve">Which methods did you use that were not in the lecture slides, and why?</w:t>
             </w:r>
           </w:p>
         </w:tc>
@@ -34280,7 +34806,7 @@
                 <w:sz w:val="18"/>
                 <w:szCs w:val="18"/>
               </w:rPr>
-              <w:t xml:space="preserve">H2: pass-through is about the same for Q1 and Q5 (p = 0.27). H3: food widens the gap against the poor (p = 0.003); energy as a whole does not narrow it. The exploratory split shows why: motor fuel and LPG hit the rich harder, while utility tariffs lean towards the poor (not significant, p = 0.10).</w:t>
+              <w:t xml:space="preserve">Three, each because the course method alone would give a wrong or incomplete answer: expanding-window CV (shuffled K-fold leaks the future, inflating AUC by 0.05–0.14), permutation importance (KNN has no coefficients or Gini importance) and standard errors clustered by week (the five quintile rows of a week are not independent). The LR test, HAC errors and the Brier score were already in our M2 plan.</w:t>
             </w:r>
           </w:p>
         </w:tc>
@@ -34319,7 +34845,7 @@
                 <w:sz w:val="18"/>
                 <w:szCs w:val="18"/>
               </w:rPr>
-              <w:t xml:space="preserve">What are the systematic errors?</w:t>
+              <w:t xml:space="preserve">Why cluster standard errors by week?</w:t>
             </w:r>
           </w:p>
         </w:tc>
@@ -34353,7 +34879,7 @@
                 <w:sz w:val="18"/>
                 <w:szCs w:val="18"/>
               </w:rPr>
-              <w:t xml:space="preserve">First waves of a new shock, administered utility tariffs and perishable supply spikes are missed; false alarms follow past shocks.</w:t>
+              <w:t xml:space="preserve">The five quintile rows of a week share the same signals, so they are not independent; the plain LR test (χ² = 94) overstates the evidence about four-fold.</w:t>
             </w:r>
           </w:p>
         </w:tc>
@@ -34392,7 +34918,7 @@
                 <w:sz w:val="18"/>
                 <w:szCs w:val="18"/>
               </w:rPr>
-              <w:t xml:space="preserve">What are the main limitations?</w:t>
+              <w:t xml:space="preserve">What did H2 and H3 find?</w:t>
             </w:r>
           </w:p>
         </w:tc>
@@ -34426,7 +34952,7 @@
                 <w:sz w:val="18"/>
                 <w:szCs w:val="18"/>
               </w:rPr>
-              <w:t xml:space="preserve">Weak signal (underfitting), uncalibrated probabilities, a small test set (13 shock weeks), no data on tariff decisions, urban-only SPI (rural poor invisible), revised data vintage.</w:t>
+              <w:t xml:space="preserve">H2: pass-through is about the same for Q1 and Q5 (p = 0.27). H3: food widens the gap against the poor (p = 0.003); energy as a whole does not narrow it. The exploratory split shows why: motor fuel and LPG hit the rich harder, while utility tariffs lean towards the poor (not significant, p = 0.10).</w:t>
             </w:r>
           </w:p>
         </w:tc>
@@ -34465,7 +34991,7 @@
                 <w:sz w:val="18"/>
                 <w:szCs w:val="18"/>
               </w:rPr>
-              <w:t xml:space="preserve">What will you do in M4?</w:t>
+              <w:t xml:space="preserve">What are the systematic errors?</w:t>
             </w:r>
           </w:p>
         </w:tc>
@@ -34499,7 +35025,153 @@
                 <w:sz w:val="18"/>
                 <w:szCs w:val="18"/>
               </w:rPr>
-              <w:t xml:space="preserve">Ensembles (random forest, gradient boosting) under the same protocol; calibration; a tariff-notification calendar; fairness audit of Q1 vs Q5 (Brier, miss rates, Diebold–Mariano, equal opportunity); ethics of public warnings.</w:t>
+              <w:t xml:space="preserve">First waves of a new shock, administered utility tariffs and perishable supply spikes are missed; false alarms follow past shocks.</w:t>
+            </w:r>
+          </w:p>
+        </w:tc>
+      </w:tr>
+      <w:tr>
+        <w:trPr>
+          <w:cantSplit/>
+        </w:trPr>
+        <w:tc>
+          <w:tcPr>
+            <w:tcW w:type="dxa" w:w="3000"/>
+            <w:tcBorders>
+              <w:top w:val="single" w:color="BFBFBF" w:sz="4"/>
+              <w:left w:val="single" w:color="BFBFBF" w:sz="4"/>
+              <w:bottom w:val="single" w:color="BFBFBF" w:sz="4"/>
+              <w:right w:val="single" w:color="BFBFBF" w:sz="4"/>
+            </w:tcBorders>
+            <w:tcMar>
+              <w:top w:type="dxa" w:w="60"/>
+              <w:left w:type="dxa" w:w="100"/>
+              <w:bottom w:type="dxa" w:w="60"/>
+              <w:right w:type="dxa" w:w="100"/>
+            </w:tcMar>
+            <w:vAlign w:val="top"/>
+          </w:tcPr>
+          <w:p>
+            <w:pPr>
+              <w:spacing w:after="40"/>
+            </w:pPr>
+            <w:r>
+              <w:rPr>
+                <w:rFonts w:ascii="Calibri" w:cs="Calibri" w:eastAsia="Calibri" w:hAnsi="Calibri"/>
+                <w:b/>
+                <w:bCs/>
+                <w:color w:val="1F1F1F"/>
+                <w:sz w:val="18"/>
+                <w:szCs w:val="18"/>
+              </w:rPr>
+              <w:t xml:space="preserve">What are the main limitations?</w:t>
+            </w:r>
+          </w:p>
+        </w:tc>
+        <w:tc>
+          <w:tcPr>
+            <w:tcW w:type="dxa" w:w="6026"/>
+            <w:tcBorders>
+              <w:top w:val="single" w:color="BFBFBF" w:sz="4"/>
+              <w:left w:val="single" w:color="BFBFBF" w:sz="4"/>
+              <w:bottom w:val="single" w:color="BFBFBF" w:sz="4"/>
+              <w:right w:val="single" w:color="BFBFBF" w:sz="4"/>
+            </w:tcBorders>
+            <w:tcMar>
+              <w:top w:type="dxa" w:w="60"/>
+              <w:left w:type="dxa" w:w="100"/>
+              <w:bottom w:type="dxa" w:w="60"/>
+              <w:right w:type="dxa" w:w="100"/>
+            </w:tcMar>
+            <w:vAlign w:val="top"/>
+          </w:tcPr>
+          <w:p>
+            <w:pPr>
+              <w:spacing w:after="40"/>
+            </w:pPr>
+            <w:r>
+              <w:rPr>
+                <w:rFonts w:ascii="Calibri" w:cs="Calibri" w:eastAsia="Calibri" w:hAnsi="Calibri"/>
+                <w:b w:val="false"/>
+                <w:bCs w:val="false"/>
+                <w:color w:val="1F1F1F"/>
+                <w:sz w:val="18"/>
+                <w:szCs w:val="18"/>
+              </w:rPr>
+              <w:t xml:space="preserve">Weak signal (underfitting), uncalibrated probabilities, a small test set (13 shock weeks), no data on tariff decisions, urban-only SPI (rural poor invisible), revised data vintage.</w:t>
+            </w:r>
+          </w:p>
+        </w:tc>
+      </w:tr>
+      <w:tr>
+        <w:trPr>
+          <w:cantSplit/>
+        </w:trPr>
+        <w:tc>
+          <w:tcPr>
+            <w:tcW w:type="dxa" w:w="3000"/>
+            <w:tcBorders>
+              <w:top w:val="single" w:color="BFBFBF" w:sz="4"/>
+              <w:left w:val="single" w:color="BFBFBF" w:sz="4"/>
+              <w:bottom w:val="single" w:color="BFBFBF" w:sz="4"/>
+              <w:right w:val="single" w:color="BFBFBF" w:sz="4"/>
+            </w:tcBorders>
+            <w:tcMar>
+              <w:top w:type="dxa" w:w="60"/>
+              <w:left w:type="dxa" w:w="100"/>
+              <w:bottom w:type="dxa" w:w="60"/>
+              <w:right w:type="dxa" w:w="100"/>
+            </w:tcMar>
+            <w:vAlign w:val="top"/>
+          </w:tcPr>
+          <w:p>
+            <w:pPr>
+              <w:spacing w:after="40"/>
+            </w:pPr>
+            <w:r>
+              <w:rPr>
+                <w:rFonts w:ascii="Calibri" w:cs="Calibri" w:eastAsia="Calibri" w:hAnsi="Calibri"/>
+                <w:b/>
+                <w:bCs/>
+                <w:color w:val="1F1F1F"/>
+                <w:sz w:val="18"/>
+                <w:szCs w:val="18"/>
+              </w:rPr>
+              <w:t xml:space="preserve">What will you do in M4?</w:t>
+            </w:r>
+          </w:p>
+        </w:tc>
+        <w:tc>
+          <w:tcPr>
+            <w:tcW w:type="dxa" w:w="6026"/>
+            <w:tcBorders>
+              <w:top w:val="single" w:color="BFBFBF" w:sz="4"/>
+              <w:left w:val="single" w:color="BFBFBF" w:sz="4"/>
+              <w:bottom w:val="single" w:color="BFBFBF" w:sz="4"/>
+              <w:right w:val="single" w:color="BFBFBF" w:sz="4"/>
+            </w:tcBorders>
+            <w:tcMar>
+              <w:top w:type="dxa" w:w="60"/>
+              <w:left w:type="dxa" w:w="100"/>
+              <w:bottom w:type="dxa" w:w="60"/>
+              <w:right w:type="dxa" w:w="100"/>
+            </w:tcMar>
+            <w:vAlign w:val="top"/>
+          </w:tcPr>
+          <w:p>
+            <w:pPr>
+              <w:spacing w:after="40"/>
+            </w:pPr>
+            <w:r>
+              <w:rPr>
+                <w:rFonts w:ascii="Calibri" w:cs="Calibri" w:eastAsia="Calibri" w:hAnsi="Calibri"/>
+                <w:b w:val="false"/>
+                <w:bCs w:val="false"/>
+                <w:color w:val="1F1F1F"/>
+                <w:sz w:val="18"/>
+                <w:szCs w:val="18"/>
+              </w:rPr>
+              <w:t xml:space="preserve">Ensembles (random forest, gradient boosting) under the same protocol; calibration; a tariff-notification calendar; fairness audit of Q1 vs Q5 (Brier scores and miss rates with the Diebold–Mariano test planned in M2; equal recall across quintiles); ethics of public warnings.</w:t>
             </w:r>
           </w:p>
         </w:tc>
@@ -34746,11 +35418,11 @@
         <w:keepNext w:val="false"/>
         <w:spacing w:after="160" w:before="240"/>
       </w:pPr>
-      <w:bookmarkStart w:name="h25" w:id="25"/>
+      <w:bookmarkStart w:name="h26" w:id="26"/>
       <w:r>
         <w:t xml:space="preserve">9. Limitations and the road to Milestone 4</w:t>
       </w:r>
-      <w:bookmarkEnd w:id="25"/>
+      <w:bookmarkEnd w:id="26"/>
     </w:p>
     <w:p>
       <w:pPr>
@@ -34800,7 +35472,7 @@
           <w:sz w:val="20"/>
           <w:szCs w:val="20"/>
         </w:rPr>
-        <w:t xml:space="preserve">Calibration and prior shift:</w:t>
+        <w:t xml:space="preserve">Calibration and a changing shock rate:</w:t>
       </w:r>
       <w:r>
         <w:rPr>
@@ -34839,7 +35511,7 @@
           <w:sz w:val="20"/>
           <w:szCs w:val="20"/>
         </w:rPr>
-        <w:t xml:space="preserve"> pooled AUC partly rewards telling crisis years from calm ones (year-level oracle 0.640), which flattered the tree; M4 reports within-year AUC alongside it.</w:t>
+        <w:t xml:space="preserve"> pooled AUC partly rewards telling crisis years from calm ones, which flattered the tree; M4 reports within-year AUC alongside it.</w:t>
       </w:r>
     </w:p>
     <w:p>
@@ -34967,7 +35639,7 @@
           <w:sz w:val="20"/>
           <w:szCs w:val="20"/>
         </w:rPr>
-        <w:t xml:space="preserve"> ensembles (random forest, gradient boosting) under the same protocol; quintile-specific models and the H4 interaction test; Platt/isotonic calibration; within-year AUC reported next to pooled AUC; a tariff-notification calendar, a first-month-of-the-fiscal-year window and a regime feature; fairness audit (H5: Brier and miss rates Q1 vs Q5, Diebold–Mariano test, equal opportunity, welfare-weighted thresholds); ethics of public warnings.</w:t>
+        <w:t xml:space="preserve"> ensembles (random forest, gradient boosting) under the same protocol; quintile-specific models and the H4 interaction test; calibration of the probabilities; within-year AUC reported next to pooled AUC; a tariff-notification calendar, a first-month-of-the-fiscal-year window and a regime feature; fairness audit (H5: Brier scores and miss rates Q1 vs Q5 with the Diebold–Mariano test planned in M2, equal recall across quintiles, quintile-specific thresholds); ethics of public warnings.</w:t>
       </w:r>
     </w:p>
     <w:p>
@@ -34976,11 +35648,11 @@
         <w:keepNext w:val="false"/>
         <w:spacing w:after="160" w:before="240"/>
       </w:pPr>
-      <w:bookmarkStart w:name="h26" w:id="26"/>
+      <w:bookmarkStart w:name="h27" w:id="27"/>
       <w:r>
         <w:t xml:space="preserve">10. Cross-reference matrix: files × steps</w:t>
       </w:r>
-      <w:bookmarkEnd w:id="26"/>
+      <w:bookmarkEnd w:id="27"/>
     </w:p>
     <w:p>
       <w:pPr>

</xml_diff>

<commit_message>
manuscript: merge the team's Google Docs edits into Section IV
The team edited a copy of the 22 Oct report (7d341d7). Their ten
changes to Section IV and Tables 14-15 (plainer punctuation, "about
75/25", no code names, a shorter cost paragraph) are applied on top of
the later Section V edits. Two kept as before: the class-weights
sentence stays a list (the edit changed its meaning) and 1,805 keeps
its separator. PDF re-exported (13 pages); viva guide rebuilt with the
review changes.
</commit_message>
<xml_diff>
--- a/DS4SG_M3_Reference.docx
+++ b/DS4SG_M3_Reference.docx
@@ -71,7 +71,7 @@
           <w:sz w:val="22"/>
           <w:szCs w:val="22"/>
         </w:rPr>
-        <w:t xml:space="preserve">Version: 22 October 2026 (Milestone 3 due 24 October 2026)</w:t>
+        <w:t xml:space="preserve">Version: 25 October 2026 (Milestone 3 due 24 October 2026)</w:t>
       </w:r>
     </w:p>
     <w:p>
@@ -956,7 +956,7 @@
           <w:sz w:val="20"/>
           <w:szCs w:val="20"/>
         </w:rPr>
-        <w:t xml:space="preserve">In the calm 2025–26 test period, KNN ranked shocks best (AUC 0.68), but at 5:1 no model beat 'never alert' on cost: the shock rate halved (17% → 8%), so thresholds learned in crisis years over-alert.</w:t>
+        <w:t xml:space="preserve">In the calm 2025–26 test period, KNN had the highest AUC (0.68; clearly above LR, not clearly above the tree), but at 5:1 no model beat 'never alert' on cost: the shock rate halved (17% → 8%), so thresholds learned in crisis years over-alert.</w:t>
       </w:r>
     </w:p>
     <w:p>
@@ -11542,7 +11542,7 @@
                 <w:sz w:val="17"/>
                 <w:szCs w:val="17"/>
               </w:rPr>
-              <w:t xml:space="preserve">Justification table; grid search of the three pipelines; selected settings; validation curves.</w:t>
+              <w:t xml:space="preserve">Justification table; grid search of the three pipelines; selected settings; validation curves; check of C values below the grid (plateau).</w:t>
             </w:r>
           </w:p>
         </w:tc>
@@ -11765,7 +11765,7 @@
                 <w:sz w:val="17"/>
                 <w:szCs w:val="17"/>
               </w:rPr>
-              <w:t xml:space="preserve">Thresholds from out-of-fold cost; full metric tables for validation years and test; bootstrap CIs; ROC/PR curves; metrics by quintile.</w:t>
+              <w:t xml:space="preserve">Thresholds from out-of-fold cost; full metric tables for validation years and test; bootstrap CIs and paired KNN differences; ROC/PR curves; metrics by quintile.</w:t>
             </w:r>
           </w:p>
         </w:tc>
@@ -12176,7 +12176,7 @@
                 <w:sz w:val="17"/>
                 <w:szCs w:val="17"/>
               </w:rPr>
-              <w:t xml:space="preserve">LR standardised coefficients; unpenalised odds ratios; tree Gini; permutation importance; tree rules.</w:t>
+              <w:t xml:space="preserve">LR standardised coefficients; unpenalised odds ratios; tree Gini; permutation importance; top-5 drivers with a policy implication each; tree rules.</w:t>
             </w:r>
           </w:p>
         </w:tc>
@@ -12227,6 +12227,24 @@
                 <w:szCs w:val="15"/>
               </w:rPr>
               <w:t xml:space="preserve">m3_odds_ratios.csv</w:t>
+            </w:r>
+            <w:r>
+              <w:rPr>
+                <w:rFonts w:ascii="Calibri" w:cs="Calibri" w:eastAsia="Calibri" w:hAnsi="Calibri"/>
+                <w:color w:val="1F1F1F"/>
+                <w:sz w:val="17"/>
+                <w:szCs w:val="17"/>
+              </w:rPr>
+              <w:t xml:space="preserve">, </w:t>
+            </w:r>
+            <w:r>
+              <w:rPr>
+                <w:rFonts w:ascii="Consolas" w:cs="Consolas" w:eastAsia="Consolas" w:hAnsi="Consolas"/>
+                <w:color w:val="1F1F1F"/>
+                <w:sz w:val="15"/>
+                <w:szCs w:val="15"/>
+              </w:rPr>
+              <w:t xml:space="preserve">m3_top5_drivers.csv</w:t>
             </w:r>
             <w:r>
               <w:rPr>
@@ -12897,7 +12915,7 @@
                 <w:sz w:val="17"/>
                 <w:szCs w:val="17"/>
               </w:rPr>
-              <w:t xml:space="preserve">: Q1 − Q5 weekly gap on food and energy inflation (+ controls, period dummies); exploratory split into five components.</w:t>
+              <w:t xml:space="preserve">: Q1 − Q5 weekly gap on food and energy inflation (+ controls, period dummies); caveat that the gap is built from basket weights (descriptive, not causal); exploratory split into five components.</w:t>
             </w:r>
           </w:p>
         </w:tc>
@@ -16361,6 +16379,104 @@
                 <w:szCs w:val="17"/>
               </w:rPr>
               <w:t xml:space="preserve">All importance measures; unpenalised odds ratios with clustered CIs.</w:t>
+            </w:r>
+          </w:p>
+        </w:tc>
+        <w:tc>
+          <w:tcPr>
+            <w:tcW w:type="dxa" w:w="1600"/>
+            <w:tcBorders>
+              <w:top w:val="single" w:color="BFBFBF" w:sz="4"/>
+              <w:left w:val="single" w:color="BFBFBF" w:sz="4"/>
+              <w:bottom w:val="single" w:color="BFBFBF" w:sz="4"/>
+              <w:right w:val="single" w:color="BFBFBF" w:sz="4"/>
+            </w:tcBorders>
+            <w:tcMar>
+              <w:top w:type="dxa" w:w="60"/>
+              <w:left w:type="dxa" w:w="100"/>
+              <w:bottom w:type="dxa" w:w="60"/>
+              <w:right w:type="dxa" w:w="100"/>
+            </w:tcMar>
+            <w:vAlign w:val="top"/>
+          </w:tcPr>
+          <w:p>
+            <w:pPr>
+              <w:spacing w:after="40"/>
+            </w:pPr>
+            <w:r>
+              <w:rPr>
+                <w:rFonts w:ascii="Calibri" w:cs="Calibri" w:eastAsia="Calibri" w:hAnsi="Calibri"/>
+                <w:color w:val="1F1F1F"/>
+                <w:sz w:val="17"/>
+                <w:szCs w:val="17"/>
+              </w:rPr>
+              <w:t xml:space="preserve">nb03 §9</w:t>
+            </w:r>
+          </w:p>
+        </w:tc>
+      </w:tr>
+      <w:tr>
+        <w:tc>
+          <w:tcPr>
+            <w:tcW w:type="dxa" w:w="3300"/>
+            <w:tcBorders>
+              <w:top w:val="single" w:color="BFBFBF" w:sz="4"/>
+              <w:left w:val="single" w:color="BFBFBF" w:sz="4"/>
+              <w:bottom w:val="single" w:color="BFBFBF" w:sz="4"/>
+              <w:right w:val="single" w:color="BFBFBF" w:sz="4"/>
+            </w:tcBorders>
+            <w:tcMar>
+              <w:top w:type="dxa" w:w="60"/>
+              <w:left w:type="dxa" w:w="100"/>
+              <w:bottom w:type="dxa" w:w="60"/>
+              <w:right w:type="dxa" w:w="100"/>
+            </w:tcMar>
+            <w:vAlign w:val="top"/>
+          </w:tcPr>
+          <w:p>
+            <w:pPr>
+              <w:spacing w:after="40"/>
+            </w:pPr>
+            <w:r>
+              <w:rPr>
+                <w:rFonts w:ascii="Consolas" w:cs="Consolas" w:eastAsia="Consolas" w:hAnsi="Consolas"/>
+                <w:color w:val="1F1F1F"/>
+                <w:sz w:val="15"/>
+                <w:szCs w:val="15"/>
+              </w:rPr>
+              <w:t xml:space="preserve">m3_top5_drivers.csv</w:t>
+            </w:r>
+          </w:p>
+        </w:tc>
+        <w:tc>
+          <w:tcPr>
+            <w:tcW w:type="dxa" w:w="4126"/>
+            <w:tcBorders>
+              <w:top w:val="single" w:color="BFBFBF" w:sz="4"/>
+              <w:left w:val="single" w:color="BFBFBF" w:sz="4"/>
+              <w:bottom w:val="single" w:color="BFBFBF" w:sz="4"/>
+              <w:right w:val="single" w:color="BFBFBF" w:sz="4"/>
+            </w:tcBorders>
+            <w:tcMar>
+              <w:top w:type="dxa" w:w="60"/>
+              <w:left w:type="dxa" w:w="100"/>
+              <w:bottom w:type="dxa" w:w="60"/>
+              <w:right w:type="dxa" w:w="100"/>
+            </w:tcMar>
+            <w:vAlign w:val="top"/>
+          </w:tcPr>
+          <w:p>
+            <w:pPr>
+              <w:spacing w:after="40"/>
+            </w:pPr>
+            <w:r>
+              <w:rPr>
+                <w:rFonts w:ascii="Calibri" w:cs="Calibri" w:eastAsia="Calibri" w:hAnsi="Calibri"/>
+                <w:color w:val="1F1F1F"/>
+                <w:sz w:val="17"/>
+                <w:szCs w:val="17"/>
+              </w:rPr>
+              <w:t xml:space="preserve">The five leading drivers by mean permutation importance, with Gini importance and odds ratios.</w:t>
             </w:r>
           </w:p>
         </w:tc>
@@ -28724,7 +28840,7 @@
                 <w:sz w:val="19"/>
                 <w:szCs w:val="19"/>
               </w:rPr>
-              <w:t xml:space="preserve">LR C was extended down to 10^−4; the curve is flat for C ≤ 0.01 (all within 0.013), so the edge choice is a plateau, not a missed optimum. KNN k stops at 250 because the smallest training fold has about 310 rows. Tree leaf size extended to 160. The saga solver is used because it fits both the L1 and the L2 penalty of the grid.</w:t>
+              <w:t xml:space="preserve">LR C was extended down to 10^−4; the curve is flat for C ≤ 0.01 (all within 0.013), so the edge choice is a plateau, not a missed optimum. A check below the grid (nb03 §4) confirms it: C = 0.00003 and 0.00001 change the pooled and the within-year AUC by at most 0.001. A stronger penalty only shrinks the coefficients further without changing their direction, so the ranking (all that AUC measures) stays the same, while the probabilities are squeezed towards 0.5 (0.495–0.511 at C = 0.00001), too narrow for the 0.01-step threshold search. KNN k stops at 250 because the smallest training fold has about 310 rows. Tree leaf size extended to 160. The saga solver is used because it fits both the L1 and the L2 penalty of the grid.</w:t>
             </w:r>
           </w:p>
         </w:tc>
@@ -30036,7 +30152,7 @@
                 <w:sz w:val="19"/>
                 <w:szCs w:val="19"/>
               </w:rPr>
-              <w:t xml:space="preserve">β_food = 0.12 (p = 0.003) supports the food part; β_energy = +0.04 (p = 0.92 for &lt; 0) does not support the energy part. Splitting energy shows motor fuel (−0.07) and LPG (−0.03) narrow the gap, while utility tariffs point the other way (+0.03, p = 0.10, not significant; the 'for Q1' tariff slabs weigh heavily in Q1's basket). Because the split was chosen after seeing the result, it is a hypothesis for M4 (avoids p-hacking).</w:t>
+              <w:t xml:space="preserve">β_food = 0.12 (p = 0.003) supports the food part; β_energy = +0.04 (p = 0.92 for &lt; 0) does not support the energy part. Splitting energy shows motor fuel (−0.07) and LPG (−0.03) narrow the gap, while utility tariffs point the other way (+0.03, p = 0.10, not significant; the 'for Q1' tariff slabs weigh heavily in Q1's basket). Because the split was chosen after seeing the result, it is a hypothesis for M4 (avoids p-hacking). Caveat: the Q1 − Q5 gap is built from the same item price changes weighted by each basket (food ≈ 57% of Q1's estimated basket vs 43% of Q5's; motor fuel ≈ 3% vs 11%), so the regression partly recovers known weight differences. The coefficients are descriptive, not causal.</w:t>
             </w:r>
           </w:p>
         </w:tc>
@@ -31936,7 +32052,7 @@
                 <w:sz w:val="18"/>
                 <w:szCs w:val="18"/>
               </w:rPr>
-              <w:t xml:space="preserve">Selected KNN</w:t>
+              <w:t xml:space="preserve">LR below the grid</w:t>
             </w:r>
           </w:p>
         </w:tc>
@@ -31970,7 +32086,7 @@
                 <w:sz w:val="18"/>
                 <w:szCs w:val="18"/>
               </w:rPr>
-              <w:t xml:space="preserve">k = 100, uniform, z-score; pooled 0.643; mean 0.672 ± 0.080; threshold 0.12</w:t>
+              <w:t xml:space="preserve">C = 0.00003: pooled 0.644, mean 0.652; C = 0.00001: pooled 0.643, mean 0.652, probabilities 0.495–0.511 (plateau)</w:t>
             </w:r>
           </w:p>
         </w:tc>
@@ -32006,7 +32122,7 @@
                 <w:sz w:val="18"/>
                 <w:szCs w:val="18"/>
               </w:rPr>
-              <w:t xml:space="preserve">Selected tree</w:t>
+              <w:t xml:space="preserve">Selected KNN</w:t>
             </w:r>
           </w:p>
         </w:tc>
@@ -32040,7 +32156,7 @@
                 <w:sz w:val="18"/>
                 <w:szCs w:val="18"/>
               </w:rPr>
-              <w:t xml:space="preserve">depth 4, leaf ≥ 40, unweighted; pooled 0.652; mean 0.578 ± 0.082; threshold 0.16</w:t>
+              <w:t xml:space="preserve">k = 100, uniform, z-score; pooled 0.643; mean 0.672 ± 0.080; threshold 0.12</w:t>
             </w:r>
           </w:p>
         </w:tc>
@@ -32076,7 +32192,7 @@
                 <w:sz w:val="18"/>
                 <w:szCs w:val="18"/>
               </w:rPr>
-              <w:t xml:space="preserve">Benchmarks (CV)</w:t>
+              <w:t xml:space="preserve">Selected tree</w:t>
             </w:r>
           </w:p>
         </w:tc>
@@ -32110,7 +32226,7 @@
                 <w:sz w:val="18"/>
                 <w:szCs w:val="18"/>
               </w:rPr>
-              <w:t xml:space="preserve">persistence pooled 0.584; majority 0.467 pooled (0.500 per fold)</w:t>
+              <w:t xml:space="preserve">depth 4, leaf ≥ 40, unweighted; pooled 0.652; mean 0.578 ± 0.082; threshold 0.16</w:t>
             </w:r>
           </w:p>
         </w:tc>
@@ -32146,7 +32262,7 @@
                 <w:sz w:val="18"/>
                 <w:szCs w:val="18"/>
               </w:rPr>
-              <w:t xml:space="preserve">Shuffled K-fold inflation</w:t>
+              <w:t xml:space="preserve">Benchmarks (CV)</w:t>
             </w:r>
           </w:p>
         </w:tc>
@@ -32180,7 +32296,7 @@
                 <w:sz w:val="18"/>
                 <w:szCs w:val="18"/>
               </w:rPr>
-              <w:t xml:space="preserve">+0.05 (LR) to +0.14 (tree): 0.70–0.73 vs 0.58–0.67</w:t>
+              <w:t xml:space="preserve">persistence pooled 0.584; majority 0.467 pooled (0.500 per fold)</w:t>
             </w:r>
           </w:p>
         </w:tc>
@@ -32216,7 +32332,7 @@
                 <w:sz w:val="18"/>
                 <w:szCs w:val="18"/>
               </w:rPr>
-              <w:t xml:space="preserve">Test AUC [95% CI]</w:t>
+              <w:t xml:space="preserve">Shuffled K-fold inflation</w:t>
             </w:r>
           </w:p>
         </w:tc>
@@ -32250,7 +32366,7 @@
                 <w:sz w:val="18"/>
                 <w:szCs w:val="18"/>
               </w:rPr>
-              <w:t xml:space="preserve">KNN 0.68 [0.47, 0.83]; LR 0.57 [0.35, 0.76]; tree 0.54 [0.43, 0.67]; persistence 0.47</w:t>
+              <w:t xml:space="preserve">+0.05 (LR) to +0.14 (tree): 0.70–0.73 vs 0.58–0.67</w:t>
             </w:r>
           </w:p>
         </w:tc>
@@ -32286,7 +32402,7 @@
                 <w:sz w:val="18"/>
                 <w:szCs w:val="18"/>
               </w:rPr>
-              <w:t xml:space="preserve">Test recall / false alarms</w:t>
+              <w:t xml:space="preserve">Test AUC [95% CI]</w:t>
             </w:r>
           </w:p>
         </w:tc>
@@ -32320,7 +32436,7 @@
                 <w:sz w:val="18"/>
                 <w:szCs w:val="18"/>
               </w:rPr>
-              <w:t xml:space="preserve">KNN 20/35, 133 FP; tree 10/35, 91 FP; LR 6/35, 37 FP</w:t>
+              <w:t xml:space="preserve">KNN 0.68 [0.47, 0.83]; LR 0.57 [0.35, 0.76]; tree 0.54 [0.43, 0.67]; persistence 0.47</w:t>
             </w:r>
           </w:p>
         </w:tc>
@@ -32356,7 +32472,7 @@
                 <w:sz w:val="18"/>
                 <w:szCs w:val="18"/>
               </w:rPr>
-              <w:t xml:space="preserve">Test accuracy</w:t>
+              <w:t xml:space="preserve">KNN vs others (paired, test)</w:t>
             </w:r>
           </w:p>
         </w:tc>
@@ -32390,7 +32506,7 @@
                 <w:sz w:val="18"/>
                 <w:szCs w:val="18"/>
               </w:rPr>
-              <w:t xml:space="preserve">majority 92.3% (catches nothing); KNN 67.5%; LR 85.5%; tree 74.5%</w:t>
+              <w:t xml:space="preserve">KNN − LR +0.11 [+0.02, +0.22]; KNN − tree +0.14 [−0.04, +0.29]: better than LR, not clearly better than the tree</w:t>
             </w:r>
           </w:p>
         </w:tc>
@@ -32426,7 +32542,7 @@
                 <w:sz w:val="18"/>
                 <w:szCs w:val="18"/>
               </w:rPr>
-              <w:t xml:space="preserve">Brier (test)</w:t>
+              <w:t xml:space="preserve">Test recall / false alarms</w:t>
             </w:r>
           </w:p>
         </w:tc>
@@ -32460,7 +32576,7 @@
                 <w:sz w:val="18"/>
                 <w:szCs w:val="18"/>
               </w:rPr>
-              <w:t xml:space="preserve">KNN 0.070, tree 0.078, majority 0.080, LR 0.238</w:t>
+              <w:t xml:space="preserve">KNN 20/35, 133 FP; tree 10/35, 91 FP; LR 6/35, 37 FP</w:t>
             </w:r>
           </w:p>
         </w:tc>
@@ -32496,7 +32612,7 @@
                 <w:sz w:val="18"/>
                 <w:szCs w:val="18"/>
               </w:rPr>
-              <w:t xml:space="preserve">Cost 2021–24 (5:1)</w:t>
+              <w:t xml:space="preserve">Test accuracy</w:t>
             </w:r>
           </w:p>
         </w:tc>
@@ -32530,7 +32646,7 @@
                 <w:sz w:val="18"/>
                 <w:szCs w:val="18"/>
               </w:rPr>
-              <w:t xml:space="preserve">33–39% below never-alert; 18–26% below always-alert</w:t>
+              <w:t xml:space="preserve">majority 92.3% (catches nothing); KNN 67.5%; LR 85.5%; tree 74.5%</w:t>
             </w:r>
           </w:p>
         </w:tc>
@@ -32566,7 +32682,7 @@
                 <w:sz w:val="18"/>
                 <w:szCs w:val="18"/>
               </w:rPr>
-              <w:t xml:space="preserve">Cost test (5:1)</w:t>
+              <w:t xml:space="preserve">Brier (test)</w:t>
             </w:r>
           </w:p>
         </w:tc>
@@ -32600,7 +32716,7 @@
                 <w:sz w:val="18"/>
                 <w:szCs w:val="18"/>
               </w:rPr>
-              <w:t xml:space="preserve">4–23% above never-alert (LR 1.04, KNN 1.19, tree 1.23)</w:t>
+              <w:t xml:space="preserve">KNN 0.070, tree 0.078, majority 0.080, LR 0.238</w:t>
             </w:r>
           </w:p>
         </w:tc>
@@ -32636,7 +32752,7 @@
                 <w:sz w:val="18"/>
                 <w:szCs w:val="18"/>
               </w:rPr>
-              <w:t xml:space="preserve">Q1 shock size</w:t>
+              <w:t xml:space="preserve">Cost 2021–24 (5:1)</w:t>
             </w:r>
           </w:p>
         </w:tc>
@@ -32670,7 +32786,7 @@
                 <w:sz w:val="18"/>
                 <w:szCs w:val="18"/>
               </w:rPr>
-              <w:t xml:space="preserve">median 1.6%, mean 2.0%; not reversed: 4.2% above the pre-shock week 8 weeks later (ordinary week: 1.9%); Rs 355/month ≈ 8% of Kafaalat</w:t>
+              <w:t xml:space="preserve">33–39% below never-alert; 18–26% below always-alert</w:t>
             </w:r>
           </w:p>
         </w:tc>
@@ -32706,7 +32822,7 @@
                 <w:sz w:val="18"/>
                 <w:szCs w:val="18"/>
               </w:rPr>
-              <w:t xml:space="preserve">Within-year AUC (CV)</w:t>
+              <w:t xml:space="preserve">Cost test (5:1)</w:t>
             </w:r>
           </w:p>
         </w:tc>
@@ -32740,7 +32856,7 @@
                 <w:sz w:val="18"/>
                 <w:szCs w:val="18"/>
               </w:rPr>
-              <w:t xml:space="preserve">mean fold AUC: KNN 0.672, LR 0.651, tree 0.578, persistence 0.569 (pooled favours the tree: 0.652)</w:t>
+              <w:t xml:space="preserve">4–23% above never-alert (LR 1.04, KNN 1.19, tree 1.23)</w:t>
             </w:r>
           </w:p>
         </w:tc>
@@ -32776,7 +32892,7 @@
                 <w:sz w:val="18"/>
                 <w:szCs w:val="18"/>
               </w:rPr>
-              <w:t xml:space="preserve">Top drivers</w:t>
+              <w:t xml:space="preserve">Q1 shock size</w:t>
             </w:r>
           </w:p>
         </w:tc>
@@ -32810,7 +32926,217 @@
                 <w:sz w:val="18"/>
                 <w:szCs w:val="18"/>
               </w:rPr>
+              <w:t xml:space="preserve">median 1.6%, mean 2.0%; not reversed: 4.2% above the pre-shock week 8 weeks later (ordinary week: 1.9%); Rs 355/month ≈ 8% of Kafaalat</w:t>
+            </w:r>
+          </w:p>
+        </w:tc>
+      </w:tr>
+      <w:tr>
+        <w:tc>
+          <w:tcPr>
+            <w:tcW w:type="dxa" w:w="2800"/>
+            <w:tcBorders>
+              <w:top w:val="single" w:color="BFBFBF" w:sz="4"/>
+              <w:left w:val="single" w:color="BFBFBF" w:sz="4"/>
+              <w:bottom w:val="single" w:color="BFBFBF" w:sz="4"/>
+              <w:right w:val="single" w:color="BFBFBF" w:sz="4"/>
+            </w:tcBorders>
+            <w:tcMar>
+              <w:top w:type="dxa" w:w="60"/>
+              <w:left w:type="dxa" w:w="100"/>
+              <w:bottom w:type="dxa" w:w="60"/>
+              <w:right w:type="dxa" w:w="100"/>
+            </w:tcMar>
+            <w:vAlign w:val="top"/>
+          </w:tcPr>
+          <w:p>
+            <w:pPr>
+              <w:spacing w:after="40"/>
+            </w:pPr>
+            <w:r>
+              <w:rPr>
+                <w:rFonts w:ascii="Calibri" w:cs="Calibri" w:eastAsia="Calibri" w:hAnsi="Calibri"/>
+                <w:b/>
+                <w:bCs/>
+                <w:color w:val="1F1F1F"/>
+                <w:sz w:val="18"/>
+                <w:szCs w:val="18"/>
+              </w:rPr>
+              <w:t xml:space="preserve">Within-year AUC (CV)</w:t>
+            </w:r>
+          </w:p>
+        </w:tc>
+        <w:tc>
+          <w:tcPr>
+            <w:tcW w:type="dxa" w:w="6226"/>
+            <w:tcBorders>
+              <w:top w:val="single" w:color="BFBFBF" w:sz="4"/>
+              <w:left w:val="single" w:color="BFBFBF" w:sz="4"/>
+              <w:bottom w:val="single" w:color="BFBFBF" w:sz="4"/>
+              <w:right w:val="single" w:color="BFBFBF" w:sz="4"/>
+            </w:tcBorders>
+            <w:tcMar>
+              <w:top w:type="dxa" w:w="60"/>
+              <w:left w:type="dxa" w:w="100"/>
+              <w:bottom w:type="dxa" w:w="60"/>
+              <w:right w:type="dxa" w:w="100"/>
+            </w:tcMar>
+            <w:vAlign w:val="top"/>
+          </w:tcPr>
+          <w:p>
+            <w:pPr>
+              <w:spacing w:after="40"/>
+            </w:pPr>
+            <w:r>
+              <w:rPr>
+                <w:rFonts w:ascii="Calibri" w:cs="Calibri" w:eastAsia="Calibri" w:hAnsi="Calibri"/>
+                <w:b w:val="false"/>
+                <w:bCs w:val="false"/>
+                <w:color w:val="1F1F1F"/>
+                <w:sz w:val="18"/>
+                <w:szCs w:val="18"/>
+              </w:rPr>
+              <w:t xml:space="preserve">mean fold AUC: KNN 0.672, LR 0.651, tree 0.578, persistence 0.569 (pooled favours the tree: 0.652)</w:t>
+            </w:r>
+          </w:p>
+        </w:tc>
+      </w:tr>
+      <w:tr>
+        <w:tc>
+          <w:tcPr>
+            <w:tcW w:type="dxa" w:w="2800"/>
+            <w:tcBorders>
+              <w:top w:val="single" w:color="BFBFBF" w:sz="4"/>
+              <w:left w:val="single" w:color="BFBFBF" w:sz="4"/>
+              <w:bottom w:val="single" w:color="BFBFBF" w:sz="4"/>
+              <w:right w:val="single" w:color="BFBFBF" w:sz="4"/>
+            </w:tcBorders>
+            <w:tcMar>
+              <w:top w:type="dxa" w:w="60"/>
+              <w:left w:type="dxa" w:w="100"/>
+              <w:bottom w:type="dxa" w:w="60"/>
+              <w:right w:type="dxa" w:w="100"/>
+            </w:tcMar>
+            <w:vAlign w:val="top"/>
+          </w:tcPr>
+          <w:p>
+            <w:pPr>
+              <w:spacing w:after="40"/>
+            </w:pPr>
+            <w:r>
+              <w:rPr>
+                <w:rFonts w:ascii="Calibri" w:cs="Calibri" w:eastAsia="Calibri" w:hAnsi="Calibri"/>
+                <w:b/>
+                <w:bCs/>
+                <w:color w:val="1F1F1F"/>
+                <w:sz w:val="18"/>
+                <w:szCs w:val="18"/>
+              </w:rPr>
+              <w:t xml:space="preserve">Top drivers</w:t>
+            </w:r>
+          </w:p>
+        </w:tc>
+        <w:tc>
+          <w:tcPr>
+            <w:tcW w:type="dxa" w:w="6226"/>
+            <w:tcBorders>
+              <w:top w:val="single" w:color="BFBFBF" w:sz="4"/>
+              <w:left w:val="single" w:color="BFBFBF" w:sz="4"/>
+              <w:bottom w:val="single" w:color="BFBFBF" w:sz="4"/>
+              <w:right w:val="single" w:color="BFBFBF" w:sz="4"/>
+            </w:tcBorders>
+            <w:tcMar>
+              <w:top w:type="dxa" w:w="60"/>
+              <w:left w:type="dxa" w:w="100"/>
+              <w:bottom w:type="dxa" w:w="60"/>
+              <w:right w:type="dxa" w:w="100"/>
+            </w:tcMar>
+            <w:vAlign w:val="top"/>
+          </w:tcPr>
+          <w:p>
+            <w:pPr>
+              <w:spacing w:after="40"/>
+            </w:pPr>
+            <w:r>
+              <w:rPr>
+                <w:rFonts w:ascii="Calibri" w:cs="Calibri" w:eastAsia="Calibri" w:hAnsi="Calibri"/>
+                <w:b w:val="false"/>
+                <w:bCs w:val="false"/>
+                <w:color w:val="1F1F1F"/>
+                <w:sz w:val="18"/>
+                <w:szCs w:val="18"/>
+              </w:rPr>
               <w:t xml:space="preserve">rupee 8-week change (LR weight 1.00, Gini 0.45, OR 1.11 per 1%); fiscal-year start OR 5.3 (5 fiscal years, 14 of 25 rows shocked; CI 1.4–19.5)</w:t>
+            </w:r>
+          </w:p>
+        </w:tc>
+      </w:tr>
+      <w:tr>
+        <w:tc>
+          <w:tcPr>
+            <w:tcW w:type="dxa" w:w="2800"/>
+            <w:tcBorders>
+              <w:top w:val="single" w:color="BFBFBF" w:sz="4"/>
+              <w:left w:val="single" w:color="BFBFBF" w:sz="4"/>
+              <w:bottom w:val="single" w:color="BFBFBF" w:sz="4"/>
+              <w:right w:val="single" w:color="BFBFBF" w:sz="4"/>
+            </w:tcBorders>
+            <w:tcMar>
+              <w:top w:type="dxa" w:w="60"/>
+              <w:left w:type="dxa" w:w="100"/>
+              <w:bottom w:type="dxa" w:w="60"/>
+              <w:right w:type="dxa" w:w="100"/>
+            </w:tcMar>
+            <w:vAlign w:val="top"/>
+          </w:tcPr>
+          <w:p>
+            <w:pPr>
+              <w:spacing w:after="40"/>
+            </w:pPr>
+            <w:r>
+              <w:rPr>
+                <w:rFonts w:ascii="Calibri" w:cs="Calibri" w:eastAsia="Calibri" w:hAnsi="Calibri"/>
+                <w:b/>
+                <w:bCs/>
+                <w:color w:val="1F1F1F"/>
+                <w:sz w:val="18"/>
+                <w:szCs w:val="18"/>
+              </w:rPr>
+              <w:t xml:space="preserve">Top 5 drivers (permutation ΔAUC)</w:t>
+            </w:r>
+          </w:p>
+        </w:tc>
+        <w:tc>
+          <w:tcPr>
+            <w:tcW w:type="dxa" w:w="6226"/>
+            <w:tcBorders>
+              <w:top w:val="single" w:color="BFBFBF" w:sz="4"/>
+              <w:left w:val="single" w:color="BFBFBF" w:sz="4"/>
+              <w:bottom w:val="single" w:color="BFBFBF" w:sz="4"/>
+              <w:right w:val="single" w:color="BFBFBF" w:sz="4"/>
+            </w:tcBorders>
+            <w:tcMar>
+              <w:top w:type="dxa" w:w="60"/>
+              <w:left w:type="dxa" w:w="100"/>
+              <w:bottom w:type="dxa" w:w="60"/>
+              <w:right w:type="dxa" w:w="100"/>
+            </w:tcMar>
+            <w:vAlign w:val="top"/>
+          </w:tcPr>
+          <w:p>
+            <w:pPr>
+              <w:spacing w:after="40"/>
+            </w:pPr>
+            <w:r>
+              <w:rPr>
+                <w:rFonts w:ascii="Calibri" w:cs="Calibri" w:eastAsia="Calibri" w:hAnsi="Calibri"/>
+                <w:b w:val="false"/>
+                <w:bCs w:val="false"/>
+                <w:color w:val="1F1F1F"/>
+                <w:sz w:val="18"/>
+                <w:szCs w:val="18"/>
+              </w:rPr>
+              <w:t xml:space="preserve">perishables inflation 0.023; recent shocks 0.021; 4-week SPI change 0.020; rupee 8-week change 0.018; motor-fuel inflation 0.011</w:t>
             </w:r>
           </w:p>
         </w:tc>
@@ -33823,7 +34149,7 @@
                 <w:sz w:val="18"/>
                 <w:szCs w:val="18"/>
               </w:rPr>
-              <w:t xml:space="preserve">Why k = 100 for KNN?</w:t>
+              <w:t xml:space="preserve">C = 0.0001 is the smallest value in your grid. Would a stronger penalty do better?</w:t>
             </w:r>
           </w:p>
         </w:tc>
@@ -33857,7 +34183,7 @@
                 <w:sz w:val="18"/>
                 <w:szCs w:val="18"/>
               </w:rPr>
-              <w:t xml:space="preserve">Small k overfits (k = 5: training AUC 0.98, validation 0.56). Around 100 neighbours the validation AUC peaks (0.64) and then declines as the forecast becomes too smooth.</w:t>
+              <w:t xml:space="preserve">No. We checked C = 0.00003 and 0.00001 on the same folds: both AUCs change by at most 0.001. A stronger penalty only shrinks the coefficients further without changing their direction, so the ranking cannot improve, and the probabilities get squeezed towards 0.5 (0.495–0.511 at C = 0.00001), too narrow for choosing a threshold. The optimum at the edge is a plateau.</w:t>
             </w:r>
           </w:p>
         </w:tc>
@@ -33896,7 +34222,7 @@
                 <w:sz w:val="18"/>
                 <w:szCs w:val="18"/>
               </w:rPr>
-              <w:t xml:space="preserve">Why does KNN need scaling and the tree not?</w:t>
+              <w:t xml:space="preserve">Why k = 100 for KNN?</w:t>
             </w:r>
           </w:p>
         </w:tc>
@@ -33930,7 +34256,7 @@
                 <w:sz w:val="18"/>
                 <w:szCs w:val="18"/>
               </w:rPr>
-              <w:t xml:space="preserve">KNN uses distances, so a feature measured in large units would dominate. A tree only asks 'is x above a cut-off?', which no rescaling changes.</w:t>
+              <w:t xml:space="preserve">Small k overfits (k = 5: training AUC 0.98, validation 0.56). Around 100 neighbours the validation AUC peaks (0.64) and then declines as the forecast becomes too smooth.</w:t>
             </w:r>
           </w:p>
         </w:tc>
@@ -33969,7 +34295,7 @@
                 <w:sz w:val="18"/>
                 <w:szCs w:val="18"/>
               </w:rPr>
-              <w:t xml:space="preserve">What does a confusion matrix show for KNN?</w:t>
+              <w:t xml:space="preserve">Why does KNN need scaling and the tree not?</w:t>
             </w:r>
           </w:p>
         </w:tc>
@@ -34003,7 +34329,7 @@
                 <w:sz w:val="18"/>
                 <w:szCs w:val="18"/>
               </w:rPr>
-              <w:t xml:space="preserve">Test: 20 shocks caught (TP), 15 missed (FN), 133 false alarms (FP), 287 calm weeks correctly left alone (TN).</w:t>
+              <w:t xml:space="preserve">KNN uses distances, so a feature measured in large units would dominate. A tree only asks 'is x above a cut-off?', which no rescaling changes.</w:t>
             </w:r>
           </w:p>
         </w:tc>
@@ -34042,7 +34368,7 @@
                 <w:sz w:val="18"/>
                 <w:szCs w:val="18"/>
               </w:rPr>
-              <w:t xml:space="preserve">Precision is only 0.13. Is the model useless?</w:t>
+              <w:t xml:space="preserve">Is KNN your best model?</w:t>
             </w:r>
           </w:p>
         </w:tc>
@@ -34076,7 +34402,7 @@
                 <w:sz w:val="18"/>
                 <w:szCs w:val="18"/>
               </w:rPr>
-              <w:t xml:space="preserve">Precision depends on how common shocks are. In 2025–26 only 7.7% of rows were shocks, so most alarms are false even with decent ranking (AUC 0.68). In 2021–24 precision was 0.26–0.38.</w:t>
+              <w:t xml:space="preserve">It had the highest test AUC (0.68), but we do not call it the best. Compared on the same resampled test weeks it beat logistic regression (+0.11, 95% CI +0.02 to +0.22) but not clearly the tree (+0.14, −0.04 to +0.29), and the test has only 13 shock weeks. Overlapping single-model intervals alone would not settle it; the paired difference is the right comparison.</w:t>
             </w:r>
           </w:p>
         </w:tc>
@@ -34115,7 +34441,7 @@
                 <w:sz w:val="18"/>
                 <w:szCs w:val="18"/>
               </w:rPr>
-              <w:t xml:space="preserve">Why is a false negative worse than a false positive here?</w:t>
+              <w:t xml:space="preserve">What does a confusion matrix show for KNN?</w:t>
             </w:r>
           </w:p>
         </w:tc>
@@ -34149,7 +34475,7 @@
                 <w:sz w:val="18"/>
                 <w:szCs w:val="18"/>
               </w:rPr>
-              <w:t xml:space="preserve">A miss leaves poor households to absorb a price step that is not given back (8 weeks later Q1 prices are 4.2% above the pre-shock week, against 1.9% around an ordinary week), with irreversible coping; a false alarm is a top-up that still reaches poor families. We weight a miss as 5 false alarms and test 1–20.</w:t>
+              <w:t xml:space="preserve">Test: 20 shocks caught (TP), 15 missed (FN), 133 false alarms (FP), 287 calm weeks correctly left alone (TN).</w:t>
             </w:r>
           </w:p>
         </w:tc>
@@ -34188,7 +34514,7 @@
                 <w:sz w:val="18"/>
                 <w:szCs w:val="18"/>
               </w:rPr>
-              <w:t xml:space="preserve">How did you choose the threshold?</w:t>
+              <w:t xml:space="preserve">Precision is only 0.13. Is the model useless?</w:t>
             </w:r>
           </w:p>
         </w:tc>
@@ -34222,7 +34548,7 @@
                 <w:sz w:val="18"/>
                 <w:szCs w:val="18"/>
               </w:rPr>
-              <w:t xml:space="preserve">The value that minimises 1 × FP + 5 × FN on the 2021–24 out-of-fold predictions; then applied unchanged to the test.</w:t>
+              <w:t xml:space="preserve">Precision depends on how common shocks are. In 2025–26 only 7.7% of rows were shocks, so most alarms are false even with decent ranking (AUC 0.68). In 2021–24 precision was 0.26–0.38.</w:t>
             </w:r>
           </w:p>
         </w:tc>
@@ -34261,7 +34587,7 @@
                 <w:sz w:val="18"/>
                 <w:szCs w:val="18"/>
               </w:rPr>
-              <w:t xml:space="preserve">Why did no model beat 'never alert' in the test?</w:t>
+              <w:t xml:space="preserve">Why is a false negative worse than a false positive here?</w:t>
             </w:r>
           </w:p>
         </w:tc>
@@ -34295,7 +34621,7 @@
                 <w:sz w:val="18"/>
                 <w:szCs w:val="18"/>
               </w:rPr>
-              <w:t xml:space="preserve">The shock rate halved. Thresholds learned when shocks were common over-alert when they are rare. The ranking still works (KNN AUC 0.68), so recalibration/retraining (M4–M5) is the fix. (At 5:1. At 20:1 the models do beat never-alert, but only by alerting almost every week, i.e. by matching the always-alert policy.)</w:t>
+              <w:t xml:space="preserve">A miss leaves poor households to absorb a price step that is not given back (8 weeks later Q1 prices are 4.2% above the pre-shock week, against 1.9% around an ordinary week), with irreversible coping; a false alarm is a top-up that still reaches poor families. We weight a miss as 5 false alarms and test 1–20.</w:t>
             </w:r>
           </w:p>
         </w:tc>
@@ -34334,7 +34660,7 @@
                 <w:sz w:val="18"/>
                 <w:szCs w:val="18"/>
               </w:rPr>
-              <w:t xml:space="preserve">Which features matter most?</w:t>
+              <w:t xml:space="preserve">How did you choose the threshold?</w:t>
             </w:r>
           </w:p>
         </w:tc>
@@ -34368,7 +34694,7 @@
                 <w:sz w:val="18"/>
                 <w:szCs w:val="18"/>
               </w:rPr>
-              <w:t xml:space="preserve">The 8-week rupee depreciation (largest LR weight, the tree's first split, odds ratio 1.11 per 1%), recent shocks and food-price momentum. The fiscal-year start multiplies the odds by about 5 but is rare, and that estimate rests on only five fiscal years (CI 1.4–19.5).</w:t>
+              <w:t xml:space="preserve">The value that minimises 1 × FP + 5 × FN on the 2021–24 out-of-fold predictions; then applied unchanged to the test.</w:t>
             </w:r>
           </w:p>
         </w:tc>
@@ -34407,7 +34733,7 @@
                 <w:sz w:val="18"/>
                 <w:szCs w:val="18"/>
               </w:rPr>
-              <w:t xml:space="preserve">Is 'front-load support before 1 July' still justified?</w:t>
+              <w:t xml:space="preserve">Why did no model beat 'never alert' in the test?</w:t>
             </w:r>
           </w:p>
         </w:tc>
@@ -34441,7 +34767,7 @@
                 <w:sz w:val="18"/>
                 <w:szCs w:val="18"/>
               </w:rPr>
-              <w:t xml:space="preserve">Yes for the timing, not for the one-week flag. In 2019–24, 14 of the 25 rows flagged as fiscal-year starts were followed by a shock (56% vs 17%). In 2025–26, 4 of the 13 shock weeks fell in July, but three came after its first week. M4 will try a first-month-of-the-fiscal-year window.</w:t>
+              <w:t xml:space="preserve">The shock rate halved. Thresholds learned when shocks were common over-alert when they are rare. The ranking still works (KNN AUC 0.68), so recalibration/retraining (M4–M5) is the fix. (At 5:1. At 20:1 the models do beat never-alert, but only by alerting almost every week, i.e. by matching the always-alert policy.)</w:t>
             </w:r>
           </w:p>
         </w:tc>
@@ -34480,7 +34806,7 @@
                 <w:sz w:val="18"/>
                 <w:szCs w:val="18"/>
               </w:rPr>
-              <w:t xml:space="preserve">What is permutation importance?</w:t>
+              <w:t xml:space="preserve">Which features matter most?</w:t>
             </w:r>
           </w:p>
         </w:tc>
@@ -34514,7 +34840,7 @@
                 <w:sz w:val="18"/>
                 <w:szCs w:val="18"/>
               </w:rPr>
-              <w:t xml:space="preserve">Shuffle one feature in the validation data and measure how much the AUC falls. Works for any model, including KNN.</w:t>
+              <w:t xml:space="preserve">The 8-week rupee depreciation (largest LR weight, the tree's first split, odds ratio 1.11 per 1%), recent shocks and food-price momentum. The fiscal-year start multiplies the odds by about 5 but is rare, and that estimate rests on only five fiscal years (CI 1.4–19.5).</w:t>
             </w:r>
           </w:p>
         </w:tc>
@@ -34553,7 +34879,7 @@
                 <w:sz w:val="18"/>
                 <w:szCs w:val="18"/>
               </w:rPr>
-              <w:t xml:space="preserve">What is an odds ratio?</w:t>
+              <w:t xml:space="preserve">Is 'front-load support before 1 July' still justified?</w:t>
             </w:r>
           </w:p>
         </w:tc>
@@ -34587,7 +34913,7 @@
                 <w:sz w:val="18"/>
                 <w:szCs w:val="18"/>
               </w:rPr>
-              <w:t xml:space="preserve">exp(coefficient): how many times the odds of a shock multiply for a one-unit rise. 1.11 for the rupee means +11% odds per 1% depreciation.</w:t>
+              <w:t xml:space="preserve">Yes for the timing, not for the one-week flag. In 2019–24, 14 of the 25 rows flagged as fiscal-year starts were followed by a shock (56% vs 17%). In 2025–26, 4 of the 13 shock weeks fell in July, but three came after its first week. M4 will try a first-month-of-the-fiscal-year window.</w:t>
             </w:r>
           </w:p>
         </w:tc>
@@ -34626,7 +34952,7 @@
                 <w:sz w:val="18"/>
                 <w:szCs w:val="18"/>
               </w:rPr>
-              <w:t xml:space="preserve">Was H1 supported?</w:t>
+              <w:t xml:space="preserve">What is permutation importance?</w:t>
             </w:r>
           </w:p>
         </w:tc>
@@ -34660,7 +34986,7 @@
                 <w:sz w:val="18"/>
                 <w:szCs w:val="18"/>
               </w:rPr>
-              <w:t xml:space="preserve">In sample yes (clustered Wald p = 0.001). Out of sample in 2025–26 no (week-block bootstrap p = 0.45). The early warning works in turbulent periods but not in a calm one.</w:t>
+              <w:t xml:space="preserve">Shuffle one feature in the validation data and measure how much the AUC falls. Works for any model, including KNN.</w:t>
             </w:r>
           </w:p>
         </w:tc>
@@ -34699,7 +35025,7 @@
                 <w:sz w:val="18"/>
                 <w:szCs w:val="18"/>
               </w:rPr>
-              <w:t xml:space="preserve">M2 promised a DeLong test for H1. Why did you use a bootstrap?</w:t>
+              <w:t xml:space="preserve">What is an odds ratio?</w:t>
             </w:r>
           </w:p>
         </w:tc>
@@ -34733,7 +35059,7 @@
                 <w:sz w:val="18"/>
                 <w:szCs w:val="18"/>
               </w:rPr>
-              <w:t xml:space="preserve">DeLong treats the 455 test rows as independent, but the five quintile rows of a week share the same signals and move together. Resampling whole weeks with replacement (bootstrap and cluster sampling, Unit 04) keeps them together, gives a 95% interval (−0.08 to +0.10) and a p-value (0.45), and is easy to check by hand.</w:t>
+              <w:t xml:space="preserve">exp(coefficient): how many times the odds of a shock multiply for a one-unit rise. 1.11 for the rupee means +11% odds per 1% depreciation.</w:t>
             </w:r>
           </w:p>
         </w:tc>
@@ -34772,7 +35098,7 @@
                 <w:sz w:val="18"/>
                 <w:szCs w:val="18"/>
               </w:rPr>
-              <w:t xml:space="preserve">Which methods did you use that were not in the lecture slides, and why?</w:t>
+              <w:t xml:space="preserve">Was H1 supported?</w:t>
             </w:r>
           </w:p>
         </w:tc>
@@ -34806,7 +35132,7 @@
                 <w:sz w:val="18"/>
                 <w:szCs w:val="18"/>
               </w:rPr>
-              <w:t xml:space="preserve">Three, each because the course method alone would give a wrong or incomplete answer: expanding-window CV (shuffled K-fold leaks the future, inflating AUC by 0.05–0.14), permutation importance (KNN has no coefficients or Gini importance) and standard errors clustered by week (the five quintile rows of a week are not independent). The LR test, HAC errors and the Brier score were already in our M2 plan.</w:t>
+              <w:t xml:space="preserve">In sample yes (clustered Wald p = 0.001). Out of sample in 2025–26 no (week-block bootstrap p = 0.45). The early warning works in turbulent periods but not in a calm one.</w:t>
             </w:r>
           </w:p>
         </w:tc>
@@ -34845,7 +35171,7 @@
                 <w:sz w:val="18"/>
                 <w:szCs w:val="18"/>
               </w:rPr>
-              <w:t xml:space="preserve">Why cluster standard errors by week?</w:t>
+              <w:t xml:space="preserve">M2 promised a DeLong test for H1. Why did you use a bootstrap?</w:t>
             </w:r>
           </w:p>
         </w:tc>
@@ -34879,7 +35205,7 @@
                 <w:sz w:val="18"/>
                 <w:szCs w:val="18"/>
               </w:rPr>
-              <w:t xml:space="preserve">The five quintile rows of a week share the same signals, so they are not independent; the plain LR test (χ² = 94) overstates the evidence about four-fold.</w:t>
+              <w:t xml:space="preserve">DeLong treats the 455 test rows as independent, but the five quintile rows of a week share the same signals and move together. Resampling whole weeks with replacement (bootstrap and cluster sampling, Unit 04) keeps them together, gives a 95% interval (−0.08 to +0.10) and a p-value (0.45), and is easy to check by hand.</w:t>
             </w:r>
           </w:p>
         </w:tc>
@@ -34918,7 +35244,7 @@
                 <w:sz w:val="18"/>
                 <w:szCs w:val="18"/>
               </w:rPr>
-              <w:t xml:space="preserve">What did H2 and H3 find?</w:t>
+              <w:t xml:space="preserve">Which methods did you use that were not in the lecture slides, and why?</w:t>
             </w:r>
           </w:p>
         </w:tc>
@@ -34952,7 +35278,299 @@
                 <w:sz w:val="18"/>
                 <w:szCs w:val="18"/>
               </w:rPr>
+              <w:t xml:space="preserve">Three, each because the course method alone would give a wrong or incomplete answer: expanding-window CV (shuffled K-fold leaks the future, inflating AUC by 0.05–0.14), permutation importance (KNN has no coefficients or Gini importance) and standard errors clustered by week (the five quintile rows of a week are not independent). The LR test, HAC errors and the Brier score were already in our M2 plan.</w:t>
+            </w:r>
+          </w:p>
+        </w:tc>
+      </w:tr>
+      <w:tr>
+        <w:trPr>
+          <w:cantSplit/>
+        </w:trPr>
+        <w:tc>
+          <w:tcPr>
+            <w:tcW w:type="dxa" w:w="3000"/>
+            <w:tcBorders>
+              <w:top w:val="single" w:color="BFBFBF" w:sz="4"/>
+              <w:left w:val="single" w:color="BFBFBF" w:sz="4"/>
+              <w:bottom w:val="single" w:color="BFBFBF" w:sz="4"/>
+              <w:right w:val="single" w:color="BFBFBF" w:sz="4"/>
+            </w:tcBorders>
+            <w:tcMar>
+              <w:top w:type="dxa" w:w="60"/>
+              <w:left w:type="dxa" w:w="100"/>
+              <w:bottom w:type="dxa" w:w="60"/>
+              <w:right w:type="dxa" w:w="100"/>
+            </w:tcMar>
+            <w:vAlign w:val="top"/>
+          </w:tcPr>
+          <w:p>
+            <w:pPr>
+              <w:spacing w:after="40"/>
+            </w:pPr>
+            <w:r>
+              <w:rPr>
+                <w:rFonts w:ascii="Calibri" w:cs="Calibri" w:eastAsia="Calibri" w:hAnsi="Calibri"/>
+                <w:b/>
+                <w:bCs/>
+                <w:color w:val="1F1F1F"/>
+                <w:sz w:val="18"/>
+                <w:szCs w:val="18"/>
+              </w:rPr>
+              <w:t xml:space="preserve">Why cluster standard errors by week?</w:t>
+            </w:r>
+          </w:p>
+        </w:tc>
+        <w:tc>
+          <w:tcPr>
+            <w:tcW w:type="dxa" w:w="6026"/>
+            <w:tcBorders>
+              <w:top w:val="single" w:color="BFBFBF" w:sz="4"/>
+              <w:left w:val="single" w:color="BFBFBF" w:sz="4"/>
+              <w:bottom w:val="single" w:color="BFBFBF" w:sz="4"/>
+              <w:right w:val="single" w:color="BFBFBF" w:sz="4"/>
+            </w:tcBorders>
+            <w:tcMar>
+              <w:top w:type="dxa" w:w="60"/>
+              <w:left w:type="dxa" w:w="100"/>
+              <w:bottom w:type="dxa" w:w="60"/>
+              <w:right w:type="dxa" w:w="100"/>
+            </w:tcMar>
+            <w:vAlign w:val="top"/>
+          </w:tcPr>
+          <w:p>
+            <w:pPr>
+              <w:spacing w:after="40"/>
+            </w:pPr>
+            <w:r>
+              <w:rPr>
+                <w:rFonts w:ascii="Calibri" w:cs="Calibri" w:eastAsia="Calibri" w:hAnsi="Calibri"/>
+                <w:b w:val="false"/>
+                <w:bCs w:val="false"/>
+                <w:color w:val="1F1F1F"/>
+                <w:sz w:val="18"/>
+                <w:szCs w:val="18"/>
+              </w:rPr>
+              <w:t xml:space="preserve">The five quintile rows of a week share the same signals, so they are not independent; the plain LR test (χ² = 94) overstates the evidence about four-fold.</w:t>
+            </w:r>
+          </w:p>
+        </w:tc>
+      </w:tr>
+      <w:tr>
+        <w:trPr>
+          <w:cantSplit/>
+        </w:trPr>
+        <w:tc>
+          <w:tcPr>
+            <w:tcW w:type="dxa" w:w="3000"/>
+            <w:tcBorders>
+              <w:top w:val="single" w:color="BFBFBF" w:sz="4"/>
+              <w:left w:val="single" w:color="BFBFBF" w:sz="4"/>
+              <w:bottom w:val="single" w:color="BFBFBF" w:sz="4"/>
+              <w:right w:val="single" w:color="BFBFBF" w:sz="4"/>
+            </w:tcBorders>
+            <w:tcMar>
+              <w:top w:type="dxa" w:w="60"/>
+              <w:left w:type="dxa" w:w="100"/>
+              <w:bottom w:type="dxa" w:w="60"/>
+              <w:right w:type="dxa" w:w="100"/>
+            </w:tcMar>
+            <w:vAlign w:val="top"/>
+          </w:tcPr>
+          <w:p>
+            <w:pPr>
+              <w:spacing w:after="40"/>
+            </w:pPr>
+            <w:r>
+              <w:rPr>
+                <w:rFonts w:ascii="Calibri" w:cs="Calibri" w:eastAsia="Calibri" w:hAnsi="Calibri"/>
+                <w:b/>
+                <w:bCs/>
+                <w:color w:val="1F1F1F"/>
+                <w:sz w:val="18"/>
+                <w:szCs w:val="18"/>
+              </w:rPr>
+              <w:t xml:space="preserve">What did H2 and H3 find?</w:t>
+            </w:r>
+          </w:p>
+        </w:tc>
+        <w:tc>
+          <w:tcPr>
+            <w:tcW w:type="dxa" w:w="6026"/>
+            <w:tcBorders>
+              <w:top w:val="single" w:color="BFBFBF" w:sz="4"/>
+              <w:left w:val="single" w:color="BFBFBF" w:sz="4"/>
+              <w:bottom w:val="single" w:color="BFBFBF" w:sz="4"/>
+              <w:right w:val="single" w:color="BFBFBF" w:sz="4"/>
+            </w:tcBorders>
+            <w:tcMar>
+              <w:top w:type="dxa" w:w="60"/>
+              <w:left w:type="dxa" w:w="100"/>
+              <w:bottom w:type="dxa" w:w="60"/>
+              <w:right w:type="dxa" w:w="100"/>
+            </w:tcMar>
+            <w:vAlign w:val="top"/>
+          </w:tcPr>
+          <w:p>
+            <w:pPr>
+              <w:spacing w:after="40"/>
+            </w:pPr>
+            <w:r>
+              <w:rPr>
+                <w:rFonts w:ascii="Calibri" w:cs="Calibri" w:eastAsia="Calibri" w:hAnsi="Calibri"/>
+                <w:b w:val="false"/>
+                <w:bCs w:val="false"/>
+                <w:color w:val="1F1F1F"/>
+                <w:sz w:val="18"/>
+                <w:szCs w:val="18"/>
+              </w:rPr>
               <w:t xml:space="preserve">H2: pass-through is about the same for Q1 and Q5 (p = 0.27). H3: food widens the gap against the poor (p = 0.003); energy as a whole does not narrow it. The exploratory split shows why: motor fuel and LPG hit the rich harder, while utility tariffs lean towards the poor (not significant, p = 0.10).</w:t>
+            </w:r>
+          </w:p>
+        </w:tc>
+      </w:tr>
+      <w:tr>
+        <w:trPr>
+          <w:cantSplit/>
+        </w:trPr>
+        <w:tc>
+          <w:tcPr>
+            <w:tcW w:type="dxa" w:w="3000"/>
+            <w:tcBorders>
+              <w:top w:val="single" w:color="BFBFBF" w:sz="4"/>
+              <w:left w:val="single" w:color="BFBFBF" w:sz="4"/>
+              <w:bottom w:val="single" w:color="BFBFBF" w:sz="4"/>
+              <w:right w:val="single" w:color="BFBFBF" w:sz="4"/>
+            </w:tcBorders>
+            <w:tcMar>
+              <w:top w:type="dxa" w:w="60"/>
+              <w:left w:type="dxa" w:w="100"/>
+              <w:bottom w:type="dxa" w:w="60"/>
+              <w:right w:type="dxa" w:w="100"/>
+            </w:tcMar>
+            <w:vAlign w:val="top"/>
+          </w:tcPr>
+          <w:p>
+            <w:pPr>
+              <w:spacing w:after="40"/>
+            </w:pPr>
+            <w:r>
+              <w:rPr>
+                <w:rFonts w:ascii="Calibri" w:cs="Calibri" w:eastAsia="Calibri" w:hAnsi="Calibri"/>
+                <w:b/>
+                <w:bCs/>
+                <w:color w:val="1F1F1F"/>
+                <w:sz w:val="18"/>
+                <w:szCs w:val="18"/>
+              </w:rPr>
+              <w:t xml:space="preserve">Isn't the H3 result built in by construction?</w:t>
+            </w:r>
+          </w:p>
+        </w:tc>
+        <w:tc>
+          <w:tcPr>
+            <w:tcW w:type="dxa" w:w="6026"/>
+            <w:tcBorders>
+              <w:top w:val="single" w:color="BFBFBF" w:sz="4"/>
+              <w:left w:val="single" w:color="BFBFBF" w:sz="4"/>
+              <w:bottom w:val="single" w:color="BFBFBF" w:sz="4"/>
+              <w:right w:val="single" w:color="BFBFBF" w:sz="4"/>
+            </w:tcBorders>
+            <w:tcMar>
+              <w:top w:type="dxa" w:w="60"/>
+              <w:left w:type="dxa" w:w="100"/>
+              <w:bottom w:type="dxa" w:w="60"/>
+              <w:right w:type="dxa" w:w="100"/>
+            </w:tcMar>
+            <w:vAlign w:val="top"/>
+          </w:tcPr>
+          <w:p>
+            <w:pPr>
+              <w:spacing w:after="40"/>
+            </w:pPr>
+            <w:r>
+              <w:rPr>
+                <w:rFonts w:ascii="Calibri" w:cs="Calibri" w:eastAsia="Calibri" w:hAnsi="Calibri"/>
+                <w:b w:val="false"/>
+                <w:bCs w:val="false"/>
+                <w:color w:val="1F1F1F"/>
+                <w:sz w:val="18"/>
+                <w:szCs w:val="18"/>
+              </w:rPr>
+              <w:t xml:space="preserve">Partly, yes. The Q1 − Q5 gap is made from the same item price changes weighted by each basket, and food weighs more in Q1's (about 57% vs 43%), so a food price rise widens the gap partly by construction. We therefore read the H3 coefficients as descriptive (how the gap moves with each component), not causal.</w:t>
+            </w:r>
+          </w:p>
+        </w:tc>
+      </w:tr>
+      <w:tr>
+        <w:trPr>
+          <w:cantSplit/>
+        </w:trPr>
+        <w:tc>
+          <w:tcPr>
+            <w:tcW w:type="dxa" w:w="3000"/>
+            <w:tcBorders>
+              <w:top w:val="single" w:color="BFBFBF" w:sz="4"/>
+              <w:left w:val="single" w:color="BFBFBF" w:sz="4"/>
+              <w:bottom w:val="single" w:color="BFBFBF" w:sz="4"/>
+              <w:right w:val="single" w:color="BFBFBF" w:sz="4"/>
+            </w:tcBorders>
+            <w:tcMar>
+              <w:top w:type="dxa" w:w="60"/>
+              <w:left w:type="dxa" w:w="100"/>
+              <w:bottom w:type="dxa" w:w="60"/>
+              <w:right w:type="dxa" w:w="100"/>
+            </w:tcMar>
+            <w:vAlign w:val="top"/>
+          </w:tcPr>
+          <w:p>
+            <w:pPr>
+              <w:spacing w:after="40"/>
+            </w:pPr>
+            <w:r>
+              <w:rPr>
+                <w:rFonts w:ascii="Calibri" w:cs="Calibri" w:eastAsia="Calibri" w:hAnsi="Calibri"/>
+                <w:b/>
+                <w:bCs/>
+                <w:color w:val="1F1F1F"/>
+                <w:sz w:val="18"/>
+                <w:szCs w:val="18"/>
+              </w:rPr>
+              <w:t xml:space="preserve">Which five drivers lead, and what do they mean for policy?</w:t>
+            </w:r>
+          </w:p>
+        </w:tc>
+        <w:tc>
+          <w:tcPr>
+            <w:tcW w:type="dxa" w:w="6026"/>
+            <w:tcBorders>
+              <w:top w:val="single" w:color="BFBFBF" w:sz="4"/>
+              <w:left w:val="single" w:color="BFBFBF" w:sz="4"/>
+              <w:bottom w:val="single" w:color="BFBFBF" w:sz="4"/>
+              <w:right w:val="single" w:color="BFBFBF" w:sz="4"/>
+            </w:tcBorders>
+            <w:tcMar>
+              <w:top w:type="dxa" w:w="60"/>
+              <w:left w:type="dxa" w:w="100"/>
+              <w:bottom w:type="dxa" w:w="60"/>
+              <w:right w:type="dxa" w:w="100"/>
+            </w:tcMar>
+            <w:vAlign w:val="top"/>
+          </w:tcPr>
+          <w:p>
+            <w:pPr>
+              <w:spacing w:after="40"/>
+            </w:pPr>
+            <w:r>
+              <w:rPr>
+                <w:rFonts w:ascii="Calibri" w:cs="Calibri" w:eastAsia="Calibri" w:hAnsi="Calibri"/>
+                <w:b w:val="false"/>
+                <w:bCs w:val="false"/>
+                <w:color w:val="1F1F1F"/>
+                <w:sz w:val="18"/>
+                <w:szCs w:val="18"/>
+              </w:rPr>
+              <w:t xml:space="preserve">By permutation importance: perishables inflation (track perishable prices), recent shocks (keep top-ups on standby after a first shock), the 4-week SPI change (watch build-ups), the rupee's 8-week change (readiness review after a fall of several percent) and motor-fuel inflation (fuel reviews are on known dates). Importance shows what the models use, not cause and effect.</w:t>
             </w:r>
           </w:p>
         </w:tc>

</xml_diff>